<commit_message>
modified:   main/Multi-Asset Risk Dashboard & Portfolio.docx
</commit_message>
<xml_diff>
--- a/main/Multi-Asset Risk Dashboard & Portfolio.docx
+++ b/main/Multi-Asset Risk Dashboard & Portfolio.docx
@@ -1,11 +1,34 @@
 
 <file path=word/document.xml><?xml version="1.0" encoding="utf-8"?>
-<w:document xmlns:wpc="http://schemas.microsoft.com/office/word/2010/wordprocessingCanvas" xmlns:cx="http://schemas.microsoft.com/office/drawing/2014/chartex" xmlns:cx1="http://schemas.microsoft.com/office/drawing/2015/9/8/chartex" xmlns:cx2="http://schemas.microsoft.com/office/drawing/2015/10/21/chartex" xmlns:cx3="http://schemas.microsoft.com/office/drawing/2016/5/9/chartex" xmlns:cx4="http://schemas.microsoft.com/office/drawing/2016/5/10/chartex" xmlns:cx5="http://schemas.microsoft.com/office/drawing/2016/5/11/chartex" xmlns:cx6="http://schemas.microsoft.com/office/drawing/2016/5/12/chartex" xmlns:cx7="http://schemas.microsoft.com/office/drawing/2016/5/13/chartex" xmlns:cx8="http://schemas.microsoft.com/office/drawing/2016/5/14/chartex" xmlns:mc="http://schemas.openxmlformats.org/markup-compatibility/2006" xmlns:aink="http://schemas.microsoft.com/office/drawing/2016/ink" xmlns:am3d="http://schemas.microsoft.com/office/drawing/2017/model3d" xmlns:o="urn:schemas-microsoft-com:office:office" xmlns:oel="http://schemas.microsoft.com/office/2019/extlst" xmlns:r="http://schemas.openxmlformats.org/officeDocument/2006/relationships" xmlns:m="http://schemas.openxmlformats.org/officeDocument/2006/math" xmlns:v="urn:schemas-microsoft-com:vml" xmlns:wp14="http://schemas.microsoft.com/office/word/2010/wordprocessingDrawing" xmlns:wp="http://schemas.openxmlformats.org/drawingml/2006/wordprocessingDrawing" xmlns:w10="urn:schemas-microsoft-com:office:word" xmlns:w="http://schemas.openxmlformats.org/wordprocessingml/2006/main" xmlns:w14="http://schemas.microsoft.com/office/word/2010/wordml" xmlns:w15="http://schemas.microsoft.com/office/word/2012/wordml" xmlns:w16cei="http://schemas.microsoft.com/office/word/2026/wordml/cei" xmlns:w16cex="http://schemas.microsoft.com/office/word/2018/wordml/cex" xmlns:w16cid="http://schemas.microsoft.com/office/word/2016/wordml/cid" xmlns:w16="http://schemas.microsoft.com/office/word/2018/wordml" xmlns:w16du="http://schemas.microsoft.com/office/word/2023/wordml/word16du" xmlns:w16sdtdh="http://schemas.microsoft.com/office/word/2020/wordml/sdtdatahash" xmlns:w16sdtfl="http://schemas.microsoft.com/office/word/2024/wordml/sdtformatlock" xmlns:w16se="http://schemas.microsoft.com/office/word/2015/wordml/symex" xmlns:wpg="http://schemas.microsoft.com/office/word/2010/wordprocessingGroup" xmlns:wpi="http://schemas.microsoft.com/office/word/2010/wordprocessingInk" xmlns:wne="http://schemas.microsoft.com/office/word/2006/wordml" xmlns:wps="http://schemas.microsoft.com/office/word/2010/wordprocessingShape" mc:Ignorable="w14 w15 w16se w16cid w16 w16cex w16sdtdh w16sdtfl w16du wp14">
+<w:document xmlns:wpc="http://schemas.microsoft.com/office/word/2010/wordprocessingCanvas" xmlns:cx="http://schemas.microsoft.com/office/drawing/2014/chartex" xmlns:cx1="http://schemas.microsoft.com/office/drawing/2015/9/8/chartex" xmlns:cx2="http://schemas.microsoft.com/office/drawing/2015/10/21/chartex" xmlns:cx3="http://schemas.microsoft.com/office/drawing/2016/5/9/chartex" xmlns:cx4="http://schemas.microsoft.com/office/drawing/2016/5/10/chartex" xmlns:cx5="http://schemas.microsoft.com/office/drawing/2016/5/11/chartex" xmlns:cx6="http://schemas.microsoft.com/office/drawing/2016/5/12/chartex" xmlns:cx7="http://schemas.microsoft.com/office/drawing/2016/5/13/chartex" xmlns:cx8="http://schemas.microsoft.com/office/drawing/2016/5/14/chartex" xmlns:mc="http://schemas.openxmlformats.org/markup-compatibility/2006" xmlns:aink="http://schemas.microsoft.com/office/drawing/2016/ink" xmlns:am3d="http://schemas.microsoft.com/office/drawing/2017/model3d" xmlns:o="urn:schemas-microsoft-com:office:office" xmlns:oel="http://schemas.microsoft.com/office/2019/extlst" xmlns:r="http://schemas.openxmlformats.org/officeDocument/2006/relationships" xmlns:m="http://schemas.openxmlformats.org/officeDocument/2006/math" xmlns:v="urn:schemas-microsoft-com:vml" xmlns:wp14="http://schemas.microsoft.com/office/word/2010/wordprocessingDrawing" xmlns:wp="http://schemas.openxmlformats.org/drawingml/2006/wordprocessingDrawing" xmlns:w10="urn:schemas-microsoft-com:office:word" xmlns:w="http://schemas.openxmlformats.org/wordprocessingml/2006/main" xmlns:w14="http://schemas.microsoft.com/office/word/2010/wordml" xmlns:w15="http://schemas.microsoft.com/office/word/2012/wordml" xmlns:w16cex="http://schemas.microsoft.com/office/word/2018/wordml/cex" xmlns:w16cid="http://schemas.microsoft.com/office/word/2016/wordml/cid" xmlns:w16="http://schemas.microsoft.com/office/word/2018/wordml" xmlns:w16du="http://schemas.microsoft.com/office/word/2023/wordml/word16du" xmlns:w16sdtdh="http://schemas.microsoft.com/office/word/2020/wordml/sdtdatahash" xmlns:w16sdtfl="http://schemas.microsoft.com/office/word/2024/wordml/sdtformatlock" xmlns:w16se="http://schemas.microsoft.com/office/word/2015/wordml/symex" xmlns:wpg="http://schemas.microsoft.com/office/word/2010/wordprocessingGroup" xmlns:wpi="http://schemas.microsoft.com/office/word/2010/wordprocessingInk" xmlns:wne="http://schemas.microsoft.com/office/word/2006/wordml" xmlns:wps="http://schemas.microsoft.com/office/word/2010/wordprocessingShape" mc:Ignorable="w14 w15 w16se w16cid w16 w16cex w16sdtdh w16sdtfl w16du wp14">
   <w:body>
     <w:p>
       <w:r>
         <w:t>Multi-Asset Risk Dashboard and Portfolio:</w:t>
       </w:r>
+      <w:r>
+        <w:t xml:space="preserve"> (INTRO PAGE, TOCs, …)</w:t>
+      </w:r>
+    </w:p>
+    <w:p>
+      <w:r>
+        <w:br w:type="page"/>
+      </w:r>
+    </w:p>
+    <w:p>
+      <w:pPr>
+        <w:pStyle w:val="Heading1"/>
+        <w:rPr>
+          <w:rFonts w:ascii="Calibri" w:hAnsi="Calibri" w:cs="Calibri"/>
+        </w:rPr>
+      </w:pPr>
+      <w:r>
+        <w:rPr>
+          <w:rFonts w:ascii="Calibri" w:hAnsi="Calibri" w:cs="Calibri"/>
+        </w:rPr>
+        <w:lastRenderedPageBreak/>
+        <w:t>Introduction</w:t>
+      </w:r>
     </w:p>
     <w:p>
       <w:r>
@@ -36,7 +59,13 @@
         <w:t xml:space="preserve">since the beginning of the decade, a multitude of big tech companies have invested </w:t>
       </w:r>
       <w:r>
-        <w:t>billions in AI technology. While not all investments are a guaranteed success, some end up exceeding expectations.</w:t>
+        <w:t xml:space="preserve">billions in AI technology. While not all investments are </w:t>
+      </w:r>
+      <w:r>
+        <w:t>guaranteed</w:t>
+      </w:r>
+      <w:r>
+        <w:t xml:space="preserve"> success, some end up exceeding expectations.</w:t>
       </w:r>
     </w:p>
     <w:p>
@@ -53,7 +82,13 @@
         <w:t xml:space="preserve"> </w:t>
       </w:r>
       <w:r>
-        <w:t xml:space="preserve">Obviously, with AI being utilized in nearly every sector, data centres would be a necessity. Therefore, the data centre sector would see </w:t>
+        <w:t xml:space="preserve">Obviously, with AI being utilized in nearly every sector, data centres would be a necessity. Therefore, the data </w:t>
+      </w:r>
+      <w:r>
+        <w:t>center</w:t>
+      </w:r>
+      <w:r>
+        <w:t xml:space="preserve"> sector would see </w:t>
       </w:r>
       <w:r>
         <w:t xml:space="preserve">a boom as well. </w:t>
@@ -61,13 +96,19 @@
     </w:p>
     <w:p>
       <w:r>
-        <w:t>The final of the six sectors chosen was Defen</w:t>
-      </w:r>
-      <w:r>
-        <w:t>s</w:t>
-      </w:r>
-      <w:r>
-        <w:t xml:space="preserve">e. While it may seem odd given the </w:t>
+        <w:t xml:space="preserve">The final </w:t>
+      </w:r>
+      <w:r>
+        <w:t>sector</w:t>
+      </w:r>
+      <w:r>
+        <w:t xml:space="preserve"> chosen was </w:t>
+      </w:r>
+      <w:r>
+        <w:t>Defense</w:t>
+      </w:r>
+      <w:r>
+        <w:t xml:space="preserve">. While it may seem odd given the </w:t>
       </w:r>
       <w:r>
         <w:t xml:space="preserve">other sectors chosen for this portfolio, </w:t>
@@ -82,41 +123,40 @@
         <w:t xml:space="preserve"> NATO </w:t>
       </w:r>
       <w:r>
-        <w:t>parties to spend at least 5% of their GDP on Defense/Military</w:t>
-      </w:r>
-      <w:r>
-        <w:t xml:space="preserve"> (</w:t>
-      </w:r>
-      <w:hyperlink r:id="rId5" w:history="1">
-        <w:r>
-          <w:rPr>
-            <w:rStyle w:val="Hyperlink"/>
-          </w:rPr>
-          <w:t>https://www.nato.int/en/what-we-do/introduction-to-nato/defence-expenditures-and-natos-5-commitment</w:t>
-        </w:r>
-      </w:hyperlink>
-      <w:r>
-        <w:t xml:space="preserve">). </w:t>
-      </w:r>
-      <w:r>
-        <w:t>USA, in general, spend nearly $1 trillion on their military (</w:t>
-      </w:r>
-      <w:hyperlink r:id="rId6" w:history="1">
-        <w:r>
-          <w:rPr>
-            <w:rStyle w:val="Hyperlink"/>
-          </w:rPr>
-          <w:t>https://www.statista.com/statistics/262742/countries-with-the-highest-military-spending/</w:t>
-        </w:r>
-      </w:hyperlink>
-      <w:r>
-        <w:t xml:space="preserve">), and with a new generation of </w:t>
+        <w:t xml:space="preserve">parties to spend at least 5% of their GDP on </w:t>
+      </w:r>
+      <w:r>
+        <w:t>Defense</w:t>
+      </w:r>
+      <w:r>
+        <w:t>/Military</w:t>
+      </w:r>
+      <w:r>
+        <w:t xml:space="preserve"> </w:t>
+      </w:r>
+      <w:r>
+        <w:t xml:space="preserve">[1]. </w:t>
+      </w:r>
+      <w:r>
+        <w:t xml:space="preserve">USA, in general, spend nearly $1 trillion on their military </w:t>
+      </w:r>
+      <w:r>
+        <w:t>[2],</w:t>
+      </w:r>
+      <w:r>
+        <w:t xml:space="preserve"> and with a new generation of </w:t>
       </w:r>
       <w:r>
         <w:t xml:space="preserve">jet fighters on the horizon, it would be probable to assume the </w:t>
       </w:r>
       <w:r>
-        <w:t>rise in the market value of military/defense-based stocks</w:t>
+        <w:t>rise in the market value of military/</w:t>
+      </w:r>
+      <w:r>
+        <w:t>defense</w:t>
+      </w:r>
+      <w:r>
+        <w:t>-based stocks</w:t>
       </w:r>
       <w:r>
         <w:t>, with some of them becoming Mega-Cap (more than $200 billion).</w:t>
@@ -151,16 +191,28 @@
         <w:t>the AI hype decreases as it becomes integrated with daily life.</w:t>
       </w:r>
       <w:r>
-        <w:t xml:space="preserve"> A slow progression and advancement of AI continues into the future, with governmental </w:t>
+        <w:t xml:space="preserve"> </w:t>
+      </w:r>
+      <w:r>
+        <w:t>Slow</w:t>
+      </w:r>
+      <w:r>
+        <w:t xml:space="preserve"> progression and advancement of AI </w:t>
+      </w:r>
+      <w:r>
+        <w:t>continue</w:t>
+      </w:r>
+      <w:r>
+        <w:t xml:space="preserve">, with governmental </w:t>
       </w:r>
       <w:r>
         <w:t xml:space="preserve">restrictions to ensure that the job market is stable and it benefits the working </w:t>
       </w:r>
       <w:r>
-        <w:t>population and</w:t>
-      </w:r>
-      <w:r>
-        <w:t xml:space="preserve"> not hinder them.</w:t>
+        <w:t>population</w:t>
+      </w:r>
+      <w:r>
+        <w:t>.</w:t>
       </w:r>
     </w:p>
     <w:p>
@@ -175,7 +227,13 @@
         <w:t xml:space="preserve">The geopolitical situation remains stable. </w:t>
       </w:r>
       <w:r>
-        <w:t xml:space="preserve">At the time of creating this, there are several conflicts happening across the world, particularly one in the Middle East which had tanked stocks and nearly doubled the price of Brent and Oil. </w:t>
+        <w:t xml:space="preserve">At the time of creating this, there </w:t>
+      </w:r>
+      <w:r>
+        <w:t>were</w:t>
+      </w:r>
+      <w:r>
+        <w:t xml:space="preserve"> several conflicts happening across the world, particularly one in the Middle East which had tanked stocks and nearly doubled the price of Brent and Oil. </w:t>
       </w:r>
       <w:r>
         <w:t xml:space="preserve">It is known that </w:t>
@@ -205,24 +263,21 @@
         <w:t xml:space="preserve"> his reasons surrounding leveraging economic policies, and protecting U.S. industry/trade. However, the opposite has happened, with the job market not showing signs of improvement, and wealth inequality worsening. </w:t>
       </w:r>
       <w:r>
-        <w:t xml:space="preserve">With Trump’s term to end by </w:t>
-      </w:r>
+        <w:t xml:space="preserve">With Trump’s term to end by January 2029, it remains in the balance as to whether the next president (Democrat or Republican) will reverse or reduce these </w:t>
+      </w:r>
+      <w:r>
+        <w:t>tariffs and</w:t>
+      </w:r>
+      <w:r>
+        <w:t xml:space="preserve"> be more open to global trade.</w:t>
+      </w:r>
+      <w:r>
+        <w:t xml:space="preserve"> </w:t>
+      </w:r>
+    </w:p>
+    <w:p>
       <w:r>
         <w:lastRenderedPageBreak/>
-        <w:t xml:space="preserve">January 2029, it remains in the balance as to whether the next president (Democrat or Republican) will reverse or reduce these </w:t>
-      </w:r>
-      <w:r>
-        <w:t>tariffs and</w:t>
-      </w:r>
-      <w:r>
-        <w:t xml:space="preserve"> be more open to global trade.</w:t>
-      </w:r>
-      <w:r>
-        <w:t xml:space="preserve"> </w:t>
-      </w:r>
-    </w:p>
-    <w:p>
-      <w:r>
         <w:t>I have considered three different portfolios to compare: Risk Parity, Equal-Weight, and Black-Litterman.</w:t>
       </w:r>
       <w:r>
@@ -230,25 +285,33 @@
       </w:r>
       <w:r>
         <w:t>equal weight portfolio ensures equal weightage (4.167%) for each asset.</w:t>
+      </w:r>
+    </w:p>
+    <w:p>
+      <w:pPr>
+        <w:pStyle w:val="Heading1"/>
+      </w:pPr>
+      <w:r>
+        <w:t xml:space="preserve">Asset </w:t>
+      </w:r>
+      <w:r>
+        <w:t>and Data Selection</w:t>
       </w:r>
     </w:p>
     <w:p>
       <w:pPr>
         <w:pStyle w:val="Heading2"/>
-        <w:rPr>
-          <w:rFonts w:ascii="Calibri" w:hAnsi="Calibri" w:cs="Calibri"/>
-        </w:rPr>
       </w:pPr>
       <w:r>
-        <w:rPr>
-          <w:rFonts w:ascii="Calibri" w:hAnsi="Calibri" w:cs="Calibri"/>
-        </w:rPr>
         <w:t>Asset Choice</w:t>
       </w:r>
     </w:p>
     <w:p>
       <w:r>
-        <w:t>I have opted to invest in the following assets, in the belief that the following will see consistent growth long-term</w:t>
+        <w:t xml:space="preserve">I have opted to invest in the following assets, in the belief that the following will see consistent </w:t>
+      </w:r>
+      <w:r>
+        <w:t>long-term growth</w:t>
       </w:r>
       <w:r>
         <w:t>.</w:t>
@@ -344,7 +407,17 @@
           <w:tcPr>
             <w:tcW w:w="3006" w:type="dxa"/>
           </w:tcPr>
-          <w:p/>
+          <w:p>
+            <w:r>
+              <w:t>Constantly beating revenue targets</w:t>
+            </w:r>
+            <w:r>
+              <w:t>;</w:t>
+            </w:r>
+            <w:r>
+              <w:t xml:space="preserve"> increase in demand due to AI.</w:t>
+            </w:r>
+          </w:p>
         </w:tc>
       </w:tr>
       <w:tr>
@@ -372,7 +445,11 @@
           <w:tcPr>
             <w:tcW w:w="3006" w:type="dxa"/>
           </w:tcPr>
-          <w:p/>
+          <w:p>
+            <w:r>
+              <w:t>Heavily investing in AI; multi-year contracts may push revenue upwards.</w:t>
+            </w:r>
+          </w:p>
         </w:tc>
       </w:tr>
       <w:tr>
@@ -400,7 +477,11 @@
           <w:tcPr>
             <w:tcW w:w="3006" w:type="dxa"/>
           </w:tcPr>
-          <w:p/>
+          <w:p>
+            <w:r>
+              <w:t>Expectation for revenue to meet targets.</w:t>
+            </w:r>
+          </w:p>
         </w:tc>
       </w:tr>
       <w:tr>
@@ -428,7 +509,11 @@
           <w:tcPr>
             <w:tcW w:w="3006" w:type="dxa"/>
           </w:tcPr>
-          <w:p/>
+          <w:p>
+            <w:r>
+              <w:t>Short-term growth may increase stock price by considerable amounts.</w:t>
+            </w:r>
+          </w:p>
         </w:tc>
       </w:tr>
       <w:tr>
@@ -456,7 +541,11 @@
           <w:tcPr>
             <w:tcW w:w="3006" w:type="dxa"/>
           </w:tcPr>
-          <w:p/>
+          <w:p>
+            <w:r>
+              <w:t>Promoted by Jensen Huang, CEO of NVIDIA.</w:t>
+            </w:r>
+          </w:p>
         </w:tc>
       </w:tr>
       <w:tr>
@@ -500,7 +589,11 @@
           <w:tcPr>
             <w:tcW w:w="3006" w:type="dxa"/>
           </w:tcPr>
-          <w:p/>
+          <w:p>
+            <w:r>
+              <w:t>In the hopes that their AI system(s) improve over time.</w:t>
+            </w:r>
+          </w:p>
         </w:tc>
       </w:tr>
       <w:tr>
@@ -528,7 +621,11 @@
           <w:tcPr>
             <w:tcW w:w="3006" w:type="dxa"/>
           </w:tcPr>
-          <w:p/>
+          <w:p>
+            <w:r>
+              <w:t>More importance towards cybersecurity with the rise of AI data centres and inevitable cybercrimes.</w:t>
+            </w:r>
+          </w:p>
         </w:tc>
       </w:tr>
       <w:tr>
@@ -546,7 +643,13 @@
               <w:rPr>
                 <w:highlight w:val="yellow"/>
               </w:rPr>
-              <w:t>Sandisk Corporation</w:t>
+              <w:t>SanDisk</w:t>
+            </w:r>
+            <w:r>
+              <w:rPr>
+                <w:highlight w:val="yellow"/>
+              </w:rPr>
+              <w:t xml:space="preserve"> Corporation</w:t>
             </w:r>
           </w:p>
         </w:tc>
@@ -578,6 +681,12 @@
                 <w:highlight w:val="yellow"/>
               </w:rPr>
             </w:pPr>
+            <w:r>
+              <w:rPr>
+                <w:highlight w:val="yellow"/>
+              </w:rPr>
+              <w:t>Reliance on SSDs</w:t>
+            </w:r>
           </w:p>
         </w:tc>
       </w:tr>
@@ -612,7 +721,11 @@
           <w:tcPr>
             <w:tcW w:w="3006" w:type="dxa"/>
           </w:tcPr>
-          <w:p/>
+          <w:p>
+            <w:r>
+              <w:t>More demand for sensors in various industries.</w:t>
+            </w:r>
+          </w:p>
         </w:tc>
       </w:tr>
       <w:tr>
@@ -640,7 +753,11 @@
           <w:tcPr>
             <w:tcW w:w="3006" w:type="dxa"/>
           </w:tcPr>
-          <w:p/>
+          <w:p>
+            <w:r>
+              <w:t>On the assumption that NVIDIA uses them for semiconductor intellectual property (IP).</w:t>
+            </w:r>
+          </w:p>
         </w:tc>
       </w:tr>
       <w:tr>
@@ -734,7 +851,15 @@
           <w:tcPr>
             <w:tcW w:w="3006" w:type="dxa"/>
           </w:tcPr>
-          <w:p/>
+          <w:p>
+            <w:r>
+              <w:t xml:space="preserve">Their investment and future reliance on AI may enable </w:t>
+            </w:r>
+            <w:r>
+              <w:lastRenderedPageBreak/>
+              <w:t>them to perform tasks at a faster speed, increasing their usefulness.</w:t>
+            </w:r>
+          </w:p>
         </w:tc>
       </w:tr>
       <w:tr>
@@ -744,6 +869,7 @@
           </w:tcPr>
           <w:p>
             <w:r>
+              <w:lastRenderedPageBreak/>
               <w:t>Cloudflare Inc.</w:t>
             </w:r>
           </w:p>
@@ -762,7 +888,11 @@
           <w:tcPr>
             <w:tcW w:w="3006" w:type="dxa"/>
           </w:tcPr>
-          <w:p/>
+          <w:p>
+            <w:r>
+              <w:t>Rise in online apps like Shopify, Uber, DoorDash.</w:t>
+            </w:r>
+          </w:p>
         </w:tc>
       </w:tr>
       <w:tr>
@@ -790,7 +920,11 @@
           <w:tcPr>
             <w:tcW w:w="3006" w:type="dxa"/>
           </w:tcPr>
-          <w:p/>
+          <w:p>
+            <w:r>
+              <w:t>Betting on the success of Adobe Firefly.</w:t>
+            </w:r>
+          </w:p>
         </w:tc>
       </w:tr>
       <w:tr>
@@ -818,7 +952,20 @@
           <w:tcPr>
             <w:tcW w:w="3006" w:type="dxa"/>
           </w:tcPr>
-          <w:p/>
+          <w:p>
+            <w:r>
+              <w:t xml:space="preserve">Ease workload of several departments in an </w:t>
+            </w:r>
+            <w:r>
+              <w:t>organization</w:t>
+            </w:r>
+            <w:r>
+              <w:t xml:space="preserve">; </w:t>
+            </w:r>
+            <w:r>
+              <w:t>should grow with the rise of new companies driven by AI’s growth.</w:t>
+            </w:r>
+          </w:p>
         </w:tc>
       </w:tr>
       <w:tr>
@@ -862,7 +1009,17 @@
           <w:tcPr>
             <w:tcW w:w="3006" w:type="dxa"/>
           </w:tcPr>
-          <w:p/>
+          <w:p>
+            <w:r>
+              <w:t xml:space="preserve">The growth in AI equates to the need </w:t>
+            </w:r>
+            <w:r>
+              <w:t>for</w:t>
+            </w:r>
+            <w:r>
+              <w:t xml:space="preserve"> data centres.</w:t>
+            </w:r>
+          </w:p>
         </w:tc>
       </w:tr>
       <w:tr>
@@ -890,7 +1047,14 @@
           <w:tcPr>
             <w:tcW w:w="3006" w:type="dxa"/>
           </w:tcPr>
-          <w:p/>
+          <w:p>
+            <w:r>
+              <w:t xml:space="preserve">Could be on the rise if used </w:t>
+            </w:r>
+            <w:r>
+              <w:t>to provide services for AI data centres.</w:t>
+            </w:r>
+          </w:p>
         </w:tc>
       </w:tr>
       <w:tr>
@@ -918,7 +1082,11 @@
           <w:tcPr>
             <w:tcW w:w="3006" w:type="dxa"/>
           </w:tcPr>
-          <w:p/>
+          <w:p>
+            <w:r>
+              <w:t>Same reason as DLR.</w:t>
+            </w:r>
+          </w:p>
         </w:tc>
       </w:tr>
       <w:tr>
@@ -946,7 +1114,11 @@
           <w:tcPr>
             <w:tcW w:w="3006" w:type="dxa"/>
           </w:tcPr>
-          <w:p/>
+          <w:p>
+            <w:r>
+              <w:t>Provides electrical and cooling services to AI data centres; will be a major stock to watch.</w:t>
+            </w:r>
+          </w:p>
         </w:tc>
       </w:tr>
       <w:tr>
@@ -974,7 +1146,11 @@
           <w:tcPr>
             <w:tcW w:w="3006" w:type="dxa"/>
           </w:tcPr>
-          <w:p/>
+          <w:p>
+            <w:r>
+              <w:t>Same reason as EQIX.</w:t>
+            </w:r>
+          </w:p>
         </w:tc>
       </w:tr>
       <w:tr>
@@ -1018,7 +1194,14 @@
           <w:tcPr>
             <w:tcW w:w="3006" w:type="dxa"/>
           </w:tcPr>
-          <w:p/>
+          <w:p>
+            <w:r>
+              <w:t>Should experience massive growth due to a</w:t>
+            </w:r>
+            <w:r>
+              <w:t xml:space="preserve"> surge in contracts such as the Kentucky Data Centre Campus and Google Nuclear Power Purchase Agreement.</w:t>
+            </w:r>
+          </w:p>
         </w:tc>
       </w:tr>
       <w:tr>
@@ -1068,6 +1251,12 @@
                 <w:highlight w:val="yellow"/>
               </w:rPr>
             </w:pPr>
+            <w:r>
+              <w:rPr>
+                <w:highlight w:val="yellow"/>
+              </w:rPr>
+              <w:t>Rise in renewable energy assuming a change in direction by the next administration.</w:t>
+            </w:r>
           </w:p>
         </w:tc>
       </w:tr>
@@ -1096,7 +1285,17 @@
           <w:tcPr>
             <w:tcW w:w="3006" w:type="dxa"/>
           </w:tcPr>
-          <w:p/>
+          <w:p>
+            <w:r>
+              <w:t>Energy demand</w:t>
+            </w:r>
+            <w:r>
+              <w:t xml:space="preserve"> </w:t>
+            </w:r>
+            <w:r>
+              <w:t>would increase because of rising population and the demand for AI data centres.</w:t>
+            </w:r>
+          </w:p>
         </w:tc>
       </w:tr>
       <w:tr>
@@ -1124,7 +1323,11 @@
           <w:tcPr>
             <w:tcW w:w="3006" w:type="dxa"/>
           </w:tcPr>
-          <w:p/>
+          <w:p>
+            <w:r>
+              <w:t>Same reason as SO.</w:t>
+            </w:r>
+          </w:p>
         </w:tc>
       </w:tr>
       <w:tr>
@@ -1168,7 +1371,15 @@
           <w:tcPr>
             <w:tcW w:w="3006" w:type="dxa"/>
           </w:tcPr>
-          <w:p/>
+          <w:p>
+            <w:r>
+              <w:t xml:space="preserve">Multiple contracts signed this year, along with the potential for more given Trump’s order to increase % </w:t>
+            </w:r>
+            <w:r>
+              <w:lastRenderedPageBreak/>
+              <w:t>of GDP spent on military to 5% for NATO parties.</w:t>
+            </w:r>
+          </w:p>
         </w:tc>
       </w:tr>
       <w:tr>
@@ -1178,6 +1389,7 @@
           </w:tcPr>
           <w:p>
             <w:r>
+              <w:lastRenderedPageBreak/>
               <w:t>RTX Corp Inc.</w:t>
             </w:r>
           </w:p>
@@ -1196,7 +1408,14 @@
           <w:tcPr>
             <w:tcW w:w="3006" w:type="dxa"/>
           </w:tcPr>
-          <w:p/>
+          <w:p>
+            <w:r>
+              <w:t>Contracts and deals including the Tomahawk cruise missiles deal</w:t>
+            </w:r>
+            <w:r>
+              <w:t>; alongside the rise in military expenditure.</w:t>
+            </w:r>
+          </w:p>
         </w:tc>
       </w:tr>
       <w:tr>
@@ -1206,7 +1425,6 @@
           </w:tcPr>
           <w:p>
             <w:r>
-              <w:lastRenderedPageBreak/>
               <w:t>General Dynamics Corp.</w:t>
             </w:r>
           </w:p>
@@ -1225,7 +1443,11 @@
           <w:tcPr>
             <w:tcW w:w="3006" w:type="dxa"/>
           </w:tcPr>
-          <w:p/>
+          <w:p>
+            <w:r>
+              <w:t>Similar reasoning as LMT and RTX.</w:t>
+            </w:r>
+          </w:p>
         </w:tc>
       </w:tr>
     </w:tbl>
@@ -1250,8 +1472,14 @@
     <w:p>
       <w:pPr>
         <w:pStyle w:val="Heading2"/>
+        <w:rPr>
+          <w:rFonts w:ascii="Calibri" w:hAnsi="Calibri" w:cs="Calibri"/>
+        </w:rPr>
       </w:pPr>
       <w:r>
+        <w:rPr>
+          <w:rFonts w:ascii="Calibri" w:hAnsi="Calibri" w:cs="Calibri"/>
+        </w:rPr>
         <w:t>Selection of Data</w:t>
       </w:r>
     </w:p>
@@ -1353,13 +1581,7 @@
                             <w:rPr>
                               <w:rFonts w:ascii="Cambria Math" w:hAnsi="Cambria Math"/>
                             </w:rPr>
-                            <m:t>t</m:t>
-                          </m:r>
-                          <m:r>
-                            <w:rPr>
-                              <w:rFonts w:ascii="Cambria Math" w:hAnsi="Cambria Math"/>
-                            </w:rPr>
-                            <m:t>+1</m:t>
+                            <m:t>t+1</m:t>
                           </m:r>
                         </m:sub>
                       </m:sSub>
@@ -1447,13 +1669,7 @@
               <w:rPr>
                 <w:rFonts w:ascii="Cambria Math" w:eastAsiaTheme="minorEastAsia" w:hAnsi="Cambria Math"/>
               </w:rPr>
-              <m:t>t</m:t>
-            </m:r>
-            <m:r>
-              <w:rPr>
-                <w:rFonts w:ascii="Cambria Math" w:eastAsiaTheme="minorEastAsia" w:hAnsi="Cambria Math"/>
-              </w:rPr>
-              <m:t>+1</m:t>
+              <m:t>t+1</m:t>
             </m:r>
           </m:sub>
         </m:sSub>
@@ -1679,12 +1895,12 @@
       <w:pPr>
         <w:pStyle w:val="Heading2"/>
         <w:rPr>
-          <w:rFonts w:eastAsiaTheme="minorEastAsia"/>
+          <w:rFonts w:ascii="Calibri" w:eastAsiaTheme="minorEastAsia" w:hAnsi="Calibri" w:cs="Calibri"/>
         </w:rPr>
       </w:pPr>
       <w:r>
         <w:rPr>
-          <w:rFonts w:eastAsiaTheme="minorEastAsia"/>
+          <w:rFonts w:ascii="Calibri" w:eastAsiaTheme="minorEastAsia" w:hAnsi="Calibri" w:cs="Calibri"/>
         </w:rPr>
         <w:t>Metric Assumptions</w:t>
       </w:r>
@@ -1745,16 +1961,30 @@
     <w:p>
       <w:pPr>
         <w:pStyle w:val="Heading2"/>
-        <w:rPr>
-          <w:rFonts w:ascii="Calibri" w:hAnsi="Calibri" w:cs="Calibri"/>
-        </w:rPr>
       </w:pPr>
       <w:r>
-        <w:rPr>
-          <w:rFonts w:ascii="Calibri" w:hAnsi="Calibri" w:cs="Calibri"/>
-        </w:rPr>
+        <w:lastRenderedPageBreak/>
+        <w:t>Portfolio Code</w:t>
+      </w:r>
+    </w:p>
+    <w:p>
+      <w:r>
+        <w:t xml:space="preserve">The code for the portfolio optimization and risk dashboard was written in Python, with </w:t>
+      </w:r>
+      <w:r>
+        <w:t>the relevant output data exported to Excel. Charts will be included in the Appendix, with the main parameters outlined and explained in the Observations section.</w:t>
+      </w:r>
+    </w:p>
+    <w:p>
+      <w:pPr>
+        <w:pStyle w:val="Heading1"/>
+      </w:pPr>
+      <w:r>
         <w:t>Black-Litterman Model</w:t>
       </w:r>
+      <w:r>
+        <w:t xml:space="preserve"> (BLO)</w:t>
+      </w:r>
     </w:p>
     <w:p>
       <w:r>
@@ -1769,18 +1999,10 @@
         <w:t>The first step in this model is to do a reverse optimization</w:t>
       </w:r>
       <w:r>
-        <w:t>, which allows to derive equilibrium returns, based off this formula (</w:t>
-      </w:r>
-      <w:hyperlink r:id="rId7" w:history="1">
-        <w:r>
-          <w:rPr>
-            <w:rStyle w:val="Hyperlink"/>
-          </w:rPr>
-          <w:t>https://people.duke.edu/~charvey/Teaching/BA453_2006/Idzorek_onBL.pdf</w:t>
-        </w:r>
-      </w:hyperlink>
-      <w:r>
-        <w:t>)</w:t>
+        <w:t xml:space="preserve">, which allows to derive equilibrium returns, based off this formula </w:t>
+      </w:r>
+      <w:r>
+        <w:t>[3]:</w:t>
       </w:r>
     </w:p>
     <w:p>
@@ -1837,7 +2059,6 @@
         <w:rPr>
           <w:rFonts w:eastAsiaTheme="minorEastAsia"/>
         </w:rPr>
-        <w:lastRenderedPageBreak/>
         <w:t xml:space="preserve">Where </w:t>
       </w:r>
       <w:r>
@@ -1932,22 +2153,13 @@
         <w:rPr>
           <w:rFonts w:eastAsiaTheme="minorEastAsia"/>
         </w:rPr>
-        <w:t>ased off each rolling period, and the risk-free rate of each rolling period’s end date. Data for the risk-free rate was taken from (</w:t>
-      </w:r>
-      <w:hyperlink r:id="rId8" w:history="1">
-        <w:r>
-          <w:rPr>
-            <w:rStyle w:val="Hyperlink"/>
-            <w:rFonts w:eastAsiaTheme="minorEastAsia"/>
-          </w:rPr>
-          <w:t>https://fred.stlouisfed.org/series/DGS3MO</w:t>
-        </w:r>
-      </w:hyperlink>
-      <w:r>
-        <w:rPr>
-          <w:rFonts w:eastAsiaTheme="minorEastAsia"/>
-        </w:rPr>
-        <w:t>)</w:t>
+        <w:t>ased off each rolling period, and the risk-free rate of each rolling period’s end date</w:t>
+      </w:r>
+      <w:r>
+        <w:rPr>
+          <w:rFonts w:eastAsiaTheme="minorEastAsia"/>
+        </w:rPr>
+        <w:t xml:space="preserve"> [4].</w:t>
       </w:r>
     </w:p>
     <w:p>
@@ -2014,7 +2226,13 @@
         <w:rPr>
           <w:rFonts w:eastAsiaTheme="minorEastAsia"/>
         </w:rPr>
-        <w:t>%. This is in part due to their significant growth in market cap, and their heavy investment(s) in AI, which I hold an optimistic view on.</w:t>
+        <w:t>%. This is in part due to their significant growth in market cap, and their heavy investment(s) in AI, which I hold an optimistic view</w:t>
+      </w:r>
+      <w:r>
+        <w:rPr>
+          <w:rFonts w:eastAsiaTheme="minorEastAsia"/>
+        </w:rPr>
+        <w:t>.</w:t>
       </w:r>
     </w:p>
     <w:p>
@@ -2111,22 +2329,13 @@
         <w:rPr>
           <w:rFonts w:eastAsiaTheme="minorEastAsia"/>
         </w:rPr>
-        <w:t xml:space="preserve"> (</w:t>
-      </w:r>
-      <w:hyperlink r:id="rId9" w:history="1">
-        <w:r>
-          <w:rPr>
-            <w:rStyle w:val="Hyperlink"/>
-            <w:rFonts w:eastAsiaTheme="minorEastAsia"/>
-          </w:rPr>
-          <w:t>https://abcnews.com/Business/microsoft-laying-off-4800-workers-ai-changing-work/story?id=134518435</w:t>
-        </w:r>
-      </w:hyperlink>
-      <w:r>
-        <w:rPr>
-          <w:rFonts w:eastAsiaTheme="minorEastAsia"/>
-        </w:rPr>
-        <w:t xml:space="preserve">). </w:t>
+        <w:t xml:space="preserve"> </w:t>
+      </w:r>
+      <w:r>
+        <w:rPr>
+          <w:rFonts w:eastAsiaTheme="minorEastAsia"/>
+        </w:rPr>
+        <w:t>[5].</w:t>
       </w:r>
       <w:r>
         <w:rPr>
@@ -2210,13 +2419,25 @@
         <w:rPr>
           <w:rFonts w:eastAsiaTheme="minorEastAsia"/>
         </w:rPr>
-        <w:t>. Moreover, with a rise in AI data centres, it is imperative that HVAC systems boast a high efficiency to save energy, something that TEL can provide.</w:t>
-      </w:r>
-      <w:r>
-        <w:rPr>
-          <w:rFonts w:eastAsiaTheme="minorEastAsia"/>
-        </w:rPr>
-        <w:t xml:space="preserve"> (need to add MU)</w:t>
+        <w:t xml:space="preserve">. Moreover, with a rise in AI data centres, it is imperative that HVAC systems boast </w:t>
+      </w:r>
+      <w:r>
+        <w:rPr>
+          <w:rFonts w:eastAsiaTheme="minorEastAsia"/>
+        </w:rPr>
+        <w:t>high</w:t>
+      </w:r>
+      <w:r>
+        <w:rPr>
+          <w:rFonts w:eastAsiaTheme="minorEastAsia"/>
+        </w:rPr>
+        <w:t xml:space="preserve"> efficiency to save energy, something that TEL can provide.</w:t>
+      </w:r>
+      <w:r>
+        <w:rPr>
+          <w:rFonts w:eastAsiaTheme="minorEastAsia"/>
+        </w:rPr>
+        <w:t xml:space="preserve"> </w:t>
       </w:r>
     </w:p>
     <w:p>
@@ -2264,15 +2485,1140 @@
         <w:rPr>
           <w:rFonts w:eastAsiaTheme="minorEastAsia"/>
         </w:rPr>
-        <w:t xml:space="preserve">Jensen Huang (NVIDIA’s CEO) has predicted MARVELL to become a trillion-dollar company in the near future. </w:t>
-      </w:r>
-      <w:r>
-        <w:rPr>
-          <w:rFonts w:eastAsiaTheme="minorEastAsia"/>
-        </w:rPr>
+        <w:t xml:space="preserve">Jensen Huang (NVIDIA’s CEO) has predicted MARVELL to become a trillion-dollar company </w:t>
+      </w:r>
+      <w:r>
+        <w:rPr>
+          <w:rFonts w:eastAsiaTheme="minorEastAsia"/>
+        </w:rPr>
+        <w:t>soon</w:t>
+      </w:r>
+      <w:r>
+        <w:rPr>
+          <w:rFonts w:eastAsiaTheme="minorEastAsia"/>
+        </w:rPr>
+        <w:t xml:space="preserve">. </w:t>
+      </w:r>
+      <w:r>
+        <w:rPr>
+          <w:rFonts w:eastAsiaTheme="minorEastAsia"/>
+        </w:rPr>
+        <w:lastRenderedPageBreak/>
         <w:t>While the stock rose rapidly due to NVIDIA’s investment, the growth of the semiconductor industry, coupled with the rapid rise of AI, gives MRVL a good chance for its stock price (and market cap) to undergo a steady and significant rise in the future.</w:t>
       </w:r>
     </w:p>
+    <w:p>
+      <w:pPr>
+        <w:pStyle w:val="Heading2"/>
+        <w:rPr>
+          <w:rFonts w:eastAsiaTheme="minorEastAsia"/>
+        </w:rPr>
+      </w:pPr>
+      <w:r>
+        <w:rPr>
+          <w:rFonts w:eastAsiaTheme="minorEastAsia"/>
+        </w:rPr>
+        <w:t>Black-Litterman Metrics</w:t>
+      </w:r>
+    </w:p>
+    <w:p>
+      <w:r>
+        <w:t>For the Black-Litterman portfolio, the following metrics were considered:</w:t>
+      </w:r>
+    </w:p>
+    <w:p>
+      <w:pPr>
+        <w:pStyle w:val="ListParagraph"/>
+        <w:numPr>
+          <w:ilvl w:val="0"/>
+          <w:numId w:val="1"/>
+        </w:numPr>
+      </w:pPr>
+      <w:r>
+        <w:t xml:space="preserve">Tau </w:t>
+      </w:r>
+      <m:oMath>
+        <m:r>
+          <w:rPr>
+            <w:rFonts w:ascii="Cambria Math" w:hAnsi="Cambria Math"/>
+          </w:rPr>
+          <m:t>(τ)</m:t>
+        </m:r>
+      </m:oMath>
+      <w:r>
+        <w:rPr>
+          <w:rFonts w:eastAsiaTheme="minorEastAsia"/>
+        </w:rPr>
+        <w:t>: 0.035</w:t>
+      </w:r>
+    </w:p>
+    <w:p>
+      <w:pPr>
+        <w:pStyle w:val="ListParagraph"/>
+        <w:numPr>
+          <w:ilvl w:val="0"/>
+          <w:numId w:val="1"/>
+        </w:numPr>
+      </w:pPr>
+      <w:r>
+        <w:rPr>
+          <w:rFonts w:eastAsiaTheme="minorEastAsia"/>
+        </w:rPr>
+        <w:t>Confidence level: 50%</w:t>
+      </w:r>
+    </w:p>
+    <w:p>
+      <w:r>
+        <w:t xml:space="preserve">These values were considered to reflect on my </w:t>
+      </w:r>
+      <w:r>
+        <w:t xml:space="preserve">views holding moderate weight, given the instability of the geopolitical situation, and the assumption that no Black Swan events occur in the near future, which may hamper the economy. </w:t>
+      </w:r>
+    </w:p>
+    <w:p>
+      <w:pPr>
+        <w:pStyle w:val="Heading2"/>
+      </w:pPr>
+      <w:r>
+        <w:t>Black-Litterman Observations</w:t>
+      </w:r>
+    </w:p>
+    <w:p>
+      <w:r>
+        <w:t xml:space="preserve">Note: All the relevant data is available in the Excel file in the </w:t>
+      </w:r>
+      <w:r>
+        <w:t>Output folder.</w:t>
+      </w:r>
+      <w:r>
+        <w:t xml:space="preserve"> The data I consider important will be provided in this section, followed by explanations and graphs where necessary.</w:t>
+      </w:r>
+    </w:p>
+    <w:p>
+      <w:r>
+        <w:t xml:space="preserve">Upon running the code on Python, and exporting the data to Excel, the following </w:t>
+      </w:r>
+      <w:r>
+        <w:t xml:space="preserve">summarized </w:t>
+      </w:r>
+      <w:r>
+        <w:t>information I deem crucial is included in the table below:</w:t>
+      </w:r>
+    </w:p>
+    <w:tbl>
+      <w:tblPr>
+        <w:tblStyle w:val="TableGrid"/>
+        <w:tblW w:w="6980" w:type="dxa"/>
+        <w:jc w:val="center"/>
+        <w:tblLook w:val="04A0" w:firstRow="1" w:lastRow="0" w:firstColumn="1" w:lastColumn="0" w:noHBand="0" w:noVBand="1"/>
+      </w:tblPr>
+      <w:tblGrid>
+        <w:gridCol w:w="4260"/>
+        <w:gridCol w:w="2720"/>
+      </w:tblGrid>
+      <w:tr>
+        <w:trPr>
+          <w:trHeight w:val="290"/>
+          <w:jc w:val="center"/>
+        </w:trPr>
+        <w:tc>
+          <w:tcPr>
+            <w:tcW w:w="4260" w:type="dxa"/>
+            <w:noWrap/>
+            <w:hideMark/>
+          </w:tcPr>
+          <w:p>
+            <w:pPr>
+              <w:jc w:val="center"/>
+              <w:rPr>
+                <w:rFonts w:eastAsia="Times New Roman"/>
+                <w:b/>
+                <w:bCs/>
+                <w:color w:val="000000"/>
+                <w:kern w:val="0"/>
+                <w:sz w:val="22"/>
+                <w:szCs w:val="22"/>
+                <w:lang w:val="en-GB" w:eastAsia="en-GB"/>
+                <w14:ligatures w14:val="none"/>
+              </w:rPr>
+            </w:pPr>
+            <w:r>
+              <w:rPr>
+                <w:rFonts w:eastAsia="Times New Roman"/>
+                <w:b/>
+                <w:bCs/>
+                <w:color w:val="000000"/>
+                <w:kern w:val="0"/>
+                <w:sz w:val="22"/>
+                <w:szCs w:val="22"/>
+                <w:lang w:val="en-GB" w:eastAsia="en-GB"/>
+                <w14:ligatures w14:val="none"/>
+              </w:rPr>
+              <w:t>Metric</w:t>
+            </w:r>
+          </w:p>
+        </w:tc>
+        <w:tc>
+          <w:tcPr>
+            <w:tcW w:w="2720" w:type="dxa"/>
+            <w:noWrap/>
+            <w:hideMark/>
+          </w:tcPr>
+          <w:p>
+            <w:pPr>
+              <w:jc w:val="center"/>
+              <w:rPr>
+                <w:rFonts w:eastAsia="Times New Roman"/>
+                <w:b/>
+                <w:bCs/>
+                <w:color w:val="000000"/>
+                <w:kern w:val="0"/>
+                <w:sz w:val="22"/>
+                <w:szCs w:val="22"/>
+                <w:lang w:val="en-GB" w:eastAsia="en-GB"/>
+                <w14:ligatures w14:val="none"/>
+              </w:rPr>
+            </w:pPr>
+            <w:r>
+              <w:rPr>
+                <w:rFonts w:eastAsia="Times New Roman"/>
+                <w:b/>
+                <w:bCs/>
+                <w:color w:val="000000"/>
+                <w:kern w:val="0"/>
+                <w:sz w:val="22"/>
+                <w:szCs w:val="22"/>
+                <w:lang w:val="en-GB" w:eastAsia="en-GB"/>
+                <w14:ligatures w14:val="none"/>
+              </w:rPr>
+              <w:t>Value</w:t>
+            </w:r>
+          </w:p>
+        </w:tc>
+      </w:tr>
+      <w:tr>
+        <w:trPr>
+          <w:trHeight w:val="290"/>
+          <w:jc w:val="center"/>
+        </w:trPr>
+        <w:tc>
+          <w:tcPr>
+            <w:tcW w:w="4260" w:type="dxa"/>
+            <w:noWrap/>
+            <w:hideMark/>
+          </w:tcPr>
+          <w:p>
+            <w:pPr>
+              <w:jc w:val="center"/>
+              <w:rPr>
+                <w:rFonts w:eastAsia="Times New Roman"/>
+                <w:color w:val="000000"/>
+                <w:kern w:val="0"/>
+                <w:sz w:val="22"/>
+                <w:szCs w:val="22"/>
+                <w:lang w:val="en-GB" w:eastAsia="en-GB"/>
+                <w14:ligatures w14:val="none"/>
+              </w:rPr>
+            </w:pPr>
+            <w:r>
+              <w:rPr>
+                <w:rFonts w:eastAsia="Times New Roman"/>
+                <w:color w:val="000000"/>
+                <w:kern w:val="0"/>
+                <w:sz w:val="22"/>
+                <w:szCs w:val="22"/>
+                <w:lang w:val="en-GB" w:eastAsia="en-GB"/>
+                <w14:ligatures w14:val="none"/>
+              </w:rPr>
+              <w:t>Final Cumulative Net Return (%)</w:t>
+            </w:r>
+          </w:p>
+        </w:tc>
+        <w:tc>
+          <w:tcPr>
+            <w:tcW w:w="2720" w:type="dxa"/>
+            <w:noWrap/>
+            <w:hideMark/>
+          </w:tcPr>
+          <w:p>
+            <w:pPr>
+              <w:jc w:val="center"/>
+              <w:rPr>
+                <w:rFonts w:eastAsia="Times New Roman"/>
+                <w:color w:val="000000"/>
+                <w:kern w:val="0"/>
+                <w:sz w:val="22"/>
+                <w:szCs w:val="22"/>
+                <w:lang w:val="en-GB" w:eastAsia="en-GB"/>
+                <w14:ligatures w14:val="none"/>
+              </w:rPr>
+            </w:pPr>
+            <w:r>
+              <w:rPr>
+                <w:rFonts w:eastAsia="Times New Roman"/>
+                <w:color w:val="000000"/>
+                <w:kern w:val="0"/>
+                <w:sz w:val="22"/>
+                <w:szCs w:val="22"/>
+                <w:lang w:val="en-GB" w:eastAsia="en-GB"/>
+                <w14:ligatures w14:val="none"/>
+              </w:rPr>
+              <w:t>371.08</w:t>
+            </w:r>
+          </w:p>
+        </w:tc>
+      </w:tr>
+      <w:tr>
+        <w:trPr>
+          <w:trHeight w:val="290"/>
+          <w:jc w:val="center"/>
+        </w:trPr>
+        <w:tc>
+          <w:tcPr>
+            <w:tcW w:w="4260" w:type="dxa"/>
+            <w:noWrap/>
+            <w:hideMark/>
+          </w:tcPr>
+          <w:p>
+            <w:pPr>
+              <w:jc w:val="center"/>
+              <w:rPr>
+                <w:rFonts w:eastAsia="Times New Roman"/>
+                <w:color w:val="000000"/>
+                <w:kern w:val="0"/>
+                <w:sz w:val="22"/>
+                <w:szCs w:val="22"/>
+                <w:lang w:val="en-GB" w:eastAsia="en-GB"/>
+                <w14:ligatures w14:val="none"/>
+              </w:rPr>
+            </w:pPr>
+            <w:r>
+              <w:rPr>
+                <w:rFonts w:eastAsia="Times New Roman"/>
+                <w:color w:val="000000"/>
+                <w:kern w:val="0"/>
+                <w:sz w:val="22"/>
+                <w:szCs w:val="22"/>
+                <w:lang w:val="en-GB" w:eastAsia="en-GB"/>
+                <w14:ligatures w14:val="none"/>
+              </w:rPr>
+              <w:t>Final Annualized Return (%)</w:t>
+            </w:r>
+          </w:p>
+        </w:tc>
+        <w:tc>
+          <w:tcPr>
+            <w:tcW w:w="2720" w:type="dxa"/>
+            <w:noWrap/>
+            <w:hideMark/>
+          </w:tcPr>
+          <w:p>
+            <w:pPr>
+              <w:jc w:val="center"/>
+              <w:rPr>
+                <w:rFonts w:eastAsia="Times New Roman"/>
+                <w:color w:val="000000"/>
+                <w:kern w:val="0"/>
+                <w:sz w:val="22"/>
+                <w:szCs w:val="22"/>
+                <w:lang w:val="en-GB" w:eastAsia="en-GB"/>
+                <w14:ligatures w14:val="none"/>
+              </w:rPr>
+            </w:pPr>
+            <w:r>
+              <w:rPr>
+                <w:rFonts w:eastAsia="Times New Roman"/>
+                <w:color w:val="000000"/>
+                <w:kern w:val="0"/>
+                <w:sz w:val="22"/>
+                <w:szCs w:val="22"/>
+                <w:lang w:val="en-GB" w:eastAsia="en-GB"/>
+                <w14:ligatures w14:val="none"/>
+              </w:rPr>
+              <w:t>33.13</w:t>
+            </w:r>
+          </w:p>
+        </w:tc>
+      </w:tr>
+      <w:tr>
+        <w:trPr>
+          <w:trHeight w:val="290"/>
+          <w:jc w:val="center"/>
+        </w:trPr>
+        <w:tc>
+          <w:tcPr>
+            <w:tcW w:w="4260" w:type="dxa"/>
+            <w:noWrap/>
+            <w:hideMark/>
+          </w:tcPr>
+          <w:p>
+            <w:pPr>
+              <w:jc w:val="center"/>
+              <w:rPr>
+                <w:rFonts w:eastAsia="Times New Roman"/>
+                <w:color w:val="000000"/>
+                <w:kern w:val="0"/>
+                <w:sz w:val="22"/>
+                <w:szCs w:val="22"/>
+                <w:lang w:val="en-GB" w:eastAsia="en-GB"/>
+                <w14:ligatures w14:val="none"/>
+              </w:rPr>
+            </w:pPr>
+            <w:r>
+              <w:rPr>
+                <w:rFonts w:eastAsia="Times New Roman"/>
+                <w:color w:val="000000"/>
+                <w:kern w:val="0"/>
+                <w:sz w:val="22"/>
+                <w:szCs w:val="22"/>
+                <w:lang w:val="en-GB" w:eastAsia="en-GB"/>
+                <w14:ligatures w14:val="none"/>
+              </w:rPr>
+              <w:t>Final Annualized Volatility (%)</w:t>
+            </w:r>
+          </w:p>
+        </w:tc>
+        <w:tc>
+          <w:tcPr>
+            <w:tcW w:w="2720" w:type="dxa"/>
+            <w:noWrap/>
+            <w:hideMark/>
+          </w:tcPr>
+          <w:p>
+            <w:pPr>
+              <w:jc w:val="center"/>
+              <w:rPr>
+                <w:rFonts w:eastAsia="Times New Roman"/>
+                <w:color w:val="000000"/>
+                <w:kern w:val="0"/>
+                <w:sz w:val="22"/>
+                <w:szCs w:val="22"/>
+                <w:lang w:val="en-GB" w:eastAsia="en-GB"/>
+                <w14:ligatures w14:val="none"/>
+              </w:rPr>
+            </w:pPr>
+            <w:r>
+              <w:rPr>
+                <w:rFonts w:eastAsia="Times New Roman"/>
+                <w:color w:val="000000"/>
+                <w:kern w:val="0"/>
+                <w:sz w:val="22"/>
+                <w:szCs w:val="22"/>
+                <w:lang w:val="en-GB" w:eastAsia="en-GB"/>
+                <w14:ligatures w14:val="none"/>
+              </w:rPr>
+              <w:t>21.83</w:t>
+            </w:r>
+          </w:p>
+        </w:tc>
+      </w:tr>
+      <w:tr>
+        <w:trPr>
+          <w:trHeight w:val="290"/>
+          <w:jc w:val="center"/>
+        </w:trPr>
+        <w:tc>
+          <w:tcPr>
+            <w:tcW w:w="4260" w:type="dxa"/>
+            <w:noWrap/>
+            <w:hideMark/>
+          </w:tcPr>
+          <w:p>
+            <w:pPr>
+              <w:jc w:val="center"/>
+              <w:rPr>
+                <w:rFonts w:eastAsia="Times New Roman"/>
+                <w:color w:val="000000"/>
+                <w:kern w:val="0"/>
+                <w:sz w:val="22"/>
+                <w:szCs w:val="22"/>
+                <w:lang w:val="en-GB" w:eastAsia="en-GB"/>
+                <w14:ligatures w14:val="none"/>
+              </w:rPr>
+            </w:pPr>
+            <w:r>
+              <w:rPr>
+                <w:rFonts w:eastAsia="Times New Roman"/>
+                <w:color w:val="000000"/>
+                <w:kern w:val="0"/>
+                <w:sz w:val="22"/>
+                <w:szCs w:val="22"/>
+                <w:lang w:val="en-GB" w:eastAsia="en-GB"/>
+                <w14:ligatures w14:val="none"/>
+              </w:rPr>
+              <w:t>Final Sharpe Ratio</w:t>
+            </w:r>
+          </w:p>
+        </w:tc>
+        <w:tc>
+          <w:tcPr>
+            <w:tcW w:w="2720" w:type="dxa"/>
+            <w:noWrap/>
+            <w:hideMark/>
+          </w:tcPr>
+          <w:p>
+            <w:pPr>
+              <w:jc w:val="center"/>
+              <w:rPr>
+                <w:rFonts w:eastAsia="Times New Roman"/>
+                <w:color w:val="000000"/>
+                <w:kern w:val="0"/>
+                <w:sz w:val="22"/>
+                <w:szCs w:val="22"/>
+                <w:lang w:val="en-GB" w:eastAsia="en-GB"/>
+                <w14:ligatures w14:val="none"/>
+              </w:rPr>
+            </w:pPr>
+            <w:r>
+              <w:rPr>
+                <w:rFonts w:eastAsia="Times New Roman"/>
+                <w:color w:val="000000"/>
+                <w:kern w:val="0"/>
+                <w:sz w:val="22"/>
+                <w:szCs w:val="22"/>
+                <w:lang w:val="en-GB" w:eastAsia="en-GB"/>
+                <w14:ligatures w14:val="none"/>
+              </w:rPr>
+              <w:t>1.30</w:t>
+            </w:r>
+          </w:p>
+        </w:tc>
+      </w:tr>
+      <w:tr>
+        <w:trPr>
+          <w:trHeight w:val="290"/>
+          <w:jc w:val="center"/>
+        </w:trPr>
+        <w:tc>
+          <w:tcPr>
+            <w:tcW w:w="4260" w:type="dxa"/>
+            <w:noWrap/>
+            <w:hideMark/>
+          </w:tcPr>
+          <w:p>
+            <w:pPr>
+              <w:jc w:val="center"/>
+              <w:rPr>
+                <w:rFonts w:eastAsia="Times New Roman"/>
+                <w:color w:val="000000"/>
+                <w:kern w:val="0"/>
+                <w:sz w:val="22"/>
+                <w:szCs w:val="22"/>
+                <w:lang w:val="en-GB" w:eastAsia="en-GB"/>
+                <w14:ligatures w14:val="none"/>
+              </w:rPr>
+            </w:pPr>
+            <w:r>
+              <w:rPr>
+                <w:rFonts w:eastAsia="Times New Roman"/>
+                <w:color w:val="000000"/>
+                <w:kern w:val="0"/>
+                <w:sz w:val="22"/>
+                <w:szCs w:val="22"/>
+                <w:lang w:val="en-GB" w:eastAsia="en-GB"/>
+                <w14:ligatures w14:val="none"/>
+              </w:rPr>
+              <w:t>Final Sortino Ratio</w:t>
+            </w:r>
+          </w:p>
+        </w:tc>
+        <w:tc>
+          <w:tcPr>
+            <w:tcW w:w="2720" w:type="dxa"/>
+            <w:noWrap/>
+            <w:hideMark/>
+          </w:tcPr>
+          <w:p>
+            <w:pPr>
+              <w:jc w:val="center"/>
+              <w:rPr>
+                <w:rFonts w:eastAsia="Times New Roman"/>
+                <w:color w:val="000000"/>
+                <w:kern w:val="0"/>
+                <w:sz w:val="22"/>
+                <w:szCs w:val="22"/>
+                <w:lang w:val="en-GB" w:eastAsia="en-GB"/>
+                <w14:ligatures w14:val="none"/>
+              </w:rPr>
+            </w:pPr>
+            <w:r>
+              <w:rPr>
+                <w:rFonts w:eastAsia="Times New Roman"/>
+                <w:color w:val="000000"/>
+                <w:kern w:val="0"/>
+                <w:sz w:val="22"/>
+                <w:szCs w:val="22"/>
+                <w:lang w:val="en-GB" w:eastAsia="en-GB"/>
+                <w14:ligatures w14:val="none"/>
+              </w:rPr>
+              <w:t>2.12</w:t>
+            </w:r>
+          </w:p>
+        </w:tc>
+      </w:tr>
+      <w:tr>
+        <w:trPr>
+          <w:trHeight w:val="290"/>
+          <w:jc w:val="center"/>
+        </w:trPr>
+        <w:tc>
+          <w:tcPr>
+            <w:tcW w:w="4260" w:type="dxa"/>
+            <w:noWrap/>
+            <w:hideMark/>
+          </w:tcPr>
+          <w:p>
+            <w:pPr>
+              <w:jc w:val="center"/>
+              <w:rPr>
+                <w:rFonts w:eastAsia="Times New Roman"/>
+                <w:color w:val="000000"/>
+                <w:kern w:val="0"/>
+                <w:sz w:val="22"/>
+                <w:szCs w:val="22"/>
+                <w:lang w:val="en-GB" w:eastAsia="en-GB"/>
+                <w14:ligatures w14:val="none"/>
+              </w:rPr>
+            </w:pPr>
+            <w:r>
+              <w:rPr>
+                <w:rFonts w:eastAsia="Times New Roman"/>
+                <w:color w:val="000000"/>
+                <w:kern w:val="0"/>
+                <w:sz w:val="22"/>
+                <w:szCs w:val="22"/>
+                <w:lang w:val="en-GB" w:eastAsia="en-GB"/>
+                <w14:ligatures w14:val="none"/>
+              </w:rPr>
+              <w:t>Historical CVaR 95% (%)</w:t>
+            </w:r>
+          </w:p>
+        </w:tc>
+        <w:tc>
+          <w:tcPr>
+            <w:tcW w:w="2720" w:type="dxa"/>
+            <w:noWrap/>
+            <w:hideMark/>
+          </w:tcPr>
+          <w:p>
+            <w:pPr>
+              <w:jc w:val="center"/>
+              <w:rPr>
+                <w:rFonts w:eastAsia="Times New Roman"/>
+                <w:color w:val="000000"/>
+                <w:kern w:val="0"/>
+                <w:sz w:val="22"/>
+                <w:szCs w:val="22"/>
+                <w:lang w:val="en-GB" w:eastAsia="en-GB"/>
+                <w14:ligatures w14:val="none"/>
+              </w:rPr>
+            </w:pPr>
+            <w:r>
+              <w:rPr>
+                <w:rFonts w:eastAsia="Times New Roman"/>
+                <w:color w:val="000000"/>
+                <w:kern w:val="0"/>
+                <w:sz w:val="22"/>
+                <w:szCs w:val="22"/>
+                <w:lang w:val="en-GB" w:eastAsia="en-GB"/>
+                <w14:ligatures w14:val="none"/>
+              </w:rPr>
+              <w:t>11.06</w:t>
+            </w:r>
+          </w:p>
+        </w:tc>
+      </w:tr>
+      <w:tr>
+        <w:trPr>
+          <w:trHeight w:val="290"/>
+          <w:jc w:val="center"/>
+        </w:trPr>
+        <w:tc>
+          <w:tcPr>
+            <w:tcW w:w="4260" w:type="dxa"/>
+            <w:noWrap/>
+            <w:hideMark/>
+          </w:tcPr>
+          <w:p>
+            <w:pPr>
+              <w:jc w:val="center"/>
+              <w:rPr>
+                <w:rFonts w:eastAsia="Times New Roman"/>
+                <w:color w:val="000000"/>
+                <w:kern w:val="0"/>
+                <w:sz w:val="22"/>
+                <w:szCs w:val="22"/>
+                <w:lang w:val="en-GB" w:eastAsia="en-GB"/>
+                <w14:ligatures w14:val="none"/>
+              </w:rPr>
+            </w:pPr>
+            <w:r>
+              <w:rPr>
+                <w:rFonts w:eastAsia="Times New Roman"/>
+                <w:color w:val="000000"/>
+                <w:kern w:val="0"/>
+                <w:sz w:val="22"/>
+                <w:szCs w:val="22"/>
+                <w:lang w:val="en-GB" w:eastAsia="en-GB"/>
+                <w14:ligatures w14:val="none"/>
+              </w:rPr>
+              <w:t>Latest Beta</w:t>
+            </w:r>
+          </w:p>
+        </w:tc>
+        <w:tc>
+          <w:tcPr>
+            <w:tcW w:w="2720" w:type="dxa"/>
+            <w:noWrap/>
+            <w:hideMark/>
+          </w:tcPr>
+          <w:p>
+            <w:pPr>
+              <w:jc w:val="center"/>
+              <w:rPr>
+                <w:rFonts w:eastAsia="Times New Roman"/>
+                <w:color w:val="000000"/>
+                <w:kern w:val="0"/>
+                <w:sz w:val="22"/>
+                <w:szCs w:val="22"/>
+                <w:lang w:val="en-GB" w:eastAsia="en-GB"/>
+                <w14:ligatures w14:val="none"/>
+              </w:rPr>
+            </w:pPr>
+            <w:r>
+              <w:rPr>
+                <w:rFonts w:eastAsia="Times New Roman"/>
+                <w:color w:val="000000"/>
+                <w:kern w:val="0"/>
+                <w:sz w:val="22"/>
+                <w:szCs w:val="22"/>
+                <w:lang w:val="en-GB" w:eastAsia="en-GB"/>
+                <w14:ligatures w14:val="none"/>
+              </w:rPr>
+              <w:t>0.33</w:t>
+            </w:r>
+          </w:p>
+        </w:tc>
+      </w:tr>
+      <w:tr>
+        <w:trPr>
+          <w:trHeight w:val="290"/>
+          <w:jc w:val="center"/>
+        </w:trPr>
+        <w:tc>
+          <w:tcPr>
+            <w:tcW w:w="4260" w:type="dxa"/>
+            <w:noWrap/>
+            <w:hideMark/>
+          </w:tcPr>
+          <w:p>
+            <w:pPr>
+              <w:jc w:val="center"/>
+              <w:rPr>
+                <w:rFonts w:eastAsia="Times New Roman"/>
+                <w:color w:val="000000"/>
+                <w:kern w:val="0"/>
+                <w:sz w:val="22"/>
+                <w:szCs w:val="22"/>
+                <w:lang w:val="en-GB" w:eastAsia="en-GB"/>
+                <w14:ligatures w14:val="none"/>
+              </w:rPr>
+            </w:pPr>
+            <w:r>
+              <w:rPr>
+                <w:rFonts w:eastAsia="Times New Roman"/>
+                <w:color w:val="000000"/>
+                <w:kern w:val="0"/>
+                <w:sz w:val="22"/>
+                <w:szCs w:val="22"/>
+                <w:lang w:val="en-GB" w:eastAsia="en-GB"/>
+                <w14:ligatures w14:val="none"/>
+              </w:rPr>
+              <w:t>Latest Annualized Alpha (%)</w:t>
+            </w:r>
+          </w:p>
+        </w:tc>
+        <w:tc>
+          <w:tcPr>
+            <w:tcW w:w="2720" w:type="dxa"/>
+            <w:noWrap/>
+            <w:hideMark/>
+          </w:tcPr>
+          <w:p>
+            <w:pPr>
+              <w:jc w:val="center"/>
+              <w:rPr>
+                <w:rFonts w:eastAsia="Times New Roman"/>
+                <w:color w:val="000000"/>
+                <w:kern w:val="0"/>
+                <w:sz w:val="22"/>
+                <w:szCs w:val="22"/>
+                <w:lang w:val="en-GB" w:eastAsia="en-GB"/>
+                <w14:ligatures w14:val="none"/>
+              </w:rPr>
+            </w:pPr>
+            <w:r>
+              <w:rPr>
+                <w:rFonts w:eastAsia="Times New Roman"/>
+                <w:color w:val="000000"/>
+                <w:kern w:val="0"/>
+                <w:sz w:val="22"/>
+                <w:szCs w:val="22"/>
+                <w:lang w:val="en-GB" w:eastAsia="en-GB"/>
+                <w14:ligatures w14:val="none"/>
+              </w:rPr>
+              <w:t>23.29</w:t>
+            </w:r>
+          </w:p>
+        </w:tc>
+      </w:tr>
+      <w:tr>
+        <w:trPr>
+          <w:trHeight w:val="290"/>
+          <w:jc w:val="center"/>
+        </w:trPr>
+        <w:tc>
+          <w:tcPr>
+            <w:tcW w:w="4260" w:type="dxa"/>
+            <w:noWrap/>
+            <w:hideMark/>
+          </w:tcPr>
+          <w:p>
+            <w:pPr>
+              <w:jc w:val="center"/>
+              <w:rPr>
+                <w:rFonts w:eastAsia="Times New Roman"/>
+                <w:color w:val="000000"/>
+                <w:kern w:val="0"/>
+                <w:sz w:val="22"/>
+                <w:szCs w:val="22"/>
+                <w:lang w:val="en-GB" w:eastAsia="en-GB"/>
+                <w14:ligatures w14:val="none"/>
+              </w:rPr>
+            </w:pPr>
+            <w:r>
+              <w:rPr>
+                <w:rFonts w:eastAsia="Times New Roman"/>
+                <w:color w:val="000000"/>
+                <w:kern w:val="0"/>
+                <w:sz w:val="22"/>
+                <w:szCs w:val="22"/>
+                <w:lang w:val="en-GB" w:eastAsia="en-GB"/>
+                <w14:ligatures w14:val="none"/>
+              </w:rPr>
+              <w:t>Final Skewness</w:t>
+            </w:r>
+          </w:p>
+        </w:tc>
+        <w:tc>
+          <w:tcPr>
+            <w:tcW w:w="2720" w:type="dxa"/>
+            <w:noWrap/>
+            <w:hideMark/>
+          </w:tcPr>
+          <w:p>
+            <w:pPr>
+              <w:jc w:val="center"/>
+              <w:rPr>
+                <w:rFonts w:eastAsia="Times New Roman"/>
+                <w:color w:val="000000"/>
+                <w:kern w:val="0"/>
+                <w:sz w:val="22"/>
+                <w:szCs w:val="22"/>
+                <w:lang w:val="en-GB" w:eastAsia="en-GB"/>
+                <w14:ligatures w14:val="none"/>
+              </w:rPr>
+            </w:pPr>
+            <w:r>
+              <w:rPr>
+                <w:rFonts w:eastAsia="Times New Roman"/>
+                <w:color w:val="000000"/>
+                <w:kern w:val="0"/>
+                <w:sz w:val="22"/>
+                <w:szCs w:val="22"/>
+                <w:lang w:val="en-GB" w:eastAsia="en-GB"/>
+                <w14:ligatures w14:val="none"/>
+              </w:rPr>
+              <w:t>-0.44</w:t>
+            </w:r>
+          </w:p>
+        </w:tc>
+      </w:tr>
+      <w:tr>
+        <w:trPr>
+          <w:trHeight w:val="290"/>
+          <w:jc w:val="center"/>
+        </w:trPr>
+        <w:tc>
+          <w:tcPr>
+            <w:tcW w:w="4260" w:type="dxa"/>
+            <w:noWrap/>
+            <w:hideMark/>
+          </w:tcPr>
+          <w:p>
+            <w:pPr>
+              <w:jc w:val="center"/>
+              <w:rPr>
+                <w:rFonts w:eastAsia="Times New Roman"/>
+                <w:color w:val="000000"/>
+                <w:kern w:val="0"/>
+                <w:sz w:val="22"/>
+                <w:szCs w:val="22"/>
+                <w:lang w:val="en-GB" w:eastAsia="en-GB"/>
+                <w14:ligatures w14:val="none"/>
+              </w:rPr>
+            </w:pPr>
+            <w:r>
+              <w:rPr>
+                <w:rFonts w:eastAsia="Times New Roman"/>
+                <w:color w:val="000000"/>
+                <w:kern w:val="0"/>
+                <w:sz w:val="22"/>
+                <w:szCs w:val="22"/>
+                <w:lang w:val="en-GB" w:eastAsia="en-GB"/>
+                <w14:ligatures w14:val="none"/>
+              </w:rPr>
+              <w:t>Final Kurtosis</w:t>
+            </w:r>
+          </w:p>
+        </w:tc>
+        <w:tc>
+          <w:tcPr>
+            <w:tcW w:w="2720" w:type="dxa"/>
+            <w:noWrap/>
+            <w:hideMark/>
+          </w:tcPr>
+          <w:p>
+            <w:pPr>
+              <w:jc w:val="center"/>
+              <w:rPr>
+                <w:rFonts w:eastAsia="Times New Roman"/>
+                <w:color w:val="000000"/>
+                <w:kern w:val="0"/>
+                <w:sz w:val="22"/>
+                <w:szCs w:val="22"/>
+                <w:lang w:val="en-GB" w:eastAsia="en-GB"/>
+                <w14:ligatures w14:val="none"/>
+              </w:rPr>
+            </w:pPr>
+            <w:r>
+              <w:rPr>
+                <w:rFonts w:eastAsia="Times New Roman"/>
+                <w:color w:val="000000"/>
+                <w:kern w:val="0"/>
+                <w:sz w:val="22"/>
+                <w:szCs w:val="22"/>
+                <w:lang w:val="en-GB" w:eastAsia="en-GB"/>
+                <w14:ligatures w14:val="none"/>
+              </w:rPr>
+              <w:t>3.04</w:t>
+            </w:r>
+          </w:p>
+        </w:tc>
+      </w:tr>
+    </w:tbl>
+    <w:p/>
+    <w:p>
+      <w:r>
+        <w:t xml:space="preserve">With data sets from 77 months, and hence, 65 rolling periods, the cumulative net return of the portfolio is 371.08%. It is important to note that due to </w:t>
+      </w:r>
+      <w:r>
+        <w:t xml:space="preserve">some assets not having a live market capitalization value when data was extracted using the YFINANCE Python module, a fallback market capitalization was used. This resulted in the cumulative net return varying by </w:t>
+      </w:r>
+      <w:r>
+        <w:t>±1% while running the code.</w:t>
+      </w:r>
+    </w:p>
+    <w:p/>
+    <w:p/>
+    <w:p/>
+    <w:p/>
+    <w:p>
+      <w:pPr>
+        <w:rPr>
+          <w:rFonts w:eastAsiaTheme="minorEastAsia"/>
+        </w:rPr>
+      </w:pPr>
+    </w:p>
+    <w:p>
+      <w:pPr>
+        <w:rPr>
+          <w:rFonts w:eastAsiaTheme="minorEastAsia"/>
+        </w:rPr>
+      </w:pPr>
+      <w:r>
+        <w:rPr>
+          <w:rFonts w:eastAsiaTheme="minorEastAsia"/>
+        </w:rPr>
+        <w:br w:type="page"/>
+      </w:r>
+    </w:p>
+    <w:p>
+      <w:pPr>
+        <w:pStyle w:val="Heading2"/>
+        <w:rPr>
+          <w:rFonts w:ascii="Calibri" w:eastAsiaTheme="minorEastAsia" w:hAnsi="Calibri" w:cs="Calibri"/>
+        </w:rPr>
+      </w:pPr>
+      <w:r>
+        <w:rPr>
+          <w:rFonts w:ascii="Calibri" w:eastAsiaTheme="minorEastAsia" w:hAnsi="Calibri" w:cs="Calibri"/>
+        </w:rPr>
+        <w:lastRenderedPageBreak/>
+        <w:t>References</w:t>
+      </w:r>
+    </w:p>
+    <w:p>
+      <w:r>
+        <w:t>[1] North Atlantic Treaty Organization, “</w:t>
+      </w:r>
+      <w:r>
+        <w:t>Defense</w:t>
+      </w:r>
+      <w:r>
+        <w:t xml:space="preserve"> investment and NATO’s 5% commitment,” </w:t>
+      </w:r>
+      <w:r>
+        <w:rPr>
+          <w:i/>
+          <w:iCs/>
+        </w:rPr>
+        <w:t>NATO</w:t>
+      </w:r>
+      <w:r>
+        <w:t xml:space="preserve">, Jun. 29, 2026. [Online]. Available: </w:t>
+      </w:r>
+      <w:hyperlink r:id="rId5" w:history="1">
+        <w:r>
+          <w:rPr>
+            <w:rStyle w:val="Hyperlink"/>
+          </w:rPr>
+          <w:t>https://www.nato.int/en/what-we-do/introduction-to-nato/defence-expenditures-and-natos-5-commitment</w:t>
+        </w:r>
+      </w:hyperlink>
+      <w:r>
+        <w:t>. [Accessed: Aug. 27, 2026].</w:t>
+      </w:r>
+    </w:p>
+    <w:p>
+      <w:r>
+        <w:t xml:space="preserve">[2] Statista, “Countries with the highest military spending worldwide,” </w:t>
+      </w:r>
+      <w:r>
+        <w:rPr>
+          <w:i/>
+          <w:iCs/>
+        </w:rPr>
+        <w:t>Statista</w:t>
+      </w:r>
+      <w:r>
+        <w:t xml:space="preserve">. [Online]. Available: </w:t>
+      </w:r>
+      <w:hyperlink r:id="rId6" w:history="1">
+        <w:r>
+          <w:rPr>
+            <w:rStyle w:val="Hyperlink"/>
+          </w:rPr>
+          <w:t>https://www.statista.com/statistics/262742/countries-with-the-highest-military-spending/</w:t>
+        </w:r>
+      </w:hyperlink>
+      <w:r>
+        <w:t>. [Accessed: Aug. 27, 2026].</w:t>
+      </w:r>
+    </w:p>
+    <w:p>
+      <w:r>
+        <w:t xml:space="preserve">[3] T. M. Idzorek, “A step-by-step guide to the Black-Litterman model: Incorporating user-specified confidence levels,” Zephyr Associates, Inc., Jul. 20, 2004. [Online]. Available: </w:t>
+      </w:r>
+      <w:hyperlink r:id="rId7" w:history="1">
+        <w:r>
+          <w:rPr>
+            <w:rStyle w:val="Hyperlink"/>
+          </w:rPr>
+          <w:t>https://people.duke.edu/~charvey/Teaching/BA453_2006/Idzorek_onBL.pdf</w:t>
+        </w:r>
+      </w:hyperlink>
+      <w:r>
+        <w:t>. [Accessed: Aug. 27, 2026].</w:t>
+      </w:r>
+    </w:p>
+    <w:p>
+      <w:r>
+        <w:t xml:space="preserve">[4] Board of Governors of the Federal Reserve System (US), “Market yield on U.S. Treasury securities at 3-month constant maturity, quoted on an investment basis [DGS3MO],” </w:t>
+      </w:r>
+      <w:r>
+        <w:rPr>
+          <w:i/>
+          <w:iCs/>
+        </w:rPr>
+        <w:t>FRED, Federal Reserve Bank of St. Louis</w:t>
+      </w:r>
+      <w:r>
+        <w:t xml:space="preserve">. [Online]. Available: </w:t>
+      </w:r>
+      <w:hyperlink r:id="rId8" w:history="1">
+        <w:r>
+          <w:rPr>
+            <w:rStyle w:val="Hyperlink"/>
+          </w:rPr>
+          <w:t>https://fred.stlouisfed.org/series/DGS3MO</w:t>
+        </w:r>
+      </w:hyperlink>
+      <w:r>
+        <w:t>. [Accessed: Aug. 27, 2026].</w:t>
+      </w:r>
+    </w:p>
+    <w:p>
+      <w:r>
+        <w:t xml:space="preserve">[5] M. Zahn, “Microsoft is laying off 4,800 workers: ‘AI is changing how work gets done,’” </w:t>
+      </w:r>
+      <w:r>
+        <w:rPr>
+          <w:i/>
+          <w:iCs/>
+        </w:rPr>
+        <w:t>ABC News</w:t>
+      </w:r>
+      <w:r>
+        <w:t xml:space="preserve">, Jul. 6, 2026. [Online]. Available: </w:t>
+      </w:r>
+      <w:hyperlink r:id="rId9" w:history="1">
+        <w:r>
+          <w:rPr>
+            <w:rStyle w:val="Hyperlink"/>
+          </w:rPr>
+          <w:t>https://abcnews.com/Business/microsoft-laying-off-4800-workers-ai-changing-work/story?id=134518435</w:t>
+        </w:r>
+      </w:hyperlink>
+      <w:r>
+        <w:t>. [Accessed: Aug. 27, 2026].</w:t>
+      </w:r>
+    </w:p>
+    <w:p/>
+    <w:p/>
+    <w:p/>
+    <w:p/>
+    <w:p>
+      <w:r>
+        <w:br w:type="page"/>
+      </w:r>
+    </w:p>
+    <w:p>
+      <w:pPr>
+        <w:pStyle w:val="Heading2"/>
+        <w:rPr>
+          <w:rFonts w:ascii="Calibri" w:hAnsi="Calibri" w:cs="Calibri"/>
+        </w:rPr>
+      </w:pPr>
+      <w:r>
+        <w:rPr>
+          <w:rFonts w:ascii="Calibri" w:hAnsi="Calibri" w:cs="Calibri"/>
+        </w:rPr>
+        <w:lastRenderedPageBreak/>
+        <w:t>Appendix</w:t>
+      </w:r>
+    </w:p>
+    <w:p/>
     <w:p>
       <w:pPr>
         <w:rPr>
@@ -2311,7 +3657,7 @@
 </file>
 
 <file path=word/numbering.xml><?xml version="1.0" encoding="utf-8"?>
-<w:numbering xmlns:wpc="http://schemas.microsoft.com/office/word/2010/wordprocessingCanvas" xmlns:cx="http://schemas.microsoft.com/office/drawing/2014/chartex" xmlns:cx1="http://schemas.microsoft.com/office/drawing/2015/9/8/chartex" xmlns:cx2="http://schemas.microsoft.com/office/drawing/2015/10/21/chartex" xmlns:cx3="http://schemas.microsoft.com/office/drawing/2016/5/9/chartex" xmlns:cx4="http://schemas.microsoft.com/office/drawing/2016/5/10/chartex" xmlns:cx5="http://schemas.microsoft.com/office/drawing/2016/5/11/chartex" xmlns:cx6="http://schemas.microsoft.com/office/drawing/2016/5/12/chartex" xmlns:cx7="http://schemas.microsoft.com/office/drawing/2016/5/13/chartex" xmlns:cx8="http://schemas.microsoft.com/office/drawing/2016/5/14/chartex" xmlns:mc="http://schemas.openxmlformats.org/markup-compatibility/2006" xmlns:aink="http://schemas.microsoft.com/office/drawing/2016/ink" xmlns:am3d="http://schemas.microsoft.com/office/drawing/2017/model3d" xmlns:o="urn:schemas-microsoft-com:office:office" xmlns:oel="http://schemas.microsoft.com/office/2019/extlst" xmlns:r="http://schemas.openxmlformats.org/officeDocument/2006/relationships" xmlns:m="http://schemas.openxmlformats.org/officeDocument/2006/math" xmlns:v="urn:schemas-microsoft-com:vml" xmlns:wp14="http://schemas.microsoft.com/office/word/2010/wordprocessingDrawing" xmlns:wp="http://schemas.openxmlformats.org/drawingml/2006/wordprocessingDrawing" xmlns:w10="urn:schemas-microsoft-com:office:word" xmlns:w="http://schemas.openxmlformats.org/wordprocessingml/2006/main" xmlns:w14="http://schemas.microsoft.com/office/word/2010/wordml" xmlns:w15="http://schemas.microsoft.com/office/word/2012/wordml" xmlns:w16cei="http://schemas.microsoft.com/office/word/2026/wordml/cei" xmlns:w16cex="http://schemas.microsoft.com/office/word/2018/wordml/cex" xmlns:w16cid="http://schemas.microsoft.com/office/word/2016/wordml/cid" xmlns:w16="http://schemas.microsoft.com/office/word/2018/wordml" xmlns:w16du="http://schemas.microsoft.com/office/word/2023/wordml/word16du" xmlns:w16sdtdh="http://schemas.microsoft.com/office/word/2020/wordml/sdtdatahash" xmlns:w16sdtfl="http://schemas.microsoft.com/office/word/2024/wordml/sdtformatlock" xmlns:w16se="http://schemas.microsoft.com/office/word/2015/wordml/symex" xmlns:wpg="http://schemas.microsoft.com/office/word/2010/wordprocessingGroup" xmlns:wpi="http://schemas.microsoft.com/office/word/2010/wordprocessingInk" xmlns:wne="http://schemas.microsoft.com/office/word/2006/wordml" xmlns:wps="http://schemas.microsoft.com/office/word/2010/wordprocessingShape" mc:Ignorable="w14 w15 w16se w16cid w16 w16cex w16sdtdh w16sdtfl w16du wp14">
+<w:numbering xmlns:wpc="http://schemas.microsoft.com/office/word/2010/wordprocessingCanvas" xmlns:cx="http://schemas.microsoft.com/office/drawing/2014/chartex" xmlns:cx1="http://schemas.microsoft.com/office/drawing/2015/9/8/chartex" xmlns:cx2="http://schemas.microsoft.com/office/drawing/2015/10/21/chartex" xmlns:cx3="http://schemas.microsoft.com/office/drawing/2016/5/9/chartex" xmlns:cx4="http://schemas.microsoft.com/office/drawing/2016/5/10/chartex" xmlns:cx5="http://schemas.microsoft.com/office/drawing/2016/5/11/chartex" xmlns:cx6="http://schemas.microsoft.com/office/drawing/2016/5/12/chartex" xmlns:cx7="http://schemas.microsoft.com/office/drawing/2016/5/13/chartex" xmlns:cx8="http://schemas.microsoft.com/office/drawing/2016/5/14/chartex" xmlns:mc="http://schemas.openxmlformats.org/markup-compatibility/2006" xmlns:aink="http://schemas.microsoft.com/office/drawing/2016/ink" xmlns:am3d="http://schemas.microsoft.com/office/drawing/2017/model3d" xmlns:o="urn:schemas-microsoft-com:office:office" xmlns:oel="http://schemas.microsoft.com/office/2019/extlst" xmlns:r="http://schemas.openxmlformats.org/officeDocument/2006/relationships" xmlns:m="http://schemas.openxmlformats.org/officeDocument/2006/math" xmlns:v="urn:schemas-microsoft-com:vml" xmlns:wp14="http://schemas.microsoft.com/office/word/2010/wordprocessingDrawing" xmlns:wp="http://schemas.openxmlformats.org/drawingml/2006/wordprocessingDrawing" xmlns:w10="urn:schemas-microsoft-com:office:word" xmlns:w="http://schemas.openxmlformats.org/wordprocessingml/2006/main" xmlns:w14="http://schemas.microsoft.com/office/word/2010/wordml" xmlns:w15="http://schemas.microsoft.com/office/word/2012/wordml" xmlns:w16cex="http://schemas.microsoft.com/office/word/2018/wordml/cex" xmlns:w16cid="http://schemas.microsoft.com/office/word/2016/wordml/cid" xmlns:w16="http://schemas.microsoft.com/office/word/2018/wordml" xmlns:w16du="http://schemas.microsoft.com/office/word/2023/wordml/word16du" xmlns:w16sdtdh="http://schemas.microsoft.com/office/word/2020/wordml/sdtdatahash" xmlns:w16sdtfl="http://schemas.microsoft.com/office/word/2024/wordml/sdtformatlock" xmlns:w16se="http://schemas.microsoft.com/office/word/2015/wordml/symex" xmlns:wpg="http://schemas.microsoft.com/office/word/2010/wordprocessingGroup" xmlns:wpi="http://schemas.microsoft.com/office/word/2010/wordprocessingInk" xmlns:wne="http://schemas.microsoft.com/office/word/2006/wordml" xmlns:wps="http://schemas.microsoft.com/office/word/2010/wordprocessingShape" mc:Ignorable="w14 w15 w16se w16cid w16 w16cex w16sdtdh w16sdtfl w16du wp14">
   <w:abstractNum w:abstractNumId="0" w15:restartNumberingAfterBreak="0">
     <w:nsid w:val="361919DA"/>
     <w:multiLevelType w:val="hybridMultilevel"/>
@@ -2830,6 +4176,9 @@
   <w:style w:type="paragraph" w:default="1" w:styleId="Normal">
     <w:name w:val="Normal"/>
     <w:qFormat/>
+    <w:rPr>
+      <w:lang w:val="en-US"/>
+    </w:rPr>
   </w:style>
   <w:style w:type="paragraph" w:styleId="Heading1">
     <w:name w:val="heading 1"/>
@@ -3032,7 +4381,6 @@
   <w:style w:type="character" w:default="1" w:styleId="DefaultParagraphFont">
     <w:name w:val="Default Paragraph Font"/>
     <w:uiPriority w:val="1"/>
-    <w:semiHidden/>
     <w:unhideWhenUsed/>
   </w:style>
   <w:style w:type="table" w:default="1" w:styleId="TableNormal">

</xml_diff>

<commit_message>
modified:   main/Multi-Asset Risk Dashboard & Portfolio.docx 	modified:   output/BLO_risk_dashboard.xlsx 	new file:   output/investo_portfolio_simulator.xlsx
</commit_message>
<xml_diff>
--- a/main/Multi-Asset Risk Dashboard & Portfolio.docx
+++ b/main/Multi-Asset Risk Dashboard & Portfolio.docx
@@ -2595,6 +2595,14 @@
       </w:r>
     </w:p>
     <w:p>
+      <w:pPr>
+        <w:pStyle w:val="Heading3"/>
+      </w:pPr>
+      <w:r>
+        <w:t>Summary of Observations</w:t>
+      </w:r>
+    </w:p>
+    <w:p>
       <w:r>
         <w:t xml:space="preserve">Upon running the code on Python, and exporting the data to Excel, the following </w:t>
       </w:r>
@@ -3423,12 +3431,2338 @@
         <w:t xml:space="preserve">With data sets from 77 months, and hence, 65 rolling periods, the cumulative net return of the portfolio is 371.08%. It is important to note that due to </w:t>
       </w:r>
       <w:r>
-        <w:t xml:space="preserve">some assets not having a live market capitalization value when data was extracted using the YFINANCE Python module, a fallback market capitalization was used. This resulted in the cumulative net return varying by </w:t>
+        <w:t xml:space="preserve">some assets not having a live market capitalization value </w:t>
+      </w:r>
+      <w:r>
+        <w:t>while extracting the data</w:t>
+      </w:r>
+      <w:r>
+        <w:t xml:space="preserve"> using the YFINANCE Python module, a fallback market capitalization was used. This resulted in the cumulative net return varying by </w:t>
       </w:r>
       <w:r>
         <w:t>±1% while running the code.</w:t>
       </w:r>
-    </w:p>
+      <w:r>
+        <w:t xml:space="preserve"> 65 rolling periods equate to ~5.417 years, which results in an annualized return of 33.13%. Upon verification:</w:t>
+      </w:r>
+    </w:p>
+    <w:p>
+      <w:pPr>
+        <w:rPr>
+          <w:rFonts w:eastAsiaTheme="minorEastAsia"/>
+        </w:rPr>
+      </w:pPr>
+      <m:oMathPara>
+        <m:oMath>
+          <m:sSup>
+            <m:sSupPr>
+              <m:ctrlPr>
+                <w:rPr>
+                  <w:rFonts w:ascii="Cambria Math" w:hAnsi="Cambria Math"/>
+                  <w:i/>
+                </w:rPr>
+              </m:ctrlPr>
+            </m:sSupPr>
+            <m:e>
+              <m:d>
+                <m:dPr>
+                  <m:ctrlPr>
+                    <w:rPr>
+                      <w:rFonts w:ascii="Cambria Math" w:hAnsi="Cambria Math"/>
+                      <w:i/>
+                    </w:rPr>
+                  </m:ctrlPr>
+                </m:dPr>
+                <m:e>
+                  <m:r>
+                    <w:rPr>
+                      <w:rFonts w:ascii="Cambria Math" w:hAnsi="Cambria Math"/>
+                    </w:rPr>
+                    <m:t>1+0.3313</m:t>
+                  </m:r>
+                </m:e>
+              </m:d>
+            </m:e>
+            <m:sup>
+              <m:r>
+                <w:rPr>
+                  <w:rFonts w:ascii="Cambria Math" w:hAnsi="Cambria Math"/>
+                </w:rPr>
+                <m:t>5.417</m:t>
+              </m:r>
+            </m:sup>
+          </m:sSup>
+          <m:r>
+            <w:rPr>
+              <w:rFonts w:ascii="Cambria Math" w:hAnsi="Cambria Math"/>
+            </w:rPr>
+            <m:t xml:space="preserve">-1=371.19% </m:t>
+          </m:r>
+        </m:oMath>
+      </m:oMathPara>
+    </w:p>
+    <w:p>
+      <w:pPr>
+        <w:rPr>
+          <w:rFonts w:eastAsiaTheme="minorEastAsia"/>
+        </w:rPr>
+      </w:pPr>
+      <w:r>
+        <w:rPr>
+          <w:rFonts w:eastAsiaTheme="minorEastAsia"/>
+        </w:rPr>
+        <w:lastRenderedPageBreak/>
+        <w:t xml:space="preserve">With an error of +0.11% (owing to </w:t>
+      </w:r>
+      <w:r>
+        <w:rPr>
+          <w:rFonts w:eastAsiaTheme="minorEastAsia"/>
+        </w:rPr>
+        <w:t xml:space="preserve">limited decimal places), we can say that the annualized return </w:t>
+      </w:r>
+      <w:r>
+        <w:rPr>
+          <w:rFonts w:eastAsiaTheme="minorEastAsia"/>
+        </w:rPr>
+        <w:t>equates</w:t>
+      </w:r>
+      <w:r>
+        <w:rPr>
+          <w:rFonts w:eastAsiaTheme="minorEastAsia"/>
+        </w:rPr>
+        <w:t xml:space="preserve"> </w:t>
+      </w:r>
+      <w:r>
+        <w:rPr>
+          <w:rFonts w:eastAsiaTheme="minorEastAsia"/>
+        </w:rPr>
+        <w:t>(with a 99.97% accuracy) to the final cumulative net return of the portfolio.</w:t>
+      </w:r>
+    </w:p>
+    <w:p>
+      <w:pPr>
+        <w:rPr>
+          <w:rFonts w:eastAsiaTheme="minorEastAsia"/>
+        </w:rPr>
+      </w:pPr>
+      <w:r>
+        <w:rPr>
+          <w:rFonts w:eastAsiaTheme="minorEastAsia"/>
+        </w:rPr>
+        <w:t xml:space="preserve">The </w:t>
+      </w:r>
+      <w:r>
+        <w:rPr>
+          <w:rFonts w:eastAsiaTheme="minorEastAsia"/>
+        </w:rPr>
+        <w:t>full-period final annualized volatility was calculated to be 21.83%, which indicates a</w:t>
+      </w:r>
+      <w:r>
+        <w:rPr>
+          <w:rFonts w:eastAsiaTheme="minorEastAsia"/>
+        </w:rPr>
+        <w:t xml:space="preserve"> moderately </w:t>
+      </w:r>
+      <w:r>
+        <w:rPr>
+          <w:rFonts w:eastAsiaTheme="minorEastAsia"/>
+        </w:rPr>
+        <w:t>aggressive portfolio, in part du</w:t>
+      </w:r>
+      <w:r>
+        <w:rPr>
+          <w:rFonts w:eastAsiaTheme="minorEastAsia"/>
+        </w:rPr>
+        <w:t>e to fluctuations in month-by-month returns for several assets</w:t>
+      </w:r>
+      <w:r>
+        <w:rPr>
+          <w:rFonts w:eastAsiaTheme="minorEastAsia"/>
+        </w:rPr>
+        <w:t>.</w:t>
+      </w:r>
+      <w:r>
+        <w:rPr>
+          <w:rFonts w:eastAsiaTheme="minorEastAsia"/>
+        </w:rPr>
+        <w:t xml:space="preserve"> The volatility can be seen through the wealth curve chart, which </w:t>
+      </w:r>
+      <w:r>
+        <w:rPr>
+          <w:rFonts w:eastAsiaTheme="minorEastAsia"/>
+        </w:rPr>
+        <w:t xml:space="preserve">depicts strong swings on a month-by-month basis. The final period rolling volatility was </w:t>
+      </w:r>
+      <w:r>
+        <w:rPr>
+          <w:rFonts w:eastAsiaTheme="minorEastAsia"/>
+        </w:rPr>
+        <w:t>18.72%.</w:t>
+      </w:r>
+    </w:p>
+    <w:p>
+      <w:pPr>
+        <w:rPr>
+          <w:rFonts w:eastAsiaTheme="minorEastAsia"/>
+        </w:rPr>
+      </w:pPr>
+      <w:r>
+        <w:rPr>
+          <w:rFonts w:eastAsiaTheme="minorEastAsia"/>
+        </w:rPr>
+        <w:t xml:space="preserve">The final Sharpe and Sortino ratios were 1.30 and 2.12, respectively. </w:t>
+      </w:r>
+      <w:r>
+        <w:rPr>
+          <w:rFonts w:eastAsiaTheme="minorEastAsia"/>
+        </w:rPr>
+        <w:t>The former indicates a good return on investment for the risk incurred in the portfolio</w:t>
+      </w:r>
+      <w:r>
+        <w:rPr>
+          <w:rFonts w:eastAsiaTheme="minorEastAsia"/>
+        </w:rPr>
+        <w:t xml:space="preserve"> (normally, the Sharpe ratio should be above 1.0). Likewise, the latter indicates a good return on investment </w:t>
+      </w:r>
+      <w:r>
+        <w:rPr>
+          <w:rFonts w:eastAsiaTheme="minorEastAsia"/>
+        </w:rPr>
+        <w:t>relative to low downside risk</w:t>
+      </w:r>
+      <w:r>
+        <w:rPr>
+          <w:rFonts w:eastAsiaTheme="minorEastAsia"/>
+        </w:rPr>
+        <w:t xml:space="preserve"> (an ideal Sortino ratio should be above 2.0). </w:t>
+      </w:r>
+      <w:r>
+        <w:rPr>
+          <w:rFonts w:eastAsiaTheme="minorEastAsia"/>
+        </w:rPr>
+        <w:t>This puts the portfolio in a positive light, opening an opportunity for investors.</w:t>
+      </w:r>
+    </w:p>
+    <w:p>
+      <w:pPr>
+        <w:rPr>
+          <w:rFonts w:eastAsiaTheme="minorEastAsia"/>
+        </w:rPr>
+      </w:pPr>
+      <w:r>
+        <w:rPr>
+          <w:rFonts w:eastAsiaTheme="minorEastAsia"/>
+        </w:rPr>
+        <w:t xml:space="preserve">The historical CvAR (95%) for the portfolio sits at 11.06%. This indicates that </w:t>
+      </w:r>
+      <w:r>
+        <w:rPr>
+          <w:rFonts w:eastAsiaTheme="minorEastAsia"/>
+        </w:rPr>
+        <w:t>for the worst 5% of trading days, the investor would incur an 11.06% loss. This may seem high from an initial viewpoint, but given the data covers the COVID-19 pandemic, the supply chain woes of 2022-23, and the trade wars between the U</w:t>
+      </w:r>
+      <w:r>
+        <w:rPr>
+          <w:rFonts w:eastAsiaTheme="minorEastAsia"/>
+        </w:rPr>
+        <w:t>nited States and Canada/EU (owing to Trump’s tariffs), such a loss may not seem too damaging, with other countries trying</w:t>
+      </w:r>
+      <w:r>
+        <w:rPr>
+          <w:rFonts w:eastAsiaTheme="minorEastAsia"/>
+        </w:rPr>
+        <w:t xml:space="preserve"> to come to a compromise (or negotiate a better deal to soften blows on the economy).</w:t>
+      </w:r>
+    </w:p>
+    <w:p>
+      <w:pPr>
+        <w:rPr>
+          <w:rFonts w:eastAsiaTheme="minorEastAsia"/>
+        </w:rPr>
+      </w:pPr>
+      <w:r>
+        <w:rPr>
+          <w:rFonts w:eastAsiaTheme="minorEastAsia"/>
+        </w:rPr>
+        <w:t>The latest rolling period beta of the portfolio was 0.33</w:t>
+      </w:r>
+      <w:r>
+        <w:rPr>
+          <w:rFonts w:eastAsiaTheme="minorEastAsia"/>
+        </w:rPr>
+        <w:t xml:space="preserve">, indicating that the </w:t>
+      </w:r>
+      <w:r>
+        <w:rPr>
+          <w:rFonts w:eastAsiaTheme="minorEastAsia"/>
+        </w:rPr>
+        <w:t xml:space="preserve">current sensitivity of the portfolio to the </w:t>
+      </w:r>
+      <w:r>
+        <w:rPr>
+          <w:rFonts w:eastAsiaTheme="minorEastAsia"/>
+        </w:rPr>
+        <w:t>benchmark</w:t>
+      </w:r>
+      <w:r>
+        <w:rPr>
+          <w:rFonts w:eastAsiaTheme="minorEastAsia"/>
+        </w:rPr>
+        <w:t xml:space="preserve"> is </w:t>
+      </w:r>
+      <w:r>
+        <w:rPr>
+          <w:rFonts w:eastAsiaTheme="minorEastAsia"/>
+        </w:rPr>
+        <w:t>low.</w:t>
+      </w:r>
+      <w:r>
+        <w:rPr>
+          <w:rFonts w:eastAsiaTheme="minorEastAsia"/>
+        </w:rPr>
+        <w:t xml:space="preserve"> The latest rolling period annualized alpha of the portfolio was 0.2329, indicating high returns compare</w:t>
+      </w:r>
+      <w:r>
+        <w:rPr>
+          <w:rFonts w:eastAsiaTheme="minorEastAsia"/>
+        </w:rPr>
+        <w:t>d to CAPM predictions despite a low beta.</w:t>
+      </w:r>
+    </w:p>
+    <w:p>
+      <w:pPr>
+        <w:rPr>
+          <w:rFonts w:eastAsiaTheme="minorEastAsia"/>
+        </w:rPr>
+      </w:pPr>
+      <w:r>
+        <w:rPr>
+          <w:rFonts w:eastAsiaTheme="minorEastAsia"/>
+        </w:rPr>
+        <w:t xml:space="preserve">The final (full period) skewness was -0.44, indicating skewness to the left. This </w:t>
+      </w:r>
+      <w:r>
+        <w:rPr>
+          <w:rFonts w:eastAsiaTheme="minorEastAsia"/>
+        </w:rPr>
+        <w:t>indicates</w:t>
+      </w:r>
+      <w:r>
+        <w:rPr>
+          <w:rFonts w:eastAsiaTheme="minorEastAsia"/>
+        </w:rPr>
+        <w:t xml:space="preserve"> that the mean is lower than the median. The final (full period) kurtosis was 3.04, </w:t>
+      </w:r>
+      <w:r>
+        <w:rPr>
+          <w:rFonts w:eastAsiaTheme="minorEastAsia"/>
+        </w:rPr>
+        <w:t xml:space="preserve">indicating that the portfolio </w:t>
+      </w:r>
+      <w:r>
+        <w:rPr>
+          <w:rFonts w:eastAsiaTheme="minorEastAsia"/>
+        </w:rPr>
+        <w:t xml:space="preserve">can be considered as mesokurtic. </w:t>
+      </w:r>
+      <w:r>
+        <w:rPr>
+          <w:rFonts w:eastAsiaTheme="minorEastAsia"/>
+        </w:rPr>
+        <w:t>There aren’t many extreme outliers that skew the portfolio’s results, and tails are generally standard-sized.</w:t>
+      </w:r>
+    </w:p>
+    <w:p>
+      <w:pPr>
+        <w:pStyle w:val="Heading3"/>
+        <w:rPr>
+          <w:rFonts w:eastAsiaTheme="minorEastAsia"/>
+        </w:rPr>
+      </w:pPr>
+      <w:r>
+        <w:rPr>
+          <w:rFonts w:eastAsiaTheme="minorEastAsia"/>
+        </w:rPr>
+        <w:t>Portfolio Weights</w:t>
+      </w:r>
+    </w:p>
+    <w:p>
+      <w:r>
+        <w:t xml:space="preserve">As expected, the portfolio weights fluctuate depending on </w:t>
+      </w:r>
+      <w:r>
+        <w:t xml:space="preserve">the rolling period. The weightage from the latest month of the final rolling period (May 2026) will be considered. The table below depicts the weight of each asset (note that any asset with a weightage below 0.0001 (or </w:t>
+      </w:r>
+      <w:r>
+        <w:t>below 1E-</w:t>
+      </w:r>
+      <w:r>
+        <w:t>4</w:t>
+      </w:r>
+      <w:r>
+        <w:t>) will be assigned a weightage of zero.</w:t>
+      </w:r>
+    </w:p>
+    <w:tbl>
+      <w:tblPr>
+        <w:tblStyle w:val="TableGrid"/>
+        <w:tblW w:w="0" w:type="auto"/>
+        <w:tblLook w:val="04A0" w:firstRow="1" w:lastRow="0" w:firstColumn="1" w:lastColumn="0" w:noHBand="0" w:noVBand="1"/>
+      </w:tblPr>
+      <w:tblGrid>
+        <w:gridCol w:w="1127"/>
+        <w:gridCol w:w="1127"/>
+        <w:gridCol w:w="1127"/>
+        <w:gridCol w:w="1127"/>
+        <w:gridCol w:w="1127"/>
+        <w:gridCol w:w="1127"/>
+        <w:gridCol w:w="1127"/>
+        <w:gridCol w:w="1127"/>
+      </w:tblGrid>
+      <w:tr>
+        <w:tc>
+          <w:tcPr>
+            <w:tcW w:w="1127" w:type="dxa"/>
+          </w:tcPr>
+          <w:p>
+            <w:r>
+              <w:rPr>
+                <w:b/>
+                <w:bCs/>
+                <w:lang w:val="en-GB"/>
+              </w:rPr>
+              <w:t>Asset</w:t>
+            </w:r>
+          </w:p>
+        </w:tc>
+        <w:tc>
+          <w:tcPr>
+            <w:tcW w:w="1127" w:type="dxa"/>
+          </w:tcPr>
+          <w:p>
+            <w:r>
+              <w:rPr>
+                <w:b/>
+                <w:bCs/>
+                <w:lang w:val="en-GB"/>
+              </w:rPr>
+              <w:t>Weight</w:t>
+            </w:r>
+          </w:p>
+        </w:tc>
+        <w:tc>
+          <w:tcPr>
+            <w:tcW w:w="1127" w:type="dxa"/>
+          </w:tcPr>
+          <w:p>
+            <w:r>
+              <w:rPr>
+                <w:b/>
+                <w:bCs/>
+                <w:lang w:val="en-GB"/>
+              </w:rPr>
+              <w:t>Asset</w:t>
+            </w:r>
+          </w:p>
+        </w:tc>
+        <w:tc>
+          <w:tcPr>
+            <w:tcW w:w="1127" w:type="dxa"/>
+          </w:tcPr>
+          <w:p>
+            <w:r>
+              <w:rPr>
+                <w:b/>
+                <w:bCs/>
+                <w:lang w:val="en-GB"/>
+              </w:rPr>
+              <w:t>Weight</w:t>
+            </w:r>
+          </w:p>
+        </w:tc>
+        <w:tc>
+          <w:tcPr>
+            <w:tcW w:w="1127" w:type="dxa"/>
+          </w:tcPr>
+          <w:p>
+            <w:r>
+              <w:rPr>
+                <w:b/>
+                <w:bCs/>
+                <w:lang w:val="en-GB"/>
+              </w:rPr>
+              <w:t>Asset</w:t>
+            </w:r>
+          </w:p>
+        </w:tc>
+        <w:tc>
+          <w:tcPr>
+            <w:tcW w:w="1127" w:type="dxa"/>
+          </w:tcPr>
+          <w:p>
+            <w:r>
+              <w:rPr>
+                <w:b/>
+                <w:bCs/>
+                <w:lang w:val="en-GB"/>
+              </w:rPr>
+              <w:t>Weight</w:t>
+            </w:r>
+          </w:p>
+        </w:tc>
+        <w:tc>
+          <w:tcPr>
+            <w:tcW w:w="1127" w:type="dxa"/>
+          </w:tcPr>
+          <w:p>
+            <w:r>
+              <w:rPr>
+                <w:b/>
+                <w:bCs/>
+                <w:lang w:val="en-GB"/>
+              </w:rPr>
+              <w:t>Asset</w:t>
+            </w:r>
+          </w:p>
+        </w:tc>
+        <w:tc>
+          <w:tcPr>
+            <w:tcW w:w="1127" w:type="dxa"/>
+          </w:tcPr>
+          <w:p>
+            <w:r>
+              <w:rPr>
+                <w:b/>
+                <w:bCs/>
+                <w:lang w:val="en-GB"/>
+              </w:rPr>
+              <w:t>Weight</w:t>
+            </w:r>
+          </w:p>
+        </w:tc>
+      </w:tr>
+      <w:tr>
+        <w:tc>
+          <w:tcPr>
+            <w:tcW w:w="1127" w:type="dxa"/>
+          </w:tcPr>
+          <w:p>
+            <w:r>
+              <w:rPr>
+                <w:lang w:val="en-GB"/>
+              </w:rPr>
+              <w:t>NVDA</w:t>
+            </w:r>
+          </w:p>
+        </w:tc>
+        <w:tc>
+          <w:tcPr>
+            <w:tcW w:w="1127" w:type="dxa"/>
+          </w:tcPr>
+          <w:p>
+            <w:r>
+              <w:rPr>
+                <w:lang w:val="en-GB"/>
+              </w:rPr>
+              <w:t>0.3104</w:t>
+            </w:r>
+          </w:p>
+        </w:tc>
+        <w:tc>
+          <w:tcPr>
+            <w:tcW w:w="1127" w:type="dxa"/>
+          </w:tcPr>
+          <w:p>
+            <w:r>
+              <w:rPr>
+                <w:lang w:val="en-GB"/>
+              </w:rPr>
+              <w:t>CRWD</w:t>
+            </w:r>
+          </w:p>
+        </w:tc>
+        <w:tc>
+          <w:tcPr>
+            <w:tcW w:w="1127" w:type="dxa"/>
+          </w:tcPr>
+          <w:p>
+            <w:r>
+              <w:rPr>
+                <w:lang w:val="en-GB"/>
+              </w:rPr>
+              <w:t>0.0000</w:t>
+            </w:r>
+          </w:p>
+        </w:tc>
+        <w:tc>
+          <w:tcPr>
+            <w:tcW w:w="1127" w:type="dxa"/>
+          </w:tcPr>
+          <w:p>
+            <w:r>
+              <w:rPr>
+                <w:lang w:val="en-GB"/>
+              </w:rPr>
+              <w:t>NOW</w:t>
+            </w:r>
+          </w:p>
+        </w:tc>
+        <w:tc>
+          <w:tcPr>
+            <w:tcW w:w="1127" w:type="dxa"/>
+          </w:tcPr>
+          <w:p>
+            <w:r>
+              <w:rPr>
+                <w:lang w:val="en-GB"/>
+              </w:rPr>
+              <w:t>0.0210</w:t>
+            </w:r>
+          </w:p>
+        </w:tc>
+        <w:tc>
+          <w:tcPr>
+            <w:tcW w:w="1127" w:type="dxa"/>
+          </w:tcPr>
+          <w:p>
+            <w:r>
+              <w:rPr>
+                <w:lang w:val="en-GB"/>
+              </w:rPr>
+              <w:t>NEE</w:t>
+            </w:r>
+          </w:p>
+        </w:tc>
+        <w:tc>
+          <w:tcPr>
+            <w:tcW w:w="1127" w:type="dxa"/>
+          </w:tcPr>
+          <w:p>
+            <w:r>
+              <w:rPr>
+                <w:lang w:val="en-GB"/>
+              </w:rPr>
+              <w:t>0.0109</w:t>
+            </w:r>
+          </w:p>
+        </w:tc>
+      </w:tr>
+      <w:tr>
+        <w:tc>
+          <w:tcPr>
+            <w:tcW w:w="1127" w:type="dxa"/>
+          </w:tcPr>
+          <w:p>
+            <w:r>
+              <w:rPr>
+                <w:lang w:val="en-GB"/>
+              </w:rPr>
+              <w:t>AVGO</w:t>
+            </w:r>
+          </w:p>
+        </w:tc>
+        <w:tc>
+          <w:tcPr>
+            <w:tcW w:w="1127" w:type="dxa"/>
+          </w:tcPr>
+          <w:p>
+            <w:r>
+              <w:rPr>
+                <w:lang w:val="en-GB"/>
+              </w:rPr>
+              <w:t>0.1057</w:t>
+            </w:r>
+          </w:p>
+        </w:tc>
+        <w:tc>
+          <w:tcPr>
+            <w:tcW w:w="1127" w:type="dxa"/>
+          </w:tcPr>
+          <w:p>
+            <w:r>
+              <w:rPr>
+                <w:lang w:val="en-GB"/>
+              </w:rPr>
+              <w:t>TEL</w:t>
+            </w:r>
+          </w:p>
+        </w:tc>
+        <w:tc>
+          <w:tcPr>
+            <w:tcW w:w="1127" w:type="dxa"/>
+          </w:tcPr>
+          <w:p>
+            <w:r>
+              <w:rPr>
+                <w:lang w:val="en-GB"/>
+              </w:rPr>
+              <w:t>0.0614</w:t>
+            </w:r>
+          </w:p>
+        </w:tc>
+        <w:tc>
+          <w:tcPr>
+            <w:tcW w:w="1127" w:type="dxa"/>
+          </w:tcPr>
+          <w:p>
+            <w:r>
+              <w:rPr>
+                <w:lang w:val="en-GB"/>
+              </w:rPr>
+              <w:t>EQIX</w:t>
+            </w:r>
+          </w:p>
+        </w:tc>
+        <w:tc>
+          <w:tcPr>
+            <w:tcW w:w="1127" w:type="dxa"/>
+          </w:tcPr>
+          <w:p>
+            <w:r>
+              <w:rPr>
+                <w:lang w:val="en-GB"/>
+              </w:rPr>
+              <w:t>0.0000</w:t>
+            </w:r>
+          </w:p>
+        </w:tc>
+        <w:tc>
+          <w:tcPr>
+            <w:tcW w:w="1127" w:type="dxa"/>
+          </w:tcPr>
+          <w:p>
+            <w:r>
+              <w:rPr>
+                <w:lang w:val="en-GB"/>
+              </w:rPr>
+              <w:t>SO</w:t>
+            </w:r>
+          </w:p>
+        </w:tc>
+        <w:tc>
+          <w:tcPr>
+            <w:tcW w:w="1127" w:type="dxa"/>
+          </w:tcPr>
+          <w:p>
+            <w:r>
+              <w:rPr>
+                <w:lang w:val="en-GB"/>
+              </w:rPr>
+              <w:t>0.0690</w:t>
+            </w:r>
+          </w:p>
+        </w:tc>
+      </w:tr>
+      <w:tr>
+        <w:tc>
+          <w:tcPr>
+            <w:tcW w:w="1127" w:type="dxa"/>
+          </w:tcPr>
+          <w:p>
+            <w:r>
+              <w:rPr>
+                <w:lang w:val="en-GB"/>
+              </w:rPr>
+              <w:t>MU</w:t>
+            </w:r>
+          </w:p>
+        </w:tc>
+        <w:tc>
+          <w:tcPr>
+            <w:tcW w:w="1127" w:type="dxa"/>
+          </w:tcPr>
+          <w:p>
+            <w:r>
+              <w:rPr>
+                <w:lang w:val="en-GB"/>
+              </w:rPr>
+              <w:t>0.0000</w:t>
+            </w:r>
+          </w:p>
+        </w:tc>
+        <w:tc>
+          <w:tcPr>
+            <w:tcW w:w="1127" w:type="dxa"/>
+          </w:tcPr>
+          <w:p>
+            <w:r>
+              <w:rPr>
+                <w:lang w:val="en-GB"/>
+              </w:rPr>
+              <w:t>CDNS</w:t>
+            </w:r>
+          </w:p>
+        </w:tc>
+        <w:tc>
+          <w:tcPr>
+            <w:tcW w:w="1127" w:type="dxa"/>
+          </w:tcPr>
+          <w:p>
+            <w:r>
+              <w:rPr>
+                <w:lang w:val="en-GB"/>
+              </w:rPr>
+              <w:t>0.0000</w:t>
+            </w:r>
+          </w:p>
+        </w:tc>
+        <w:tc>
+          <w:tcPr>
+            <w:tcW w:w="1127" w:type="dxa"/>
+          </w:tcPr>
+          <w:p>
+            <w:r>
+              <w:rPr>
+                <w:lang w:val="en-GB"/>
+              </w:rPr>
+              <w:t>DLR</w:t>
+            </w:r>
+          </w:p>
+        </w:tc>
+        <w:tc>
+          <w:tcPr>
+            <w:tcW w:w="1127" w:type="dxa"/>
+          </w:tcPr>
+          <w:p>
+            <w:r>
+              <w:rPr>
+                <w:lang w:val="en-GB"/>
+              </w:rPr>
+              <w:t>0.0142</w:t>
+            </w:r>
+          </w:p>
+        </w:tc>
+        <w:tc>
+          <w:tcPr>
+            <w:tcW w:w="1127" w:type="dxa"/>
+          </w:tcPr>
+          <w:p>
+            <w:r>
+              <w:rPr>
+                <w:lang w:val="en-GB"/>
+              </w:rPr>
+              <w:t>SRE</w:t>
+            </w:r>
+          </w:p>
+        </w:tc>
+        <w:tc>
+          <w:tcPr>
+            <w:tcW w:w="1127" w:type="dxa"/>
+          </w:tcPr>
+          <w:p>
+            <w:r>
+              <w:rPr>
+                <w:lang w:val="en-GB"/>
+              </w:rPr>
+              <w:t>0.0094</w:t>
+            </w:r>
+          </w:p>
+        </w:tc>
+      </w:tr>
+      <w:tr>
+        <w:tc>
+          <w:tcPr>
+            <w:tcW w:w="1127" w:type="dxa"/>
+          </w:tcPr>
+          <w:p>
+            <w:r>
+              <w:rPr>
+                <w:lang w:val="en-GB"/>
+              </w:rPr>
+              <w:t>AMD</w:t>
+            </w:r>
+          </w:p>
+        </w:tc>
+        <w:tc>
+          <w:tcPr>
+            <w:tcW w:w="1127" w:type="dxa"/>
+          </w:tcPr>
+          <w:p>
+            <w:r>
+              <w:rPr>
+                <w:lang w:val="en-GB"/>
+              </w:rPr>
+              <w:t>0.0375</w:t>
+            </w:r>
+          </w:p>
+        </w:tc>
+        <w:tc>
+          <w:tcPr>
+            <w:tcW w:w="1127" w:type="dxa"/>
+          </w:tcPr>
+          <w:p>
+            <w:r>
+              <w:rPr>
+                <w:lang w:val="en-GB"/>
+              </w:rPr>
+              <w:t>CRM</w:t>
+            </w:r>
+          </w:p>
+        </w:tc>
+        <w:tc>
+          <w:tcPr>
+            <w:tcW w:w="1127" w:type="dxa"/>
+          </w:tcPr>
+          <w:p>
+            <w:r>
+              <w:rPr>
+                <w:lang w:val="en-GB"/>
+              </w:rPr>
+              <w:t>0.0000</w:t>
+            </w:r>
+          </w:p>
+        </w:tc>
+        <w:tc>
+          <w:tcPr>
+            <w:tcW w:w="1127" w:type="dxa"/>
+          </w:tcPr>
+          <w:p>
+            <w:r>
+              <w:rPr>
+                <w:lang w:val="en-GB"/>
+              </w:rPr>
+              <w:t>VRT</w:t>
+            </w:r>
+          </w:p>
+        </w:tc>
+        <w:tc>
+          <w:tcPr>
+            <w:tcW w:w="1127" w:type="dxa"/>
+          </w:tcPr>
+          <w:p>
+            <w:r>
+              <w:rPr>
+                <w:lang w:val="en-GB"/>
+              </w:rPr>
+              <w:t>0.0000</w:t>
+            </w:r>
+          </w:p>
+        </w:tc>
+        <w:tc>
+          <w:tcPr>
+            <w:tcW w:w="1127" w:type="dxa"/>
+          </w:tcPr>
+          <w:p>
+            <w:r>
+              <w:rPr>
+                <w:lang w:val="en-GB"/>
+              </w:rPr>
+              <w:t>LMT</w:t>
+            </w:r>
+          </w:p>
+        </w:tc>
+        <w:tc>
+          <w:tcPr>
+            <w:tcW w:w="1127" w:type="dxa"/>
+          </w:tcPr>
+          <w:p>
+            <w:r>
+              <w:rPr>
+                <w:lang w:val="en-GB"/>
+              </w:rPr>
+              <w:t>0.1816</w:t>
+            </w:r>
+          </w:p>
+        </w:tc>
+      </w:tr>
+      <w:tr>
+        <w:tc>
+          <w:tcPr>
+            <w:tcW w:w="1127" w:type="dxa"/>
+          </w:tcPr>
+          <w:p>
+            <w:r>
+              <w:rPr>
+                <w:lang w:val="en-GB"/>
+              </w:rPr>
+              <w:t>MRVL</w:t>
+            </w:r>
+          </w:p>
+        </w:tc>
+        <w:tc>
+          <w:tcPr>
+            <w:tcW w:w="1127" w:type="dxa"/>
+          </w:tcPr>
+          <w:p>
+            <w:r>
+              <w:rPr>
+                <w:lang w:val="en-GB"/>
+              </w:rPr>
+              <w:t>0.0000</w:t>
+            </w:r>
+          </w:p>
+        </w:tc>
+        <w:tc>
+          <w:tcPr>
+            <w:tcW w:w="1127" w:type="dxa"/>
+          </w:tcPr>
+          <w:p>
+            <w:r>
+              <w:rPr>
+                <w:lang w:val="en-GB"/>
+              </w:rPr>
+              <w:t>NET</w:t>
+            </w:r>
+          </w:p>
+        </w:tc>
+        <w:tc>
+          <w:tcPr>
+            <w:tcW w:w="1127" w:type="dxa"/>
+          </w:tcPr>
+          <w:p>
+            <w:r>
+              <w:rPr>
+                <w:lang w:val="en-GB"/>
+              </w:rPr>
+              <w:t>0.0122</w:t>
+            </w:r>
+          </w:p>
+        </w:tc>
+        <w:tc>
+          <w:tcPr>
+            <w:tcW w:w="1127" w:type="dxa"/>
+          </w:tcPr>
+          <w:p>
+            <w:r>
+              <w:rPr>
+                <w:lang w:val="en-GB"/>
+              </w:rPr>
+              <w:t>ETN</w:t>
+            </w:r>
+          </w:p>
+        </w:tc>
+        <w:tc>
+          <w:tcPr>
+            <w:tcW w:w="1127" w:type="dxa"/>
+          </w:tcPr>
+          <w:p>
+            <w:r>
+              <w:rPr>
+                <w:lang w:val="en-GB"/>
+              </w:rPr>
+              <w:t>0.0000</w:t>
+            </w:r>
+          </w:p>
+        </w:tc>
+        <w:tc>
+          <w:tcPr>
+            <w:tcW w:w="1127" w:type="dxa"/>
+          </w:tcPr>
+          <w:p>
+            <w:r>
+              <w:rPr>
+                <w:lang w:val="en-GB"/>
+              </w:rPr>
+              <w:t>RTX</w:t>
+            </w:r>
+          </w:p>
+        </w:tc>
+        <w:tc>
+          <w:tcPr>
+            <w:tcW w:w="1127" w:type="dxa"/>
+          </w:tcPr>
+          <w:p>
+            <w:r>
+              <w:rPr>
+                <w:lang w:val="en-GB"/>
+              </w:rPr>
+              <w:t>0.0147</w:t>
+            </w:r>
+          </w:p>
+        </w:tc>
+      </w:tr>
+      <w:tr>
+        <w:tc>
+          <w:tcPr>
+            <w:tcW w:w="1127" w:type="dxa"/>
+          </w:tcPr>
+          <w:p>
+            <w:r>
+              <w:rPr>
+                <w:lang w:val="en-GB"/>
+              </w:rPr>
+              <w:t>MSFT</w:t>
+            </w:r>
+          </w:p>
+        </w:tc>
+        <w:tc>
+          <w:tcPr>
+            <w:tcW w:w="1127" w:type="dxa"/>
+          </w:tcPr>
+          <w:p>
+            <w:r>
+              <w:rPr>
+                <w:lang w:val="en-GB"/>
+              </w:rPr>
+              <w:t>0.1144</w:t>
+            </w:r>
+          </w:p>
+        </w:tc>
+        <w:tc>
+          <w:tcPr>
+            <w:tcW w:w="1127" w:type="dxa"/>
+          </w:tcPr>
+          <w:p>
+            <w:r>
+              <w:rPr>
+                <w:lang w:val="en-GB"/>
+              </w:rPr>
+              <w:t>ADBE</w:t>
+            </w:r>
+          </w:p>
+        </w:tc>
+        <w:tc>
+          <w:tcPr>
+            <w:tcW w:w="1127" w:type="dxa"/>
+          </w:tcPr>
+          <w:p>
+            <w:r>
+              <w:rPr>
+                <w:lang w:val="en-GB"/>
+              </w:rPr>
+              <w:t>0.0239</w:t>
+            </w:r>
+          </w:p>
+        </w:tc>
+        <w:tc>
+          <w:tcPr>
+            <w:tcW w:w="1127" w:type="dxa"/>
+          </w:tcPr>
+          <w:p>
+            <w:r>
+              <w:rPr>
+                <w:lang w:val="en-GB"/>
+              </w:rPr>
+              <w:t>IRM</w:t>
+            </w:r>
+          </w:p>
+        </w:tc>
+        <w:tc>
+          <w:tcPr>
+            <w:tcW w:w="1127" w:type="dxa"/>
+          </w:tcPr>
+          <w:p>
+            <w:r>
+              <w:rPr>
+                <w:lang w:val="en-GB"/>
+              </w:rPr>
+              <w:t>0.0000</w:t>
+            </w:r>
+          </w:p>
+        </w:tc>
+        <w:tc>
+          <w:tcPr>
+            <w:tcW w:w="1127" w:type="dxa"/>
+          </w:tcPr>
+          <w:p>
+            <w:r>
+              <w:rPr>
+                <w:lang w:val="en-GB"/>
+              </w:rPr>
+              <w:t>GD</w:t>
+            </w:r>
+          </w:p>
+        </w:tc>
+        <w:tc>
+          <w:tcPr>
+            <w:tcW w:w="1127" w:type="dxa"/>
+          </w:tcPr>
+          <w:p>
+            <w:r>
+              <w:rPr>
+                <w:lang w:val="en-GB"/>
+              </w:rPr>
+              <w:t>0.0138</w:t>
+            </w:r>
+          </w:p>
+        </w:tc>
+      </w:tr>
+    </w:tbl>
+    <w:p/>
+    <w:p>
+      <w:pPr>
+        <w:pStyle w:val="Heading2"/>
+      </w:pPr>
+      <w:r>
+        <w:lastRenderedPageBreak/>
+        <w:t>Drawdown</w:t>
+      </w:r>
+    </w:p>
+    <w:p>
+      <w:r>
+        <w:t xml:space="preserve">Since the period covers important events like COVID-19, the supply chain crisis, and Trump’s tariffs, </w:t>
+      </w:r>
+      <w:r>
+        <w:t>drawdown periods are inevitable. The 5 worst drawdown periods from data between January 1</w:t>
+      </w:r>
+      <w:r>
+        <w:rPr>
+          <w:vertAlign w:val="superscript"/>
+        </w:rPr>
+        <w:t>st</w:t>
+      </w:r>
+      <w:r>
+        <w:t>, 2020, and May 31</w:t>
+      </w:r>
+      <w:r>
+        <w:rPr>
+          <w:vertAlign w:val="superscript"/>
+        </w:rPr>
+        <w:t>st</w:t>
+      </w:r>
+      <w:r>
+        <w:t>, 2026, are shown below:</w:t>
+      </w:r>
+    </w:p>
+    <w:p/>
+    <w:tbl>
+      <w:tblPr>
+        <w:tblStyle w:val="TableGrid"/>
+        <w:tblW w:w="9016" w:type="dxa"/>
+        <w:jc w:val="center"/>
+        <w:tblLook w:val="04A0" w:firstRow="1" w:lastRow="0" w:firstColumn="1" w:lastColumn="0" w:noHBand="0" w:noVBand="1"/>
+      </w:tblPr>
+      <w:tblGrid>
+        <w:gridCol w:w="421"/>
+        <w:gridCol w:w="3215"/>
+        <w:gridCol w:w="1960"/>
+        <w:gridCol w:w="1960"/>
+        <w:gridCol w:w="1460"/>
+      </w:tblGrid>
+      <w:tr>
+        <w:trPr>
+          <w:trHeight w:val="290"/>
+          <w:jc w:val="center"/>
+        </w:trPr>
+        <w:tc>
+          <w:tcPr>
+            <w:tcW w:w="421" w:type="dxa"/>
+          </w:tcPr>
+          <w:p>
+            <w:pPr>
+              <w:jc w:val="center"/>
+              <w:rPr>
+                <w:rFonts w:eastAsia="Times New Roman"/>
+                <w:b/>
+                <w:bCs/>
+                <w:color w:val="000000"/>
+                <w:kern w:val="0"/>
+                <w:sz w:val="22"/>
+                <w:szCs w:val="22"/>
+                <w:lang w:val="en-GB" w:eastAsia="en-GB"/>
+                <w14:ligatures w14:val="none"/>
+              </w:rPr>
+            </w:pPr>
+            <w:r>
+              <w:rPr>
+                <w:rFonts w:eastAsia="Times New Roman"/>
+                <w:b/>
+                <w:bCs/>
+                <w:color w:val="000000"/>
+                <w:kern w:val="0"/>
+                <w:sz w:val="22"/>
+                <w:szCs w:val="22"/>
+                <w:lang w:val="en-GB" w:eastAsia="en-GB"/>
+                <w14:ligatures w14:val="none"/>
+              </w:rPr>
+              <w:t>#</w:t>
+            </w:r>
+          </w:p>
+        </w:tc>
+        <w:tc>
+          <w:tcPr>
+            <w:tcW w:w="3215" w:type="dxa"/>
+            <w:noWrap/>
+            <w:hideMark/>
+          </w:tcPr>
+          <w:p>
+            <w:pPr>
+              <w:jc w:val="center"/>
+              <w:rPr>
+                <w:rFonts w:eastAsia="Times New Roman"/>
+                <w:b/>
+                <w:bCs/>
+                <w:color w:val="000000"/>
+                <w:kern w:val="0"/>
+                <w:sz w:val="22"/>
+                <w:szCs w:val="22"/>
+                <w:lang w:val="en-GB" w:eastAsia="en-GB"/>
+                <w14:ligatures w14:val="none"/>
+              </w:rPr>
+            </w:pPr>
+            <w:r>
+              <w:rPr>
+                <w:rFonts w:eastAsia="Times New Roman"/>
+                <w:b/>
+                <w:bCs/>
+                <w:color w:val="000000"/>
+                <w:kern w:val="0"/>
+                <w:sz w:val="22"/>
+                <w:szCs w:val="22"/>
+                <w:lang w:val="en-GB" w:eastAsia="en-GB"/>
+                <w14:ligatures w14:val="none"/>
+              </w:rPr>
+              <w:t>Peak Date</w:t>
+            </w:r>
+          </w:p>
+        </w:tc>
+        <w:tc>
+          <w:tcPr>
+            <w:tcW w:w="1960" w:type="dxa"/>
+            <w:noWrap/>
+            <w:hideMark/>
+          </w:tcPr>
+          <w:p>
+            <w:pPr>
+              <w:jc w:val="center"/>
+              <w:rPr>
+                <w:rFonts w:eastAsia="Times New Roman"/>
+                <w:b/>
+                <w:bCs/>
+                <w:color w:val="000000"/>
+                <w:kern w:val="0"/>
+                <w:sz w:val="22"/>
+                <w:szCs w:val="22"/>
+                <w:lang w:val="en-GB" w:eastAsia="en-GB"/>
+                <w14:ligatures w14:val="none"/>
+              </w:rPr>
+            </w:pPr>
+            <w:r>
+              <w:rPr>
+                <w:rFonts w:eastAsia="Times New Roman"/>
+                <w:b/>
+                <w:bCs/>
+                <w:color w:val="000000"/>
+                <w:kern w:val="0"/>
+                <w:sz w:val="22"/>
+                <w:szCs w:val="22"/>
+                <w:lang w:val="en-GB" w:eastAsia="en-GB"/>
+                <w14:ligatures w14:val="none"/>
+              </w:rPr>
+              <w:t>Trough Date</w:t>
+            </w:r>
+          </w:p>
+        </w:tc>
+        <w:tc>
+          <w:tcPr>
+            <w:tcW w:w="1960" w:type="dxa"/>
+            <w:noWrap/>
+            <w:hideMark/>
+          </w:tcPr>
+          <w:p>
+            <w:pPr>
+              <w:jc w:val="center"/>
+              <w:rPr>
+                <w:rFonts w:eastAsia="Times New Roman"/>
+                <w:b/>
+                <w:bCs/>
+                <w:color w:val="000000"/>
+                <w:kern w:val="0"/>
+                <w:sz w:val="22"/>
+                <w:szCs w:val="22"/>
+                <w:lang w:val="en-GB" w:eastAsia="en-GB"/>
+                <w14:ligatures w14:val="none"/>
+              </w:rPr>
+            </w:pPr>
+            <w:r>
+              <w:rPr>
+                <w:rFonts w:eastAsia="Times New Roman"/>
+                <w:b/>
+                <w:bCs/>
+                <w:color w:val="000000"/>
+                <w:kern w:val="0"/>
+                <w:sz w:val="22"/>
+                <w:szCs w:val="22"/>
+                <w:lang w:val="en-GB" w:eastAsia="en-GB"/>
+                <w14:ligatures w14:val="none"/>
+              </w:rPr>
+              <w:t>Recovery Date</w:t>
+            </w:r>
+          </w:p>
+        </w:tc>
+        <w:tc>
+          <w:tcPr>
+            <w:tcW w:w="1460" w:type="dxa"/>
+            <w:noWrap/>
+            <w:hideMark/>
+          </w:tcPr>
+          <w:p>
+            <w:pPr>
+              <w:jc w:val="center"/>
+              <w:rPr>
+                <w:rFonts w:eastAsia="Times New Roman"/>
+                <w:b/>
+                <w:bCs/>
+                <w:color w:val="000000"/>
+                <w:kern w:val="0"/>
+                <w:sz w:val="22"/>
+                <w:szCs w:val="22"/>
+                <w:lang w:val="en-GB" w:eastAsia="en-GB"/>
+                <w14:ligatures w14:val="none"/>
+              </w:rPr>
+            </w:pPr>
+            <w:r>
+              <w:rPr>
+                <w:rFonts w:eastAsia="Times New Roman"/>
+                <w:b/>
+                <w:bCs/>
+                <w:color w:val="000000"/>
+                <w:kern w:val="0"/>
+                <w:sz w:val="22"/>
+                <w:szCs w:val="22"/>
+                <w:lang w:val="en-GB" w:eastAsia="en-GB"/>
+                <w14:ligatures w14:val="none"/>
+              </w:rPr>
+              <w:t>Drawdown (%)</w:t>
+            </w:r>
+          </w:p>
+        </w:tc>
+      </w:tr>
+      <w:tr>
+        <w:trPr>
+          <w:trHeight w:val="290"/>
+          <w:jc w:val="center"/>
+        </w:trPr>
+        <w:tc>
+          <w:tcPr>
+            <w:tcW w:w="421" w:type="dxa"/>
+          </w:tcPr>
+          <w:p>
+            <w:pPr>
+              <w:jc w:val="center"/>
+              <w:rPr>
+                <w:rFonts w:eastAsia="Times New Roman"/>
+                <w:color w:val="000000"/>
+                <w:kern w:val="0"/>
+                <w:sz w:val="22"/>
+                <w:szCs w:val="22"/>
+                <w:lang w:val="en-GB" w:eastAsia="en-GB"/>
+                <w14:ligatures w14:val="none"/>
+              </w:rPr>
+            </w:pPr>
+            <w:r>
+              <w:rPr>
+                <w:rFonts w:eastAsia="Times New Roman"/>
+                <w:color w:val="000000"/>
+                <w:kern w:val="0"/>
+                <w:sz w:val="22"/>
+                <w:szCs w:val="22"/>
+                <w:lang w:val="en-GB" w:eastAsia="en-GB"/>
+                <w14:ligatures w14:val="none"/>
+              </w:rPr>
+              <w:t>1</w:t>
+            </w:r>
+          </w:p>
+        </w:tc>
+        <w:tc>
+          <w:tcPr>
+            <w:tcW w:w="3215" w:type="dxa"/>
+            <w:noWrap/>
+            <w:hideMark/>
+          </w:tcPr>
+          <w:p>
+            <w:pPr>
+              <w:jc w:val="center"/>
+              <w:rPr>
+                <w:rFonts w:eastAsia="Times New Roman"/>
+                <w:color w:val="000000"/>
+                <w:kern w:val="0"/>
+                <w:sz w:val="22"/>
+                <w:szCs w:val="22"/>
+                <w:lang w:val="en-GB" w:eastAsia="en-GB"/>
+                <w14:ligatures w14:val="none"/>
+              </w:rPr>
+            </w:pPr>
+            <w:r>
+              <w:rPr>
+                <w:rFonts w:eastAsia="Times New Roman"/>
+                <w:color w:val="000000"/>
+                <w:kern w:val="0"/>
+                <w:sz w:val="22"/>
+                <w:szCs w:val="22"/>
+                <w:lang w:val="en-GB" w:eastAsia="en-GB"/>
+                <w14:ligatures w14:val="none"/>
+              </w:rPr>
+              <w:t>2022-03-31</w:t>
+            </w:r>
+          </w:p>
+        </w:tc>
+        <w:tc>
+          <w:tcPr>
+            <w:tcW w:w="1960" w:type="dxa"/>
+            <w:noWrap/>
+            <w:hideMark/>
+          </w:tcPr>
+          <w:p>
+            <w:pPr>
+              <w:jc w:val="center"/>
+              <w:rPr>
+                <w:rFonts w:eastAsia="Times New Roman"/>
+                <w:color w:val="000000"/>
+                <w:kern w:val="0"/>
+                <w:sz w:val="22"/>
+                <w:szCs w:val="22"/>
+                <w:lang w:val="en-GB" w:eastAsia="en-GB"/>
+                <w14:ligatures w14:val="none"/>
+              </w:rPr>
+            </w:pPr>
+            <w:r>
+              <w:rPr>
+                <w:rFonts w:eastAsia="Times New Roman"/>
+                <w:color w:val="000000"/>
+                <w:kern w:val="0"/>
+                <w:sz w:val="22"/>
+                <w:szCs w:val="22"/>
+                <w:lang w:val="en-GB" w:eastAsia="en-GB"/>
+                <w14:ligatures w14:val="none"/>
+              </w:rPr>
+              <w:t>2022-09-30</w:t>
+            </w:r>
+          </w:p>
+        </w:tc>
+        <w:tc>
+          <w:tcPr>
+            <w:tcW w:w="1960" w:type="dxa"/>
+            <w:noWrap/>
+            <w:hideMark/>
+          </w:tcPr>
+          <w:p>
+            <w:pPr>
+              <w:jc w:val="center"/>
+              <w:rPr>
+                <w:rFonts w:eastAsia="Times New Roman"/>
+                <w:color w:val="000000"/>
+                <w:kern w:val="0"/>
+                <w:sz w:val="22"/>
+                <w:szCs w:val="22"/>
+                <w:lang w:val="en-GB" w:eastAsia="en-GB"/>
+                <w14:ligatures w14:val="none"/>
+              </w:rPr>
+            </w:pPr>
+            <w:r>
+              <w:rPr>
+                <w:rFonts w:eastAsia="Times New Roman"/>
+                <w:color w:val="000000"/>
+                <w:kern w:val="0"/>
+                <w:sz w:val="22"/>
+                <w:szCs w:val="22"/>
+                <w:lang w:val="en-GB" w:eastAsia="en-GB"/>
+                <w14:ligatures w14:val="none"/>
+              </w:rPr>
+              <w:t>2023-02-28</w:t>
+            </w:r>
+          </w:p>
+        </w:tc>
+        <w:tc>
+          <w:tcPr>
+            <w:tcW w:w="1460" w:type="dxa"/>
+            <w:noWrap/>
+            <w:hideMark/>
+          </w:tcPr>
+          <w:p>
+            <w:pPr>
+              <w:jc w:val="center"/>
+              <w:rPr>
+                <w:rFonts w:eastAsia="Times New Roman"/>
+                <w:color w:val="000000"/>
+                <w:kern w:val="0"/>
+                <w:sz w:val="22"/>
+                <w:szCs w:val="22"/>
+                <w:lang w:val="en-GB" w:eastAsia="en-GB"/>
+                <w14:ligatures w14:val="none"/>
+              </w:rPr>
+            </w:pPr>
+            <w:r>
+              <w:rPr>
+                <w:rFonts w:eastAsia="Times New Roman"/>
+                <w:color w:val="000000"/>
+                <w:kern w:val="0"/>
+                <w:sz w:val="22"/>
+                <w:szCs w:val="22"/>
+                <w:lang w:val="en-GB" w:eastAsia="en-GB"/>
+                <w14:ligatures w14:val="none"/>
+              </w:rPr>
+              <w:t>-30.26</w:t>
+            </w:r>
+            <w:r>
+              <w:rPr>
+                <w:rFonts w:eastAsia="Times New Roman"/>
+                <w:color w:val="000000"/>
+                <w:kern w:val="0"/>
+                <w:sz w:val="22"/>
+                <w:szCs w:val="22"/>
+                <w:lang w:val="en-GB" w:eastAsia="en-GB"/>
+                <w14:ligatures w14:val="none"/>
+              </w:rPr>
+              <w:t>5</w:t>
+            </w:r>
+          </w:p>
+        </w:tc>
+      </w:tr>
+      <w:tr>
+        <w:trPr>
+          <w:trHeight w:val="290"/>
+          <w:jc w:val="center"/>
+        </w:trPr>
+        <w:tc>
+          <w:tcPr>
+            <w:tcW w:w="421" w:type="dxa"/>
+          </w:tcPr>
+          <w:p>
+            <w:pPr>
+              <w:jc w:val="center"/>
+              <w:rPr>
+                <w:rFonts w:eastAsia="Times New Roman"/>
+                <w:color w:val="000000"/>
+                <w:kern w:val="0"/>
+                <w:sz w:val="22"/>
+                <w:szCs w:val="22"/>
+                <w:lang w:val="en-GB" w:eastAsia="en-GB"/>
+                <w14:ligatures w14:val="none"/>
+              </w:rPr>
+            </w:pPr>
+            <w:r>
+              <w:rPr>
+                <w:rFonts w:eastAsia="Times New Roman"/>
+                <w:color w:val="000000"/>
+                <w:kern w:val="0"/>
+                <w:sz w:val="22"/>
+                <w:szCs w:val="22"/>
+                <w:lang w:val="en-GB" w:eastAsia="en-GB"/>
+                <w14:ligatures w14:val="none"/>
+              </w:rPr>
+              <w:t>2</w:t>
+            </w:r>
+          </w:p>
+        </w:tc>
+        <w:tc>
+          <w:tcPr>
+            <w:tcW w:w="3215" w:type="dxa"/>
+            <w:noWrap/>
+            <w:hideMark/>
+          </w:tcPr>
+          <w:p>
+            <w:pPr>
+              <w:jc w:val="center"/>
+              <w:rPr>
+                <w:rFonts w:eastAsia="Times New Roman"/>
+                <w:color w:val="000000"/>
+                <w:kern w:val="0"/>
+                <w:sz w:val="22"/>
+                <w:szCs w:val="22"/>
+                <w:lang w:val="en-GB" w:eastAsia="en-GB"/>
+                <w14:ligatures w14:val="none"/>
+              </w:rPr>
+            </w:pPr>
+            <w:r>
+              <w:rPr>
+                <w:rFonts w:eastAsia="Times New Roman"/>
+                <w:color w:val="000000"/>
+                <w:kern w:val="0"/>
+                <w:sz w:val="22"/>
+                <w:szCs w:val="22"/>
+                <w:lang w:val="en-GB" w:eastAsia="en-GB"/>
+                <w14:ligatures w14:val="none"/>
+              </w:rPr>
+              <w:t>2024-09-30</w:t>
+            </w:r>
+          </w:p>
+        </w:tc>
+        <w:tc>
+          <w:tcPr>
+            <w:tcW w:w="1960" w:type="dxa"/>
+            <w:noWrap/>
+            <w:hideMark/>
+          </w:tcPr>
+          <w:p>
+            <w:pPr>
+              <w:jc w:val="center"/>
+              <w:rPr>
+                <w:rFonts w:eastAsia="Times New Roman"/>
+                <w:color w:val="000000"/>
+                <w:kern w:val="0"/>
+                <w:sz w:val="22"/>
+                <w:szCs w:val="22"/>
+                <w:lang w:val="en-GB" w:eastAsia="en-GB"/>
+                <w14:ligatures w14:val="none"/>
+              </w:rPr>
+            </w:pPr>
+            <w:r>
+              <w:rPr>
+                <w:rFonts w:eastAsia="Times New Roman"/>
+                <w:color w:val="000000"/>
+                <w:kern w:val="0"/>
+                <w:sz w:val="22"/>
+                <w:szCs w:val="22"/>
+                <w:lang w:val="en-GB" w:eastAsia="en-GB"/>
+                <w14:ligatures w14:val="none"/>
+              </w:rPr>
+              <w:t>2025-03-31</w:t>
+            </w:r>
+          </w:p>
+        </w:tc>
+        <w:tc>
+          <w:tcPr>
+            <w:tcW w:w="1960" w:type="dxa"/>
+            <w:noWrap/>
+            <w:hideMark/>
+          </w:tcPr>
+          <w:p>
+            <w:pPr>
+              <w:jc w:val="center"/>
+              <w:rPr>
+                <w:rFonts w:eastAsia="Times New Roman"/>
+                <w:color w:val="000000"/>
+                <w:kern w:val="0"/>
+                <w:sz w:val="22"/>
+                <w:szCs w:val="22"/>
+                <w:lang w:val="en-GB" w:eastAsia="en-GB"/>
+                <w14:ligatures w14:val="none"/>
+              </w:rPr>
+            </w:pPr>
+            <w:r>
+              <w:rPr>
+                <w:rFonts w:eastAsia="Times New Roman"/>
+                <w:color w:val="000000"/>
+                <w:kern w:val="0"/>
+                <w:sz w:val="22"/>
+                <w:szCs w:val="22"/>
+                <w:lang w:val="en-GB" w:eastAsia="en-GB"/>
+                <w14:ligatures w14:val="none"/>
+              </w:rPr>
+              <w:t>2025-06-30</w:t>
+            </w:r>
+          </w:p>
+        </w:tc>
+        <w:tc>
+          <w:tcPr>
+            <w:tcW w:w="1460" w:type="dxa"/>
+            <w:noWrap/>
+            <w:hideMark/>
+          </w:tcPr>
+          <w:p>
+            <w:pPr>
+              <w:jc w:val="center"/>
+              <w:rPr>
+                <w:rFonts w:eastAsia="Times New Roman"/>
+                <w:color w:val="000000"/>
+                <w:kern w:val="0"/>
+                <w:sz w:val="22"/>
+                <w:szCs w:val="22"/>
+                <w:lang w:val="en-GB" w:eastAsia="en-GB"/>
+                <w14:ligatures w14:val="none"/>
+              </w:rPr>
+            </w:pPr>
+            <w:r>
+              <w:rPr>
+                <w:rFonts w:eastAsia="Times New Roman"/>
+                <w:color w:val="000000"/>
+                <w:kern w:val="0"/>
+                <w:sz w:val="22"/>
+                <w:szCs w:val="22"/>
+                <w:lang w:val="en-GB" w:eastAsia="en-GB"/>
+                <w14:ligatures w14:val="none"/>
+              </w:rPr>
+              <w:t>-13.1</w:t>
+            </w:r>
+            <w:r>
+              <w:rPr>
+                <w:rFonts w:eastAsia="Times New Roman"/>
+                <w:color w:val="000000"/>
+                <w:kern w:val="0"/>
+                <w:sz w:val="22"/>
+                <w:szCs w:val="22"/>
+                <w:lang w:val="en-GB" w:eastAsia="en-GB"/>
+                <w14:ligatures w14:val="none"/>
+              </w:rPr>
+              <w:t>80</w:t>
+            </w:r>
+          </w:p>
+        </w:tc>
+      </w:tr>
+      <w:tr>
+        <w:trPr>
+          <w:trHeight w:val="290"/>
+          <w:jc w:val="center"/>
+        </w:trPr>
+        <w:tc>
+          <w:tcPr>
+            <w:tcW w:w="421" w:type="dxa"/>
+          </w:tcPr>
+          <w:p>
+            <w:pPr>
+              <w:jc w:val="center"/>
+              <w:rPr>
+                <w:rFonts w:eastAsia="Times New Roman"/>
+                <w:color w:val="000000"/>
+                <w:kern w:val="0"/>
+                <w:sz w:val="22"/>
+                <w:szCs w:val="22"/>
+                <w:lang w:val="en-GB" w:eastAsia="en-GB"/>
+                <w14:ligatures w14:val="none"/>
+              </w:rPr>
+            </w:pPr>
+            <w:r>
+              <w:rPr>
+                <w:rFonts w:eastAsia="Times New Roman"/>
+                <w:color w:val="000000"/>
+                <w:kern w:val="0"/>
+                <w:sz w:val="22"/>
+                <w:szCs w:val="22"/>
+                <w:lang w:val="en-GB" w:eastAsia="en-GB"/>
+                <w14:ligatures w14:val="none"/>
+              </w:rPr>
+              <w:t>3</w:t>
+            </w:r>
+          </w:p>
+        </w:tc>
+        <w:tc>
+          <w:tcPr>
+            <w:tcW w:w="3215" w:type="dxa"/>
+            <w:noWrap/>
+            <w:hideMark/>
+          </w:tcPr>
+          <w:p>
+            <w:pPr>
+              <w:jc w:val="center"/>
+              <w:rPr>
+                <w:rFonts w:eastAsia="Times New Roman"/>
+                <w:color w:val="000000"/>
+                <w:kern w:val="0"/>
+                <w:sz w:val="22"/>
+                <w:szCs w:val="22"/>
+                <w:lang w:val="en-GB" w:eastAsia="en-GB"/>
+                <w14:ligatures w14:val="none"/>
+              </w:rPr>
+            </w:pPr>
+            <w:r>
+              <w:rPr>
+                <w:rFonts w:eastAsia="Times New Roman"/>
+                <w:color w:val="000000"/>
+                <w:kern w:val="0"/>
+                <w:sz w:val="22"/>
+                <w:szCs w:val="22"/>
+                <w:lang w:val="en-GB" w:eastAsia="en-GB"/>
+                <w14:ligatures w14:val="none"/>
+              </w:rPr>
+              <w:t>2023-08-31</w:t>
+            </w:r>
+          </w:p>
+        </w:tc>
+        <w:tc>
+          <w:tcPr>
+            <w:tcW w:w="1960" w:type="dxa"/>
+            <w:noWrap/>
+            <w:hideMark/>
+          </w:tcPr>
+          <w:p>
+            <w:pPr>
+              <w:jc w:val="center"/>
+              <w:rPr>
+                <w:rFonts w:eastAsia="Times New Roman"/>
+                <w:color w:val="000000"/>
+                <w:kern w:val="0"/>
+                <w:sz w:val="22"/>
+                <w:szCs w:val="22"/>
+                <w:lang w:val="en-GB" w:eastAsia="en-GB"/>
+                <w14:ligatures w14:val="none"/>
+              </w:rPr>
+            </w:pPr>
+            <w:r>
+              <w:rPr>
+                <w:rFonts w:eastAsia="Times New Roman"/>
+                <w:color w:val="000000"/>
+                <w:kern w:val="0"/>
+                <w:sz w:val="22"/>
+                <w:szCs w:val="22"/>
+                <w:lang w:val="en-GB" w:eastAsia="en-GB"/>
+                <w14:ligatures w14:val="none"/>
+              </w:rPr>
+              <w:t>2023-09-29</w:t>
+            </w:r>
+          </w:p>
+        </w:tc>
+        <w:tc>
+          <w:tcPr>
+            <w:tcW w:w="1960" w:type="dxa"/>
+            <w:noWrap/>
+            <w:hideMark/>
+          </w:tcPr>
+          <w:p>
+            <w:pPr>
+              <w:jc w:val="center"/>
+              <w:rPr>
+                <w:rFonts w:eastAsia="Times New Roman"/>
+                <w:color w:val="000000"/>
+                <w:kern w:val="0"/>
+                <w:sz w:val="22"/>
+                <w:szCs w:val="22"/>
+                <w:lang w:val="en-GB" w:eastAsia="en-GB"/>
+                <w14:ligatures w14:val="none"/>
+              </w:rPr>
+            </w:pPr>
+            <w:r>
+              <w:rPr>
+                <w:rFonts w:eastAsia="Times New Roman"/>
+                <w:color w:val="000000"/>
+                <w:kern w:val="0"/>
+                <w:sz w:val="22"/>
+                <w:szCs w:val="22"/>
+                <w:lang w:val="en-GB" w:eastAsia="en-GB"/>
+                <w14:ligatures w14:val="none"/>
+              </w:rPr>
+              <w:t>2023-11-30</w:t>
+            </w:r>
+          </w:p>
+        </w:tc>
+        <w:tc>
+          <w:tcPr>
+            <w:tcW w:w="1460" w:type="dxa"/>
+            <w:noWrap/>
+            <w:hideMark/>
+          </w:tcPr>
+          <w:p>
+            <w:pPr>
+              <w:jc w:val="center"/>
+              <w:rPr>
+                <w:rFonts w:eastAsia="Times New Roman"/>
+                <w:color w:val="000000"/>
+                <w:kern w:val="0"/>
+                <w:sz w:val="22"/>
+                <w:szCs w:val="22"/>
+                <w:lang w:val="en-GB" w:eastAsia="en-GB"/>
+                <w14:ligatures w14:val="none"/>
+              </w:rPr>
+            </w:pPr>
+            <w:r>
+              <w:rPr>
+                <w:rFonts w:eastAsia="Times New Roman"/>
+                <w:color w:val="000000"/>
+                <w:kern w:val="0"/>
+                <w:sz w:val="22"/>
+                <w:szCs w:val="22"/>
+                <w:lang w:val="en-GB" w:eastAsia="en-GB"/>
+                <w14:ligatures w14:val="none"/>
+              </w:rPr>
+              <w:t>-8.183</w:t>
+            </w:r>
+          </w:p>
+        </w:tc>
+      </w:tr>
+      <w:tr>
+        <w:trPr>
+          <w:trHeight w:val="290"/>
+          <w:jc w:val="center"/>
+        </w:trPr>
+        <w:tc>
+          <w:tcPr>
+            <w:tcW w:w="421" w:type="dxa"/>
+          </w:tcPr>
+          <w:p>
+            <w:pPr>
+              <w:jc w:val="center"/>
+              <w:rPr>
+                <w:rFonts w:eastAsia="Times New Roman"/>
+                <w:color w:val="000000"/>
+                <w:kern w:val="0"/>
+                <w:sz w:val="22"/>
+                <w:szCs w:val="22"/>
+                <w:lang w:val="en-GB" w:eastAsia="en-GB"/>
+                <w14:ligatures w14:val="none"/>
+              </w:rPr>
+            </w:pPr>
+            <w:r>
+              <w:rPr>
+                <w:rFonts w:eastAsia="Times New Roman"/>
+                <w:color w:val="000000"/>
+                <w:kern w:val="0"/>
+                <w:sz w:val="22"/>
+                <w:szCs w:val="22"/>
+                <w:lang w:val="en-GB" w:eastAsia="en-GB"/>
+                <w14:ligatures w14:val="none"/>
+              </w:rPr>
+              <w:t>4</w:t>
+            </w:r>
+          </w:p>
+        </w:tc>
+        <w:tc>
+          <w:tcPr>
+            <w:tcW w:w="3215" w:type="dxa"/>
+            <w:noWrap/>
+            <w:hideMark/>
+          </w:tcPr>
+          <w:p>
+            <w:pPr>
+              <w:jc w:val="center"/>
+              <w:rPr>
+                <w:rFonts w:eastAsia="Times New Roman"/>
+                <w:color w:val="000000"/>
+                <w:kern w:val="0"/>
+                <w:sz w:val="22"/>
+                <w:szCs w:val="22"/>
+                <w:lang w:val="en-GB" w:eastAsia="en-GB"/>
+                <w14:ligatures w14:val="none"/>
+              </w:rPr>
+            </w:pPr>
+            <w:r>
+              <w:rPr>
+                <w:rFonts w:eastAsia="Times New Roman"/>
+                <w:color w:val="000000"/>
+                <w:kern w:val="0"/>
+                <w:sz w:val="22"/>
+                <w:szCs w:val="22"/>
+                <w:lang w:val="en-GB" w:eastAsia="en-GB"/>
+                <w14:ligatures w14:val="none"/>
+              </w:rPr>
+              <w:t>2025-10-31</w:t>
+            </w:r>
+          </w:p>
+        </w:tc>
+        <w:tc>
+          <w:tcPr>
+            <w:tcW w:w="1960" w:type="dxa"/>
+            <w:noWrap/>
+            <w:hideMark/>
+          </w:tcPr>
+          <w:p>
+            <w:pPr>
+              <w:jc w:val="center"/>
+              <w:rPr>
+                <w:rFonts w:eastAsia="Times New Roman"/>
+                <w:color w:val="000000"/>
+                <w:kern w:val="0"/>
+                <w:sz w:val="22"/>
+                <w:szCs w:val="22"/>
+                <w:lang w:val="en-GB" w:eastAsia="en-GB"/>
+                <w14:ligatures w14:val="none"/>
+              </w:rPr>
+            </w:pPr>
+            <w:r>
+              <w:rPr>
+                <w:rFonts w:eastAsia="Times New Roman"/>
+                <w:color w:val="000000"/>
+                <w:kern w:val="0"/>
+                <w:sz w:val="22"/>
+                <w:szCs w:val="22"/>
+                <w:lang w:val="en-GB" w:eastAsia="en-GB"/>
+                <w14:ligatures w14:val="none"/>
+              </w:rPr>
+              <w:t>2025-11-28</w:t>
+            </w:r>
+          </w:p>
+        </w:tc>
+        <w:tc>
+          <w:tcPr>
+            <w:tcW w:w="1960" w:type="dxa"/>
+            <w:noWrap/>
+            <w:hideMark/>
+          </w:tcPr>
+          <w:p>
+            <w:pPr>
+              <w:jc w:val="center"/>
+              <w:rPr>
+                <w:rFonts w:eastAsia="Times New Roman"/>
+                <w:color w:val="000000"/>
+                <w:kern w:val="0"/>
+                <w:sz w:val="22"/>
+                <w:szCs w:val="22"/>
+                <w:lang w:val="en-GB" w:eastAsia="en-GB"/>
+                <w14:ligatures w14:val="none"/>
+              </w:rPr>
+            </w:pPr>
+            <w:r>
+              <w:rPr>
+                <w:rFonts w:eastAsia="Times New Roman"/>
+                <w:color w:val="000000"/>
+                <w:kern w:val="0"/>
+                <w:sz w:val="22"/>
+                <w:szCs w:val="22"/>
+                <w:lang w:val="en-GB" w:eastAsia="en-GB"/>
+                <w14:ligatures w14:val="none"/>
+              </w:rPr>
+              <w:t>2026-01-30</w:t>
+            </w:r>
+          </w:p>
+        </w:tc>
+        <w:tc>
+          <w:tcPr>
+            <w:tcW w:w="1460" w:type="dxa"/>
+            <w:noWrap/>
+            <w:hideMark/>
+          </w:tcPr>
+          <w:p>
+            <w:pPr>
+              <w:jc w:val="center"/>
+              <w:rPr>
+                <w:rFonts w:eastAsia="Times New Roman"/>
+                <w:color w:val="000000"/>
+                <w:kern w:val="0"/>
+                <w:sz w:val="22"/>
+                <w:szCs w:val="22"/>
+                <w:lang w:val="en-GB" w:eastAsia="en-GB"/>
+                <w14:ligatures w14:val="none"/>
+              </w:rPr>
+            </w:pPr>
+            <w:r>
+              <w:rPr>
+                <w:rFonts w:eastAsia="Times New Roman"/>
+                <w:color w:val="000000"/>
+                <w:kern w:val="0"/>
+                <w:sz w:val="22"/>
+                <w:szCs w:val="22"/>
+                <w:lang w:val="en-GB" w:eastAsia="en-GB"/>
+                <w14:ligatures w14:val="none"/>
+              </w:rPr>
+              <w:t>-7.0</w:t>
+            </w:r>
+            <w:r>
+              <w:rPr>
+                <w:rFonts w:eastAsia="Times New Roman"/>
+                <w:color w:val="000000"/>
+                <w:kern w:val="0"/>
+                <w:sz w:val="22"/>
+                <w:szCs w:val="22"/>
+                <w:lang w:val="en-GB" w:eastAsia="en-GB"/>
+                <w14:ligatures w14:val="none"/>
+              </w:rPr>
+              <w:t>60</w:t>
+            </w:r>
+          </w:p>
+        </w:tc>
+      </w:tr>
+      <w:tr>
+        <w:trPr>
+          <w:trHeight w:val="290"/>
+          <w:jc w:val="center"/>
+        </w:trPr>
+        <w:tc>
+          <w:tcPr>
+            <w:tcW w:w="421" w:type="dxa"/>
+          </w:tcPr>
+          <w:p>
+            <w:pPr>
+              <w:jc w:val="center"/>
+              <w:rPr>
+                <w:rFonts w:eastAsia="Times New Roman"/>
+                <w:color w:val="000000"/>
+                <w:kern w:val="0"/>
+                <w:sz w:val="22"/>
+                <w:szCs w:val="22"/>
+                <w:lang w:val="en-GB" w:eastAsia="en-GB"/>
+                <w14:ligatures w14:val="none"/>
+              </w:rPr>
+            </w:pPr>
+            <w:r>
+              <w:rPr>
+                <w:rFonts w:eastAsia="Times New Roman"/>
+                <w:color w:val="000000"/>
+                <w:kern w:val="0"/>
+                <w:sz w:val="22"/>
+                <w:szCs w:val="22"/>
+                <w:lang w:val="en-GB" w:eastAsia="en-GB"/>
+                <w14:ligatures w14:val="none"/>
+              </w:rPr>
+              <w:t>5</w:t>
+            </w:r>
+          </w:p>
+        </w:tc>
+        <w:tc>
+          <w:tcPr>
+            <w:tcW w:w="3215" w:type="dxa"/>
+            <w:noWrap/>
+            <w:hideMark/>
+          </w:tcPr>
+          <w:p>
+            <w:pPr>
+              <w:jc w:val="center"/>
+              <w:rPr>
+                <w:rFonts w:eastAsia="Times New Roman"/>
+                <w:color w:val="000000"/>
+                <w:kern w:val="0"/>
+                <w:sz w:val="22"/>
+                <w:szCs w:val="22"/>
+                <w:lang w:val="en-GB" w:eastAsia="en-GB"/>
+                <w14:ligatures w14:val="none"/>
+              </w:rPr>
+            </w:pPr>
+            <w:r>
+              <w:rPr>
+                <w:rFonts w:eastAsia="Times New Roman"/>
+                <w:color w:val="000000"/>
+                <w:kern w:val="0"/>
+                <w:sz w:val="22"/>
+                <w:szCs w:val="22"/>
+                <w:lang w:val="en-GB" w:eastAsia="en-GB"/>
+                <w14:ligatures w14:val="none"/>
+              </w:rPr>
+              <w:t>2021-08-31</w:t>
+            </w:r>
+          </w:p>
+        </w:tc>
+        <w:tc>
+          <w:tcPr>
+            <w:tcW w:w="1960" w:type="dxa"/>
+            <w:noWrap/>
+            <w:hideMark/>
+          </w:tcPr>
+          <w:p>
+            <w:pPr>
+              <w:jc w:val="center"/>
+              <w:rPr>
+                <w:rFonts w:eastAsia="Times New Roman"/>
+                <w:color w:val="000000"/>
+                <w:kern w:val="0"/>
+                <w:sz w:val="22"/>
+                <w:szCs w:val="22"/>
+                <w:lang w:val="en-GB" w:eastAsia="en-GB"/>
+                <w14:ligatures w14:val="none"/>
+              </w:rPr>
+            </w:pPr>
+            <w:r>
+              <w:rPr>
+                <w:rFonts w:eastAsia="Times New Roman"/>
+                <w:color w:val="000000"/>
+                <w:kern w:val="0"/>
+                <w:sz w:val="22"/>
+                <w:szCs w:val="22"/>
+                <w:lang w:val="en-GB" w:eastAsia="en-GB"/>
+                <w14:ligatures w14:val="none"/>
+              </w:rPr>
+              <w:t>2021-09-30</w:t>
+            </w:r>
+          </w:p>
+        </w:tc>
+        <w:tc>
+          <w:tcPr>
+            <w:tcW w:w="1960" w:type="dxa"/>
+            <w:noWrap/>
+            <w:hideMark/>
+          </w:tcPr>
+          <w:p>
+            <w:pPr>
+              <w:jc w:val="center"/>
+              <w:rPr>
+                <w:rFonts w:eastAsia="Times New Roman"/>
+                <w:color w:val="000000"/>
+                <w:kern w:val="0"/>
+                <w:sz w:val="22"/>
+                <w:szCs w:val="22"/>
+                <w:lang w:val="en-GB" w:eastAsia="en-GB"/>
+                <w14:ligatures w14:val="none"/>
+              </w:rPr>
+            </w:pPr>
+            <w:r>
+              <w:rPr>
+                <w:rFonts w:eastAsia="Times New Roman"/>
+                <w:color w:val="000000"/>
+                <w:kern w:val="0"/>
+                <w:sz w:val="22"/>
+                <w:szCs w:val="22"/>
+                <w:lang w:val="en-GB" w:eastAsia="en-GB"/>
+                <w14:ligatures w14:val="none"/>
+              </w:rPr>
+              <w:t>2021-10-29</w:t>
+            </w:r>
+          </w:p>
+        </w:tc>
+        <w:tc>
+          <w:tcPr>
+            <w:tcW w:w="1460" w:type="dxa"/>
+            <w:noWrap/>
+            <w:hideMark/>
+          </w:tcPr>
+          <w:p>
+            <w:pPr>
+              <w:jc w:val="center"/>
+              <w:rPr>
+                <w:rFonts w:eastAsia="Times New Roman"/>
+                <w:color w:val="000000"/>
+                <w:kern w:val="0"/>
+                <w:sz w:val="22"/>
+                <w:szCs w:val="22"/>
+                <w:lang w:val="en-GB" w:eastAsia="en-GB"/>
+                <w14:ligatures w14:val="none"/>
+              </w:rPr>
+            </w:pPr>
+            <w:r>
+              <w:rPr>
+                <w:rFonts w:eastAsia="Times New Roman"/>
+                <w:color w:val="000000"/>
+                <w:kern w:val="0"/>
+                <w:sz w:val="22"/>
+                <w:szCs w:val="22"/>
+                <w:lang w:val="en-GB" w:eastAsia="en-GB"/>
+                <w14:ligatures w14:val="none"/>
+              </w:rPr>
+              <w:t>-6.11</w:t>
+            </w:r>
+            <w:r>
+              <w:rPr>
+                <w:rFonts w:eastAsia="Times New Roman"/>
+                <w:color w:val="000000"/>
+                <w:kern w:val="0"/>
+                <w:sz w:val="22"/>
+                <w:szCs w:val="22"/>
+                <w:lang w:val="en-GB" w:eastAsia="en-GB"/>
+                <w14:ligatures w14:val="none"/>
+              </w:rPr>
+              <w:t>5</w:t>
+            </w:r>
+          </w:p>
+        </w:tc>
+      </w:tr>
+    </w:tbl>
+    <w:p/>
+    <w:p>
+      <w:r>
+        <w:t>The worst drawdown</w:t>
+      </w:r>
+      <w:r>
+        <w:t xml:space="preserve"> period</w:t>
+      </w:r>
+      <w:r>
+        <w:t xml:space="preserve"> was due to the supply chain crisis that occurred right after the peak of the pandemic, coupled with rising inflation. The second and fourth worst drawdown</w:t>
+      </w:r>
+      <w:r>
+        <w:t xml:space="preserve"> periods</w:t>
+      </w:r>
+      <w:r>
+        <w:t xml:space="preserve"> were primarily due to the tariffs imposed on Canada and the EU as part of the trade war between the nations. </w:t>
+      </w:r>
+      <w:r>
+        <w:t xml:space="preserve">The third worst drawdown was due to rising interest rates. Finally, the fifth worst drawdown period </w:t>
+      </w:r>
+      <w:r>
+        <w:t>was because of the Chinese property crisis (which indirectly affected American markets), as well as the impact of COVID-19.</w:t>
+      </w:r>
+    </w:p>
+    <w:p>
+      <w:r>
+        <w:t xml:space="preserve">Additionally, the worst month in terms of month-by-month return was September 2022, with a monthly return of -13.91%. </w:t>
+      </w:r>
+    </w:p>
+    <w:p>
+      <w:pPr>
+        <w:rPr>
+          <w:rFonts w:eastAsiaTheme="minorEastAsia"/>
+        </w:rPr>
+      </w:pPr>
+      <w:r>
+        <w:rPr>
+          <w:rFonts w:eastAsiaTheme="minorEastAsia"/>
+        </w:rPr>
+        <w:t xml:space="preserve"> </w:t>
+      </w:r>
+    </w:p>
+    <w:p>
+      <w:pPr>
+        <w:rPr>
+          <w:rFonts w:eastAsiaTheme="minorEastAsia"/>
+        </w:rPr>
+      </w:pPr>
+    </w:p>
+    <w:p/>
+    <w:p/>
     <w:p/>
     <w:p/>
     <w:p/>
@@ -4229,7 +6563,6 @@
     <w:next w:val="Normal"/>
     <w:link w:val="Heading3Char"/>
     <w:uiPriority w:val="9"/>
-    <w:semiHidden/>
     <w:unhideWhenUsed/>
     <w:qFormat/>
     <w:rsid w:val="00CF78ED"/>
@@ -4437,7 +6770,6 @@
     <w:basedOn w:val="DefaultParagraphFont"/>
     <w:link w:val="Heading3"/>
     <w:uiPriority w:val="9"/>
-    <w:semiHidden/>
     <w:rsid w:val="00CF78ED"/>
     <w:rPr>
       <w:rFonts w:eastAsiaTheme="majorEastAsia" w:cstheme="majorBidi"/>

</xml_diff>

<commit_message>
updated the report 	modified:   main/Multi-Asset Risk Dashboard & Portfolio.docx 	modified:   output/BLO_risk_dashboard.xlsx 	modified:   risk_dashboard/BLO_risk_dashboard.py
</commit_message>
<xml_diff>
--- a/main/Multi-Asset Risk Dashboard & Portfolio.docx
+++ b/main/Multi-Asset Risk Dashboard & Portfolio.docx
@@ -3,14 +3,1153 @@
 <w:document xmlns:wpc="http://schemas.microsoft.com/office/word/2010/wordprocessingCanvas" xmlns:cx="http://schemas.microsoft.com/office/drawing/2014/chartex" xmlns:cx1="http://schemas.microsoft.com/office/drawing/2015/9/8/chartex" xmlns:cx2="http://schemas.microsoft.com/office/drawing/2015/10/21/chartex" xmlns:cx3="http://schemas.microsoft.com/office/drawing/2016/5/9/chartex" xmlns:cx4="http://schemas.microsoft.com/office/drawing/2016/5/10/chartex" xmlns:cx5="http://schemas.microsoft.com/office/drawing/2016/5/11/chartex" xmlns:cx6="http://schemas.microsoft.com/office/drawing/2016/5/12/chartex" xmlns:cx7="http://schemas.microsoft.com/office/drawing/2016/5/13/chartex" xmlns:cx8="http://schemas.microsoft.com/office/drawing/2016/5/14/chartex" xmlns:mc="http://schemas.openxmlformats.org/markup-compatibility/2006" xmlns:aink="http://schemas.microsoft.com/office/drawing/2016/ink" xmlns:am3d="http://schemas.microsoft.com/office/drawing/2017/model3d" xmlns:o="urn:schemas-microsoft-com:office:office" xmlns:oel="http://schemas.microsoft.com/office/2019/extlst" xmlns:r="http://schemas.openxmlformats.org/officeDocument/2006/relationships" xmlns:m="http://schemas.openxmlformats.org/officeDocument/2006/math" xmlns:v="urn:schemas-microsoft-com:vml" xmlns:wp14="http://schemas.microsoft.com/office/word/2010/wordprocessingDrawing" xmlns:wp="http://schemas.openxmlformats.org/drawingml/2006/wordprocessingDrawing" xmlns:w10="urn:schemas-microsoft-com:office:word" xmlns:w="http://schemas.openxmlformats.org/wordprocessingml/2006/main" xmlns:w14="http://schemas.microsoft.com/office/word/2010/wordml" xmlns:w15="http://schemas.microsoft.com/office/word/2012/wordml" xmlns:w16cex="http://schemas.microsoft.com/office/word/2018/wordml/cex" xmlns:w16cid="http://schemas.microsoft.com/office/word/2016/wordml/cid" xmlns:w16="http://schemas.microsoft.com/office/word/2018/wordml" xmlns:w16du="http://schemas.microsoft.com/office/word/2023/wordml/word16du" xmlns:w16sdtdh="http://schemas.microsoft.com/office/word/2020/wordml/sdtdatahash" xmlns:w16sdtfl="http://schemas.microsoft.com/office/word/2024/wordml/sdtformatlock" xmlns:w16se="http://schemas.microsoft.com/office/word/2015/wordml/symex" xmlns:wpg="http://schemas.microsoft.com/office/word/2010/wordprocessingGroup" xmlns:wpi="http://schemas.microsoft.com/office/word/2010/wordprocessingInk" xmlns:wne="http://schemas.microsoft.com/office/word/2006/wordml" xmlns:wps="http://schemas.microsoft.com/office/word/2010/wordprocessingShape" mc:Ignorable="w14 w15 w16se w16cid w16 w16cex w16sdtdh w16sdtfl w16du wp14">
   <w:body>
     <w:p>
-      <w:r>
-        <w:t>Multi-Asset Risk Dashboard and Portfolio:</w:t>
-      </w:r>
-      <w:r>
-        <w:t xml:space="preserve"> (INTRO PAGE, TOCs, …)</w:t>
-      </w:r>
-    </w:p>
-    <w:p>
+      <w:pPr>
+        <w:jc w:val="center"/>
+        <w:rPr>
+          <w:b/>
+          <w:bCs/>
+          <w:sz w:val="56"/>
+          <w:szCs w:val="56"/>
+        </w:rPr>
+      </w:pPr>
+    </w:p>
+    <w:p>
+      <w:pPr>
+        <w:jc w:val="center"/>
+        <w:rPr>
+          <w:b/>
+          <w:bCs/>
+          <w:sz w:val="56"/>
+          <w:szCs w:val="56"/>
+        </w:rPr>
+      </w:pPr>
+    </w:p>
+    <w:p>
+      <w:pPr>
+        <w:jc w:val="center"/>
+        <w:rPr>
+          <w:b/>
+          <w:bCs/>
+          <w:sz w:val="56"/>
+          <w:szCs w:val="56"/>
+        </w:rPr>
+      </w:pPr>
+      <w:r>
+        <w:rPr>
+          <w:b/>
+          <w:bCs/>
+          <w:sz w:val="56"/>
+          <w:szCs w:val="56"/>
+        </w:rPr>
+        <w:t>MULTI-ASSET PORTFOLIO OPTIMIZATION AND RISK DASHBOARD</w:t>
+      </w:r>
+    </w:p>
+    <w:p>
+      <w:pPr>
+        <w:jc w:val="center"/>
+        <w:rPr>
+          <w:b/>
+          <w:bCs/>
+          <w:sz w:val="56"/>
+          <w:szCs w:val="56"/>
+        </w:rPr>
+      </w:pPr>
+    </w:p>
+    <w:p>
+      <w:pPr>
+        <w:jc w:val="center"/>
+        <w:rPr>
+          <w:b/>
+          <w:bCs/>
+          <w:sz w:val="56"/>
+          <w:szCs w:val="56"/>
+        </w:rPr>
+      </w:pPr>
+    </w:p>
+    <w:p>
+      <w:pPr>
+        <w:jc w:val="center"/>
+        <w:rPr>
+          <w:sz w:val="40"/>
+          <w:szCs w:val="40"/>
+        </w:rPr>
+      </w:pPr>
+      <w:r>
+        <w:rPr>
+          <w:sz w:val="40"/>
+          <w:szCs w:val="40"/>
+        </w:rPr>
+        <w:t>Report by Kevin Fernandes</w:t>
+      </w:r>
+    </w:p>
+    <w:p/>
+    <w:p>
+      <w:r>
+        <w:br w:type="page"/>
+      </w:r>
+    </w:p>
+    <w:sdt>
+      <w:sdtPr>
+        <w:rPr>
+          <w:rFonts w:ascii="Calibri" w:eastAsiaTheme="minorHAnsi" w:hAnsi="Calibri" w:cs="Calibri"/>
+          <w:color w:val="auto"/>
+          <w:kern w:val="2"/>
+          <w:sz w:val="24"/>
+          <w:szCs w:val="24"/>
+          <w14:ligatures w14:val="standardContextual"/>
+        </w:rPr>
+        <w:id w:val="-1689437349"/>
+        <w:docPartObj>
+          <w:docPartGallery w:val="Table of Contents"/>
+          <w:docPartUnique/>
+        </w:docPartObj>
+      </w:sdtPr>
+      <w:sdtEndPr>
+        <w:rPr>
+          <w:b/>
+          <w:bCs/>
+          <w:noProof/>
+        </w:rPr>
+      </w:sdtEndPr>
+      <w:sdtContent>
+        <w:p>
+          <w:pPr>
+            <w:pStyle w:val="TOCHeading"/>
+          </w:pPr>
+          <w:r>
+            <w:t>Table of Contents</w:t>
+          </w:r>
+        </w:p>
+        <w:p>
+          <w:pPr>
+            <w:pStyle w:val="TOC1"/>
+            <w:tabs>
+              <w:tab w:val="right" w:leader="dot" w:pos="9016"/>
+            </w:tabs>
+            <w:rPr>
+              <w:noProof/>
+            </w:rPr>
+          </w:pPr>
+          <w:r>
+            <w:fldChar w:fldCharType="begin"/>
+          </w:r>
+          <w:r>
+            <w:instrText xml:space="preserve"> TOC \o "1-3" \h \z \u </w:instrText>
+          </w:r>
+          <w:r>
+            <w:fldChar w:fldCharType="separate"/>
+          </w:r>
+          <w:hyperlink w:anchor="_Toc239141829" w:history="1">
+            <w:r>
+              <w:rPr>
+                <w:rStyle w:val="Hyperlink"/>
+                <w:noProof/>
+              </w:rPr>
+              <w:t>Introduction</w:t>
+            </w:r>
+            <w:r>
+              <w:rPr>
+                <w:noProof/>
+                <w:webHidden/>
+              </w:rPr>
+              <w:tab/>
+            </w:r>
+            <w:r>
+              <w:rPr>
+                <w:noProof/>
+                <w:webHidden/>
+              </w:rPr>
+              <w:fldChar w:fldCharType="begin"/>
+            </w:r>
+            <w:r>
+              <w:rPr>
+                <w:noProof/>
+                <w:webHidden/>
+              </w:rPr>
+              <w:instrText xml:space="preserve"> PAGEREF _Toc239141829 \h </w:instrText>
+            </w:r>
+            <w:r>
+              <w:rPr>
+                <w:noProof/>
+                <w:webHidden/>
+              </w:rPr>
+            </w:r>
+            <w:r>
+              <w:rPr>
+                <w:noProof/>
+                <w:webHidden/>
+              </w:rPr>
+              <w:fldChar w:fldCharType="separate"/>
+            </w:r>
+            <w:r>
+              <w:rPr>
+                <w:noProof/>
+                <w:webHidden/>
+              </w:rPr>
+              <w:t>3</w:t>
+            </w:r>
+            <w:r>
+              <w:rPr>
+                <w:noProof/>
+                <w:webHidden/>
+              </w:rPr>
+              <w:fldChar w:fldCharType="end"/>
+            </w:r>
+          </w:hyperlink>
+        </w:p>
+        <w:p>
+          <w:pPr>
+            <w:pStyle w:val="TOC1"/>
+            <w:tabs>
+              <w:tab w:val="right" w:leader="dot" w:pos="9016"/>
+            </w:tabs>
+            <w:rPr>
+              <w:noProof/>
+            </w:rPr>
+          </w:pPr>
+          <w:hyperlink w:anchor="_Toc239141830" w:history="1">
+            <w:r>
+              <w:rPr>
+                <w:rStyle w:val="Hyperlink"/>
+                <w:noProof/>
+              </w:rPr>
+              <w:t>Asset and Data Selection</w:t>
+            </w:r>
+            <w:r>
+              <w:rPr>
+                <w:noProof/>
+                <w:webHidden/>
+              </w:rPr>
+              <w:tab/>
+            </w:r>
+            <w:r>
+              <w:rPr>
+                <w:noProof/>
+                <w:webHidden/>
+              </w:rPr>
+              <w:fldChar w:fldCharType="begin"/>
+            </w:r>
+            <w:r>
+              <w:rPr>
+                <w:noProof/>
+                <w:webHidden/>
+              </w:rPr>
+              <w:instrText xml:space="preserve"> PAGEREF _Toc239141830 \h </w:instrText>
+            </w:r>
+            <w:r>
+              <w:rPr>
+                <w:noProof/>
+                <w:webHidden/>
+              </w:rPr>
+            </w:r>
+            <w:r>
+              <w:rPr>
+                <w:noProof/>
+                <w:webHidden/>
+              </w:rPr>
+              <w:fldChar w:fldCharType="separate"/>
+            </w:r>
+            <w:r>
+              <w:rPr>
+                <w:noProof/>
+                <w:webHidden/>
+              </w:rPr>
+              <w:t>4</w:t>
+            </w:r>
+            <w:r>
+              <w:rPr>
+                <w:noProof/>
+                <w:webHidden/>
+              </w:rPr>
+              <w:fldChar w:fldCharType="end"/>
+            </w:r>
+          </w:hyperlink>
+        </w:p>
+        <w:p>
+          <w:pPr>
+            <w:pStyle w:val="TOC2"/>
+            <w:tabs>
+              <w:tab w:val="right" w:leader="dot" w:pos="9016"/>
+            </w:tabs>
+            <w:rPr>
+              <w:noProof/>
+            </w:rPr>
+          </w:pPr>
+          <w:hyperlink w:anchor="_Toc239141831" w:history="1">
+            <w:r>
+              <w:rPr>
+                <w:rStyle w:val="Hyperlink"/>
+                <w:noProof/>
+              </w:rPr>
+              <w:t>Asset Choice</w:t>
+            </w:r>
+            <w:r>
+              <w:rPr>
+                <w:noProof/>
+                <w:webHidden/>
+              </w:rPr>
+              <w:tab/>
+            </w:r>
+            <w:r>
+              <w:rPr>
+                <w:noProof/>
+                <w:webHidden/>
+              </w:rPr>
+              <w:fldChar w:fldCharType="begin"/>
+            </w:r>
+            <w:r>
+              <w:rPr>
+                <w:noProof/>
+                <w:webHidden/>
+              </w:rPr>
+              <w:instrText xml:space="preserve"> PAGEREF _Toc239141831 \h </w:instrText>
+            </w:r>
+            <w:r>
+              <w:rPr>
+                <w:noProof/>
+                <w:webHidden/>
+              </w:rPr>
+            </w:r>
+            <w:r>
+              <w:rPr>
+                <w:noProof/>
+                <w:webHidden/>
+              </w:rPr>
+              <w:fldChar w:fldCharType="separate"/>
+            </w:r>
+            <w:r>
+              <w:rPr>
+                <w:noProof/>
+                <w:webHidden/>
+              </w:rPr>
+              <w:t>4</w:t>
+            </w:r>
+            <w:r>
+              <w:rPr>
+                <w:noProof/>
+                <w:webHidden/>
+              </w:rPr>
+              <w:fldChar w:fldCharType="end"/>
+            </w:r>
+          </w:hyperlink>
+        </w:p>
+        <w:p>
+          <w:pPr>
+            <w:pStyle w:val="TOC2"/>
+            <w:tabs>
+              <w:tab w:val="right" w:leader="dot" w:pos="9016"/>
+            </w:tabs>
+            <w:rPr>
+              <w:noProof/>
+            </w:rPr>
+          </w:pPr>
+          <w:hyperlink w:anchor="_Toc239141832" w:history="1">
+            <w:r>
+              <w:rPr>
+                <w:rStyle w:val="Hyperlink"/>
+                <w:noProof/>
+              </w:rPr>
+              <w:t>Selection of Data</w:t>
+            </w:r>
+            <w:r>
+              <w:rPr>
+                <w:noProof/>
+                <w:webHidden/>
+              </w:rPr>
+              <w:tab/>
+            </w:r>
+            <w:r>
+              <w:rPr>
+                <w:noProof/>
+                <w:webHidden/>
+              </w:rPr>
+              <w:fldChar w:fldCharType="begin"/>
+            </w:r>
+            <w:r>
+              <w:rPr>
+                <w:noProof/>
+                <w:webHidden/>
+              </w:rPr>
+              <w:instrText xml:space="preserve"> PAGEREF _Toc239141832 \h </w:instrText>
+            </w:r>
+            <w:r>
+              <w:rPr>
+                <w:noProof/>
+                <w:webHidden/>
+              </w:rPr>
+            </w:r>
+            <w:r>
+              <w:rPr>
+                <w:noProof/>
+                <w:webHidden/>
+              </w:rPr>
+              <w:fldChar w:fldCharType="separate"/>
+            </w:r>
+            <w:r>
+              <w:rPr>
+                <w:noProof/>
+                <w:webHidden/>
+              </w:rPr>
+              <w:t>6</w:t>
+            </w:r>
+            <w:r>
+              <w:rPr>
+                <w:noProof/>
+                <w:webHidden/>
+              </w:rPr>
+              <w:fldChar w:fldCharType="end"/>
+            </w:r>
+          </w:hyperlink>
+        </w:p>
+        <w:p>
+          <w:pPr>
+            <w:pStyle w:val="TOC2"/>
+            <w:tabs>
+              <w:tab w:val="right" w:leader="dot" w:pos="9016"/>
+            </w:tabs>
+            <w:rPr>
+              <w:noProof/>
+            </w:rPr>
+          </w:pPr>
+          <w:hyperlink w:anchor="_Toc239141833" w:history="1">
+            <w:r>
+              <w:rPr>
+                <w:rStyle w:val="Hyperlink"/>
+                <w:noProof/>
+              </w:rPr>
+              <w:t>Metric Assumptions</w:t>
+            </w:r>
+            <w:r>
+              <w:rPr>
+                <w:noProof/>
+                <w:webHidden/>
+              </w:rPr>
+              <w:tab/>
+            </w:r>
+            <w:r>
+              <w:rPr>
+                <w:noProof/>
+                <w:webHidden/>
+              </w:rPr>
+              <w:fldChar w:fldCharType="begin"/>
+            </w:r>
+            <w:r>
+              <w:rPr>
+                <w:noProof/>
+                <w:webHidden/>
+              </w:rPr>
+              <w:instrText xml:space="preserve"> PAGEREF _Toc239141833 \h </w:instrText>
+            </w:r>
+            <w:r>
+              <w:rPr>
+                <w:noProof/>
+                <w:webHidden/>
+              </w:rPr>
+            </w:r>
+            <w:r>
+              <w:rPr>
+                <w:noProof/>
+                <w:webHidden/>
+              </w:rPr>
+              <w:fldChar w:fldCharType="separate"/>
+            </w:r>
+            <w:r>
+              <w:rPr>
+                <w:noProof/>
+                <w:webHidden/>
+              </w:rPr>
+              <w:t>6</w:t>
+            </w:r>
+            <w:r>
+              <w:rPr>
+                <w:noProof/>
+                <w:webHidden/>
+              </w:rPr>
+              <w:fldChar w:fldCharType="end"/>
+            </w:r>
+          </w:hyperlink>
+        </w:p>
+        <w:p>
+          <w:pPr>
+            <w:pStyle w:val="TOC2"/>
+            <w:tabs>
+              <w:tab w:val="right" w:leader="dot" w:pos="9016"/>
+            </w:tabs>
+            <w:rPr>
+              <w:noProof/>
+            </w:rPr>
+          </w:pPr>
+          <w:hyperlink w:anchor="_Toc239141834" w:history="1">
+            <w:r>
+              <w:rPr>
+                <w:rStyle w:val="Hyperlink"/>
+                <w:noProof/>
+              </w:rPr>
+              <w:t>Portfolio Code</w:t>
+            </w:r>
+            <w:r>
+              <w:rPr>
+                <w:noProof/>
+                <w:webHidden/>
+              </w:rPr>
+              <w:tab/>
+            </w:r>
+            <w:r>
+              <w:rPr>
+                <w:noProof/>
+                <w:webHidden/>
+              </w:rPr>
+              <w:fldChar w:fldCharType="begin"/>
+            </w:r>
+            <w:r>
+              <w:rPr>
+                <w:noProof/>
+                <w:webHidden/>
+              </w:rPr>
+              <w:instrText xml:space="preserve"> PAGEREF _Toc239141834 \h </w:instrText>
+            </w:r>
+            <w:r>
+              <w:rPr>
+                <w:noProof/>
+                <w:webHidden/>
+              </w:rPr>
+            </w:r>
+            <w:r>
+              <w:rPr>
+                <w:noProof/>
+                <w:webHidden/>
+              </w:rPr>
+              <w:fldChar w:fldCharType="separate"/>
+            </w:r>
+            <w:r>
+              <w:rPr>
+                <w:noProof/>
+                <w:webHidden/>
+              </w:rPr>
+              <w:t>7</w:t>
+            </w:r>
+            <w:r>
+              <w:rPr>
+                <w:noProof/>
+                <w:webHidden/>
+              </w:rPr>
+              <w:fldChar w:fldCharType="end"/>
+            </w:r>
+          </w:hyperlink>
+        </w:p>
+        <w:p>
+          <w:pPr>
+            <w:pStyle w:val="TOC1"/>
+            <w:tabs>
+              <w:tab w:val="right" w:leader="dot" w:pos="9016"/>
+            </w:tabs>
+            <w:rPr>
+              <w:noProof/>
+            </w:rPr>
+          </w:pPr>
+          <w:hyperlink w:anchor="_Toc239141835" w:history="1">
+            <w:r>
+              <w:rPr>
+                <w:rStyle w:val="Hyperlink"/>
+                <w:noProof/>
+              </w:rPr>
+              <w:t>Black-Litterman Model (BLO)</w:t>
+            </w:r>
+            <w:r>
+              <w:rPr>
+                <w:noProof/>
+                <w:webHidden/>
+              </w:rPr>
+              <w:tab/>
+            </w:r>
+            <w:r>
+              <w:rPr>
+                <w:noProof/>
+                <w:webHidden/>
+              </w:rPr>
+              <w:fldChar w:fldCharType="begin"/>
+            </w:r>
+            <w:r>
+              <w:rPr>
+                <w:noProof/>
+                <w:webHidden/>
+              </w:rPr>
+              <w:instrText xml:space="preserve"> PAGEREF _Toc239141835 \h </w:instrText>
+            </w:r>
+            <w:r>
+              <w:rPr>
+                <w:noProof/>
+                <w:webHidden/>
+              </w:rPr>
+            </w:r>
+            <w:r>
+              <w:rPr>
+                <w:noProof/>
+                <w:webHidden/>
+              </w:rPr>
+              <w:fldChar w:fldCharType="separate"/>
+            </w:r>
+            <w:r>
+              <w:rPr>
+                <w:noProof/>
+                <w:webHidden/>
+              </w:rPr>
+              <w:t>7</w:t>
+            </w:r>
+            <w:r>
+              <w:rPr>
+                <w:noProof/>
+                <w:webHidden/>
+              </w:rPr>
+              <w:fldChar w:fldCharType="end"/>
+            </w:r>
+          </w:hyperlink>
+        </w:p>
+        <w:p>
+          <w:pPr>
+            <w:pStyle w:val="TOC2"/>
+            <w:tabs>
+              <w:tab w:val="right" w:leader="dot" w:pos="9016"/>
+            </w:tabs>
+            <w:rPr>
+              <w:noProof/>
+            </w:rPr>
+          </w:pPr>
+          <w:hyperlink w:anchor="_Toc239141836" w:history="1">
+            <w:r>
+              <w:rPr>
+                <w:rStyle w:val="Hyperlink"/>
+                <w:noProof/>
+              </w:rPr>
+              <w:t>Black-Litterman Metrics</w:t>
+            </w:r>
+            <w:r>
+              <w:rPr>
+                <w:noProof/>
+                <w:webHidden/>
+              </w:rPr>
+              <w:tab/>
+            </w:r>
+            <w:r>
+              <w:rPr>
+                <w:noProof/>
+                <w:webHidden/>
+              </w:rPr>
+              <w:fldChar w:fldCharType="begin"/>
+            </w:r>
+            <w:r>
+              <w:rPr>
+                <w:noProof/>
+                <w:webHidden/>
+              </w:rPr>
+              <w:instrText xml:space="preserve"> PAGEREF _Toc239141836 \h </w:instrText>
+            </w:r>
+            <w:r>
+              <w:rPr>
+                <w:noProof/>
+                <w:webHidden/>
+              </w:rPr>
+            </w:r>
+            <w:r>
+              <w:rPr>
+                <w:noProof/>
+                <w:webHidden/>
+              </w:rPr>
+              <w:fldChar w:fldCharType="separate"/>
+            </w:r>
+            <w:r>
+              <w:rPr>
+                <w:noProof/>
+                <w:webHidden/>
+              </w:rPr>
+              <w:t>8</w:t>
+            </w:r>
+            <w:r>
+              <w:rPr>
+                <w:noProof/>
+                <w:webHidden/>
+              </w:rPr>
+              <w:fldChar w:fldCharType="end"/>
+            </w:r>
+          </w:hyperlink>
+        </w:p>
+        <w:p>
+          <w:pPr>
+            <w:pStyle w:val="TOC2"/>
+            <w:tabs>
+              <w:tab w:val="right" w:leader="dot" w:pos="9016"/>
+            </w:tabs>
+            <w:rPr>
+              <w:noProof/>
+            </w:rPr>
+          </w:pPr>
+          <w:hyperlink w:anchor="_Toc239141837" w:history="1">
+            <w:r>
+              <w:rPr>
+                <w:rStyle w:val="Hyperlink"/>
+                <w:noProof/>
+              </w:rPr>
+              <w:t>Black-Litterman Observations</w:t>
+            </w:r>
+            <w:r>
+              <w:rPr>
+                <w:noProof/>
+                <w:webHidden/>
+              </w:rPr>
+              <w:tab/>
+            </w:r>
+            <w:r>
+              <w:rPr>
+                <w:noProof/>
+                <w:webHidden/>
+              </w:rPr>
+              <w:fldChar w:fldCharType="begin"/>
+            </w:r>
+            <w:r>
+              <w:rPr>
+                <w:noProof/>
+                <w:webHidden/>
+              </w:rPr>
+              <w:instrText xml:space="preserve"> PAGEREF _Toc239141837 \h </w:instrText>
+            </w:r>
+            <w:r>
+              <w:rPr>
+                <w:noProof/>
+                <w:webHidden/>
+              </w:rPr>
+            </w:r>
+            <w:r>
+              <w:rPr>
+                <w:noProof/>
+                <w:webHidden/>
+              </w:rPr>
+              <w:fldChar w:fldCharType="separate"/>
+            </w:r>
+            <w:r>
+              <w:rPr>
+                <w:noProof/>
+                <w:webHidden/>
+              </w:rPr>
+              <w:t>8</w:t>
+            </w:r>
+            <w:r>
+              <w:rPr>
+                <w:noProof/>
+                <w:webHidden/>
+              </w:rPr>
+              <w:fldChar w:fldCharType="end"/>
+            </w:r>
+          </w:hyperlink>
+        </w:p>
+        <w:p>
+          <w:pPr>
+            <w:pStyle w:val="TOC3"/>
+            <w:tabs>
+              <w:tab w:val="right" w:leader="dot" w:pos="9016"/>
+            </w:tabs>
+            <w:rPr>
+              <w:noProof/>
+            </w:rPr>
+          </w:pPr>
+          <w:hyperlink w:anchor="_Toc239141838" w:history="1">
+            <w:r>
+              <w:rPr>
+                <w:rStyle w:val="Hyperlink"/>
+                <w:noProof/>
+              </w:rPr>
+              <w:t>Summary of Observations</w:t>
+            </w:r>
+            <w:r>
+              <w:rPr>
+                <w:noProof/>
+                <w:webHidden/>
+              </w:rPr>
+              <w:tab/>
+            </w:r>
+            <w:r>
+              <w:rPr>
+                <w:noProof/>
+                <w:webHidden/>
+              </w:rPr>
+              <w:fldChar w:fldCharType="begin"/>
+            </w:r>
+            <w:r>
+              <w:rPr>
+                <w:noProof/>
+                <w:webHidden/>
+              </w:rPr>
+              <w:instrText xml:space="preserve"> PAGEREF _Toc239141838 \h </w:instrText>
+            </w:r>
+            <w:r>
+              <w:rPr>
+                <w:noProof/>
+                <w:webHidden/>
+              </w:rPr>
+            </w:r>
+            <w:r>
+              <w:rPr>
+                <w:noProof/>
+                <w:webHidden/>
+              </w:rPr>
+              <w:fldChar w:fldCharType="separate"/>
+            </w:r>
+            <w:r>
+              <w:rPr>
+                <w:noProof/>
+                <w:webHidden/>
+              </w:rPr>
+              <w:t>8</w:t>
+            </w:r>
+            <w:r>
+              <w:rPr>
+                <w:noProof/>
+                <w:webHidden/>
+              </w:rPr>
+              <w:fldChar w:fldCharType="end"/>
+            </w:r>
+          </w:hyperlink>
+        </w:p>
+        <w:p>
+          <w:pPr>
+            <w:pStyle w:val="TOC3"/>
+            <w:tabs>
+              <w:tab w:val="right" w:leader="dot" w:pos="9016"/>
+            </w:tabs>
+            <w:rPr>
+              <w:noProof/>
+            </w:rPr>
+          </w:pPr>
+          <w:hyperlink w:anchor="_Toc239141839" w:history="1">
+            <w:r>
+              <w:rPr>
+                <w:rStyle w:val="Hyperlink"/>
+                <w:noProof/>
+              </w:rPr>
+              <w:t>Portfolio Weights</w:t>
+            </w:r>
+            <w:r>
+              <w:rPr>
+                <w:noProof/>
+                <w:webHidden/>
+              </w:rPr>
+              <w:tab/>
+            </w:r>
+            <w:r>
+              <w:rPr>
+                <w:noProof/>
+                <w:webHidden/>
+              </w:rPr>
+              <w:fldChar w:fldCharType="begin"/>
+            </w:r>
+            <w:r>
+              <w:rPr>
+                <w:noProof/>
+                <w:webHidden/>
+              </w:rPr>
+              <w:instrText xml:space="preserve"> PAGEREF _Toc239141839 \h </w:instrText>
+            </w:r>
+            <w:r>
+              <w:rPr>
+                <w:noProof/>
+                <w:webHidden/>
+              </w:rPr>
+            </w:r>
+            <w:r>
+              <w:rPr>
+                <w:noProof/>
+                <w:webHidden/>
+              </w:rPr>
+              <w:fldChar w:fldCharType="separate"/>
+            </w:r>
+            <w:r>
+              <w:rPr>
+                <w:noProof/>
+                <w:webHidden/>
+              </w:rPr>
+              <w:t>9</w:t>
+            </w:r>
+            <w:r>
+              <w:rPr>
+                <w:noProof/>
+                <w:webHidden/>
+              </w:rPr>
+              <w:fldChar w:fldCharType="end"/>
+            </w:r>
+          </w:hyperlink>
+        </w:p>
+        <w:p>
+          <w:pPr>
+            <w:pStyle w:val="TOC2"/>
+            <w:tabs>
+              <w:tab w:val="right" w:leader="dot" w:pos="9016"/>
+            </w:tabs>
+            <w:rPr>
+              <w:noProof/>
+            </w:rPr>
+          </w:pPr>
+          <w:hyperlink w:anchor="_Toc239141840" w:history="1">
+            <w:r>
+              <w:rPr>
+                <w:rStyle w:val="Hyperlink"/>
+                <w:noProof/>
+              </w:rPr>
+              <w:t>Drawdown</w:t>
+            </w:r>
+            <w:r>
+              <w:rPr>
+                <w:noProof/>
+                <w:webHidden/>
+              </w:rPr>
+              <w:tab/>
+            </w:r>
+            <w:r>
+              <w:rPr>
+                <w:noProof/>
+                <w:webHidden/>
+              </w:rPr>
+              <w:fldChar w:fldCharType="begin"/>
+            </w:r>
+            <w:r>
+              <w:rPr>
+                <w:noProof/>
+                <w:webHidden/>
+              </w:rPr>
+              <w:instrText xml:space="preserve"> PAGEREF _Toc239141840 \h </w:instrText>
+            </w:r>
+            <w:r>
+              <w:rPr>
+                <w:noProof/>
+                <w:webHidden/>
+              </w:rPr>
+            </w:r>
+            <w:r>
+              <w:rPr>
+                <w:noProof/>
+                <w:webHidden/>
+              </w:rPr>
+              <w:fldChar w:fldCharType="separate"/>
+            </w:r>
+            <w:r>
+              <w:rPr>
+                <w:noProof/>
+                <w:webHidden/>
+              </w:rPr>
+              <w:t>10</w:t>
+            </w:r>
+            <w:r>
+              <w:rPr>
+                <w:noProof/>
+                <w:webHidden/>
+              </w:rPr>
+              <w:fldChar w:fldCharType="end"/>
+            </w:r>
+          </w:hyperlink>
+        </w:p>
+        <w:p>
+          <w:pPr>
+            <w:pStyle w:val="TOC2"/>
+            <w:tabs>
+              <w:tab w:val="right" w:leader="dot" w:pos="9016"/>
+            </w:tabs>
+            <w:rPr>
+              <w:noProof/>
+            </w:rPr>
+          </w:pPr>
+          <w:hyperlink w:anchor="_Toc239141841" w:history="1">
+            <w:r>
+              <w:rPr>
+                <w:rStyle w:val="Hyperlink"/>
+                <w:noProof/>
+              </w:rPr>
+              <w:t>References</w:t>
+            </w:r>
+            <w:r>
+              <w:rPr>
+                <w:noProof/>
+                <w:webHidden/>
+              </w:rPr>
+              <w:tab/>
+            </w:r>
+            <w:r>
+              <w:rPr>
+                <w:noProof/>
+                <w:webHidden/>
+              </w:rPr>
+              <w:fldChar w:fldCharType="begin"/>
+            </w:r>
+            <w:r>
+              <w:rPr>
+                <w:noProof/>
+                <w:webHidden/>
+              </w:rPr>
+              <w:instrText xml:space="preserve"> PAGEREF _Toc239141841 \h </w:instrText>
+            </w:r>
+            <w:r>
+              <w:rPr>
+                <w:noProof/>
+                <w:webHidden/>
+              </w:rPr>
+            </w:r>
+            <w:r>
+              <w:rPr>
+                <w:noProof/>
+                <w:webHidden/>
+              </w:rPr>
+              <w:fldChar w:fldCharType="separate"/>
+            </w:r>
+            <w:r>
+              <w:rPr>
+                <w:noProof/>
+                <w:webHidden/>
+              </w:rPr>
+              <w:t>11</w:t>
+            </w:r>
+            <w:r>
+              <w:rPr>
+                <w:noProof/>
+                <w:webHidden/>
+              </w:rPr>
+              <w:fldChar w:fldCharType="end"/>
+            </w:r>
+          </w:hyperlink>
+        </w:p>
+        <w:p>
+          <w:pPr>
+            <w:pStyle w:val="TOC2"/>
+            <w:tabs>
+              <w:tab w:val="right" w:leader="dot" w:pos="9016"/>
+            </w:tabs>
+            <w:rPr>
+              <w:noProof/>
+            </w:rPr>
+          </w:pPr>
+          <w:hyperlink w:anchor="_Toc239141842" w:history="1">
+            <w:r>
+              <w:rPr>
+                <w:rStyle w:val="Hyperlink"/>
+                <w:noProof/>
+              </w:rPr>
+              <w:t>Appendix</w:t>
+            </w:r>
+            <w:r>
+              <w:rPr>
+                <w:noProof/>
+                <w:webHidden/>
+              </w:rPr>
+              <w:tab/>
+            </w:r>
+            <w:r>
+              <w:rPr>
+                <w:noProof/>
+                <w:webHidden/>
+              </w:rPr>
+              <w:fldChar w:fldCharType="begin"/>
+            </w:r>
+            <w:r>
+              <w:rPr>
+                <w:noProof/>
+                <w:webHidden/>
+              </w:rPr>
+              <w:instrText xml:space="preserve"> PAGEREF _Toc239141842 \h </w:instrText>
+            </w:r>
+            <w:r>
+              <w:rPr>
+                <w:noProof/>
+                <w:webHidden/>
+              </w:rPr>
+            </w:r>
+            <w:r>
+              <w:rPr>
+                <w:noProof/>
+                <w:webHidden/>
+              </w:rPr>
+              <w:fldChar w:fldCharType="separate"/>
+            </w:r>
+            <w:r>
+              <w:rPr>
+                <w:noProof/>
+                <w:webHidden/>
+              </w:rPr>
+              <w:t>12</w:t>
+            </w:r>
+            <w:r>
+              <w:rPr>
+                <w:noProof/>
+                <w:webHidden/>
+              </w:rPr>
+              <w:fldChar w:fldCharType="end"/>
+            </w:r>
+          </w:hyperlink>
+        </w:p>
+        <w:p>
+          <w:r>
+            <w:rPr>
+              <w:b/>
+              <w:bCs/>
+              <w:noProof/>
+            </w:rPr>
+            <w:fldChar w:fldCharType="end"/>
+          </w:r>
+        </w:p>
+      </w:sdtContent>
+    </w:sdt>
+    <w:p/>
+    <w:p>
+      <w:r>
+        <w:br w:type="page"/>
+      </w:r>
+    </w:p>
+    <w:p>
+      <w:r>
+        <w:lastRenderedPageBreak/>
+        <w:fldChar w:fldCharType="begin"/>
+      </w:r>
+      <w:r>
+        <w:instrText xml:space="preserve"> TOC \h \z \c "Figure" </w:instrText>
+      </w:r>
+      <w:r>
+        <w:fldChar w:fldCharType="separate"/>
+      </w:r>
+      <w:r>
+        <w:rPr>
+          <w:b/>
+          <w:bCs/>
+          <w:noProof/>
+        </w:rPr>
+        <w:t>No table of figures entries found.</w:t>
+      </w:r>
+      <w:r>
+        <w:fldChar w:fldCharType="end"/>
+      </w:r>
+    </w:p>
+    <w:p/>
+    <w:p>
+      <w:r>
+        <w:br w:type="page"/>
+      </w:r>
+    </w:p>
+    <w:p>
+      <w:r>
+        <w:lastRenderedPageBreak/>
+        <w:fldChar w:fldCharType="begin"/>
+      </w:r>
+      <w:r>
+        <w:instrText xml:space="preserve"> TOC \h \z \c "Table" </w:instrText>
+      </w:r>
+      <w:r>
+        <w:fldChar w:fldCharType="separate"/>
+      </w:r>
+      <w:r>
+        <w:rPr>
+          <w:b/>
+          <w:bCs/>
+          <w:noProof/>
+        </w:rPr>
+        <w:t>No table of figures entries found.</w:t>
+      </w:r>
+      <w:r>
+        <w:fldChar w:fldCharType="end"/>
+      </w:r>
       <w:r>
         <w:br w:type="page"/>
       </w:r>
@@ -22,6 +1161,7 @@
           <w:rFonts w:ascii="Calibri" w:hAnsi="Calibri" w:cs="Calibri"/>
         </w:rPr>
       </w:pPr>
+      <w:bookmarkStart w:id="0" w:name="_Toc239141829"/>
       <w:r>
         <w:rPr>
           <w:rFonts w:ascii="Calibri" w:hAnsi="Calibri" w:cs="Calibri"/>
@@ -29,6 +1169,7 @@
         <w:lastRenderedPageBreak/>
         <w:t>Introduction</w:t>
       </w:r>
+      <w:bookmarkEnd w:id="0"/>
     </w:p>
     <w:p>
       <w:r>
@@ -291,20 +1432,24 @@
       <w:pPr>
         <w:pStyle w:val="Heading1"/>
       </w:pPr>
+      <w:bookmarkStart w:id="1" w:name="_Toc239141830"/>
       <w:r>
         <w:t xml:space="preserve">Asset </w:t>
       </w:r>
       <w:r>
         <w:t>and Data Selection</w:t>
       </w:r>
+      <w:bookmarkEnd w:id="1"/>
     </w:p>
     <w:p>
       <w:pPr>
         <w:pStyle w:val="Heading2"/>
       </w:pPr>
+      <w:bookmarkStart w:id="2" w:name="_Toc239141831"/>
       <w:r>
         <w:t>Asset Choice</w:t>
       </w:r>
+      <w:bookmarkEnd w:id="2"/>
     </w:p>
     <w:p>
       <w:r>
@@ -1476,12 +2621,14 @@
           <w:rFonts w:ascii="Calibri" w:hAnsi="Calibri" w:cs="Calibri"/>
         </w:rPr>
       </w:pPr>
+      <w:bookmarkStart w:id="3" w:name="_Toc239141832"/>
       <w:r>
         <w:rPr>
           <w:rFonts w:ascii="Calibri" w:hAnsi="Calibri" w:cs="Calibri"/>
         </w:rPr>
         <w:t>Selection of Data</w:t>
       </w:r>
+      <w:bookmarkEnd w:id="3"/>
     </w:p>
     <w:p>
       <w:r>
@@ -1898,12 +3045,14 @@
           <w:rFonts w:ascii="Calibri" w:eastAsiaTheme="minorEastAsia" w:hAnsi="Calibri" w:cs="Calibri"/>
         </w:rPr>
       </w:pPr>
+      <w:bookmarkStart w:id="4" w:name="_Toc239141833"/>
       <w:r>
         <w:rPr>
           <w:rFonts w:ascii="Calibri" w:eastAsiaTheme="minorEastAsia" w:hAnsi="Calibri" w:cs="Calibri"/>
         </w:rPr>
         <w:t>Metric Assumptions</w:t>
       </w:r>
+      <w:bookmarkEnd w:id="4"/>
     </w:p>
     <w:p>
       <w:r>
@@ -1962,10 +3111,12 @@
       <w:pPr>
         <w:pStyle w:val="Heading2"/>
       </w:pPr>
+      <w:bookmarkStart w:id="5" w:name="_Toc239141834"/>
       <w:r>
         <w:lastRenderedPageBreak/>
         <w:t>Portfolio Code</w:t>
       </w:r>
+      <w:bookmarkEnd w:id="5"/>
     </w:p>
     <w:p>
       <w:r>
@@ -1979,12 +3130,14 @@
       <w:pPr>
         <w:pStyle w:val="Heading1"/>
       </w:pPr>
+      <w:bookmarkStart w:id="6" w:name="_Toc239141835"/>
       <w:r>
         <w:t>Black-Litterman Model</w:t>
       </w:r>
       <w:r>
         <w:t xml:space="preserve"> (BLO)</w:t>
       </w:r>
+      <w:bookmarkEnd w:id="6"/>
     </w:p>
     <w:p>
       <w:r>
@@ -2514,12 +3667,14 @@
           <w:rFonts w:eastAsiaTheme="minorEastAsia"/>
         </w:rPr>
       </w:pPr>
+      <w:bookmarkStart w:id="7" w:name="_Toc239141836"/>
       <w:r>
         <w:rPr>
           <w:rFonts w:eastAsiaTheme="minorEastAsia"/>
         </w:rPr>
         <w:t>Black-Litterman Metrics</w:t>
       </w:r>
+      <w:bookmarkEnd w:id="7"/>
     </w:p>
     <w:p>
       <w:r>
@@ -2572,16 +3727,26 @@
         <w:t xml:space="preserve">These values were considered to reflect on my </w:t>
       </w:r>
       <w:r>
-        <w:t xml:space="preserve">views holding moderate weight, given the instability of the geopolitical situation, and the assumption that no Black Swan events occur in the near future, which may hamper the economy. </w:t>
+        <w:t xml:space="preserve">views holding moderate weight, given the instability of the geopolitical situation, and the assumption that no Black Swan events occur </w:t>
+      </w:r>
+      <w:proofErr w:type="gramStart"/>
+      <w:r>
+        <w:t>in the near future</w:t>
+      </w:r>
+      <w:proofErr w:type="gramEnd"/>
+      <w:r>
+        <w:t xml:space="preserve">, which may hamper the economy. </w:t>
       </w:r>
     </w:p>
     <w:p>
       <w:pPr>
         <w:pStyle w:val="Heading2"/>
       </w:pPr>
+      <w:bookmarkStart w:id="8" w:name="_Toc239141837"/>
       <w:r>
         <w:t>Black-Litterman Observations</w:t>
       </w:r>
+      <w:bookmarkEnd w:id="8"/>
     </w:p>
     <w:p>
       <w:r>
@@ -2598,9 +3763,11 @@
       <w:pPr>
         <w:pStyle w:val="Heading3"/>
       </w:pPr>
+      <w:bookmarkStart w:id="9" w:name="_Toc239141838"/>
       <w:r>
         <w:t>Summary of Observations</w:t>
       </w:r>
+      <w:bookmarkEnd w:id="9"/>
     </w:p>
     <w:p>
       <w:r>
@@ -3496,7 +4663,13 @@
             <w:rPr>
               <w:rFonts w:ascii="Cambria Math" w:hAnsi="Cambria Math"/>
             </w:rPr>
-            <m:t xml:space="preserve">-1=371.19% </m:t>
+            <m:t>-</m:t>
+          </m:r>
+          <m:r>
+            <w:rPr>
+              <w:rFonts w:ascii="Cambria Math" w:hAnsi="Cambria Math"/>
+            </w:rPr>
+            <m:t xml:space="preserve">1=371.19% </m:t>
           </m:r>
         </m:oMath>
       </m:oMathPara>
@@ -3779,12 +4952,14 @@
           <w:rFonts w:eastAsiaTheme="minorEastAsia"/>
         </w:rPr>
       </w:pPr>
+      <w:bookmarkStart w:id="10" w:name="_Toc239141839"/>
       <w:r>
         <w:rPr>
           <w:rFonts w:eastAsiaTheme="minorEastAsia"/>
         </w:rPr>
         <w:t>Portfolio Weights</w:t>
       </w:r>
+      <w:bookmarkEnd w:id="10"/>
     </w:p>
     <w:p>
       <w:r>
@@ -4583,10 +5758,12 @@
       <w:pPr>
         <w:pStyle w:val="Heading2"/>
       </w:pPr>
+      <w:bookmarkStart w:id="11" w:name="_Toc239141840"/>
       <w:r>
         <w:lastRenderedPageBreak/>
         <w:t>Drawdown</w:t>
       </w:r>
+      <w:bookmarkEnd w:id="11"/>
     </w:p>
     <w:p>
       <w:r>
@@ -5715,11 +6892,16 @@
     <w:p/>
     <w:p>
       <w:r>
-        <w:t>The worst drawdown</w:t>
+        <w:t xml:space="preserve">The worst </w:t>
+      </w:r>
+      <w:proofErr w:type="gramStart"/>
+      <w:r>
+        <w:t>drawdown</w:t>
       </w:r>
       <w:r>
         <w:t xml:space="preserve"> period</w:t>
       </w:r>
+      <w:proofErr w:type="gramEnd"/>
       <w:r>
         <w:t xml:space="preserve"> was due to the supply chain crisis that occurred right after the peak of the pandemic, coupled with rising inflation. The second and fourth worst drawdown</w:t>
       </w:r>
@@ -5738,9 +6920,693 @@
     </w:p>
     <w:p>
       <w:r>
-        <w:t xml:space="preserve">Additionally, the worst month in terms of month-by-month return was September 2022, with a monthly return of -13.91%. </w:t>
-      </w:r>
-    </w:p>
+        <w:t>Additionally, the worst month in terms of month-by-month return was September 2022, with a monthly return of -13.91%</w:t>
+      </w:r>
+      <w:r>
+        <w:t>, for reasons mentioned previously.</w:t>
+      </w:r>
+    </w:p>
+    <w:p>
+      <w:pPr>
+        <w:pStyle w:val="Heading2"/>
+      </w:pPr>
+      <w:r>
+        <w:t>Risk Analysis</w:t>
+      </w:r>
+    </w:p>
+    <w:p>
+      <w:r>
+        <w:t>The following table below outlines important metrics pertaining to risk</w:t>
+      </w:r>
+      <w:r>
+        <w:t>. Note that the following values calculated were from the latest rolling period of the final month (i.e. May 2026):</w:t>
+      </w:r>
+    </w:p>
+    <w:tbl>
+      <w:tblPr>
+        <w:tblStyle w:val="TableGrid"/>
+        <w:tblW w:w="0" w:type="auto"/>
+        <w:tblLook w:val="04A0" w:firstRow="1" w:lastRow="0" w:firstColumn="1" w:lastColumn="0" w:noHBand="0" w:noVBand="1"/>
+      </w:tblPr>
+      <w:tblGrid>
+        <w:gridCol w:w="4508"/>
+        <w:gridCol w:w="4508"/>
+      </w:tblGrid>
+      <w:tr>
+        <w:tc>
+          <w:tcPr>
+            <w:tcW w:w="4508" w:type="dxa"/>
+          </w:tcPr>
+          <w:p>
+            <w:pPr>
+              <w:jc w:val="center"/>
+              <w:rPr>
+                <w:b/>
+                <w:bCs/>
+              </w:rPr>
+            </w:pPr>
+            <w:r>
+              <w:rPr>
+                <w:b/>
+                <w:bCs/>
+              </w:rPr>
+              <w:t>Metric</w:t>
+            </w:r>
+          </w:p>
+        </w:tc>
+        <w:tc>
+          <w:tcPr>
+            <w:tcW w:w="4508" w:type="dxa"/>
+          </w:tcPr>
+          <w:p>
+            <w:pPr>
+              <w:jc w:val="center"/>
+              <w:rPr>
+                <w:b/>
+                <w:bCs/>
+              </w:rPr>
+            </w:pPr>
+            <w:r>
+              <w:rPr>
+                <w:b/>
+                <w:bCs/>
+              </w:rPr>
+              <w:t>Value</w:t>
+            </w:r>
+          </w:p>
+        </w:tc>
+      </w:tr>
+      <w:tr>
+        <w:tc>
+          <w:tcPr>
+            <w:tcW w:w="4508" w:type="dxa"/>
+            <w:vAlign w:val="bottom"/>
+          </w:tcPr>
+          <w:p>
+            <w:pPr>
+              <w:jc w:val="center"/>
+            </w:pPr>
+            <w:r>
+              <w:rPr>
+                <w:color w:val="000000"/>
+              </w:rPr>
+              <w:t>Latest Correlation</w:t>
+            </w:r>
+          </w:p>
+        </w:tc>
+        <w:tc>
+          <w:tcPr>
+            <w:tcW w:w="4508" w:type="dxa"/>
+            <w:vAlign w:val="bottom"/>
+          </w:tcPr>
+          <w:p>
+            <w:pPr>
+              <w:jc w:val="center"/>
+            </w:pPr>
+            <w:r>
+              <w:rPr>
+                <w:color w:val="000000"/>
+              </w:rPr>
+              <w:t>0.50</w:t>
+            </w:r>
+          </w:p>
+        </w:tc>
+      </w:tr>
+      <w:tr>
+        <w:tc>
+          <w:tcPr>
+            <w:tcW w:w="4508" w:type="dxa"/>
+            <w:vAlign w:val="bottom"/>
+          </w:tcPr>
+          <w:p>
+            <w:pPr>
+              <w:jc w:val="center"/>
+            </w:pPr>
+            <w:r>
+              <w:rPr>
+                <w:color w:val="000000"/>
+              </w:rPr>
+              <w:t>Latest Tracking Error (%)</w:t>
+            </w:r>
+          </w:p>
+        </w:tc>
+        <w:tc>
+          <w:tcPr>
+            <w:tcW w:w="4508" w:type="dxa"/>
+            <w:vAlign w:val="bottom"/>
+          </w:tcPr>
+          <w:p>
+            <w:pPr>
+              <w:jc w:val="center"/>
+            </w:pPr>
+            <w:r>
+              <w:rPr>
+                <w:color w:val="000000"/>
+              </w:rPr>
+              <w:t>24.74</w:t>
+            </w:r>
+          </w:p>
+        </w:tc>
+      </w:tr>
+      <w:tr>
+        <w:tc>
+          <w:tcPr>
+            <w:tcW w:w="4508" w:type="dxa"/>
+            <w:vAlign w:val="bottom"/>
+          </w:tcPr>
+          <w:p>
+            <w:pPr>
+              <w:jc w:val="center"/>
+            </w:pPr>
+            <w:r>
+              <w:rPr>
+                <w:color w:val="000000"/>
+              </w:rPr>
+              <w:t>Latest Information Ratio</w:t>
+            </w:r>
+          </w:p>
+        </w:tc>
+        <w:tc>
+          <w:tcPr>
+            <w:tcW w:w="4508" w:type="dxa"/>
+            <w:vAlign w:val="bottom"/>
+          </w:tcPr>
+          <w:p>
+            <w:pPr>
+              <w:jc w:val="center"/>
+            </w:pPr>
+            <w:r>
+              <w:rPr>
+                <w:color w:val="000000"/>
+              </w:rPr>
+              <w:t>-</w:t>
+            </w:r>
+            <w:r>
+              <w:rPr>
+                <w:color w:val="000000"/>
+              </w:rPr>
+              <w:t>0.10</w:t>
+            </w:r>
+          </w:p>
+        </w:tc>
+      </w:tr>
+      <w:tr>
+        <w:tc>
+          <w:tcPr>
+            <w:tcW w:w="4508" w:type="dxa"/>
+            <w:vAlign w:val="bottom"/>
+          </w:tcPr>
+          <w:p>
+            <w:pPr>
+              <w:jc w:val="center"/>
+            </w:pPr>
+            <w:r>
+              <w:rPr>
+                <w:color w:val="000000"/>
+              </w:rPr>
+              <w:t>Latest Up-Capture Ratio (%)</w:t>
+            </w:r>
+          </w:p>
+        </w:tc>
+        <w:tc>
+          <w:tcPr>
+            <w:tcW w:w="4508" w:type="dxa"/>
+            <w:vAlign w:val="bottom"/>
+          </w:tcPr>
+          <w:p>
+            <w:pPr>
+              <w:jc w:val="center"/>
+            </w:pPr>
+            <w:r>
+              <w:rPr>
+                <w:color w:val="000000"/>
+              </w:rPr>
+              <w:t>49.59</w:t>
+            </w:r>
+          </w:p>
+        </w:tc>
+      </w:tr>
+      <w:tr>
+        <w:tc>
+          <w:tcPr>
+            <w:tcW w:w="4508" w:type="dxa"/>
+            <w:vAlign w:val="bottom"/>
+          </w:tcPr>
+          <w:p>
+            <w:pPr>
+              <w:jc w:val="center"/>
+            </w:pPr>
+            <w:r>
+              <w:rPr>
+                <w:color w:val="000000"/>
+              </w:rPr>
+              <w:t>Latest Down-Capture Ratio (%)</w:t>
+            </w:r>
+          </w:p>
+        </w:tc>
+        <w:tc>
+          <w:tcPr>
+            <w:tcW w:w="4508" w:type="dxa"/>
+            <w:vAlign w:val="bottom"/>
+          </w:tcPr>
+          <w:p>
+            <w:pPr>
+              <w:jc w:val="center"/>
+            </w:pPr>
+            <w:r>
+              <w:rPr>
+                <w:color w:val="000000"/>
+              </w:rPr>
+              <w:t>-34.68</w:t>
+            </w:r>
+          </w:p>
+        </w:tc>
+      </w:tr>
+    </w:tbl>
+    <w:p/>
+    <w:p>
+      <w:r>
+        <w:t xml:space="preserve">Throughout the optimization, correlation remained positive, with the final value at 0.50, indicating </w:t>
+      </w:r>
+      <w:r>
+        <w:t xml:space="preserve">that assets generally go up together. </w:t>
+      </w:r>
+      <w:r>
+        <w:t xml:space="preserve">However, the portfolio cannot be considered as one lacking volatility, as the latest tracking error </w:t>
+      </w:r>
+      <w:r>
+        <w:t>was calculated to be 24.74%</w:t>
+      </w:r>
+    </w:p>
+    <w:p>
+      <w:r>
+        <w:lastRenderedPageBreak/>
+        <w:t xml:space="preserve">A tracking error of 24.74% is </w:t>
+      </w:r>
+      <w:r>
+        <w:t xml:space="preserve">generally very </w:t>
+      </w:r>
+      <w:r>
+        <w:t>high but</w:t>
+      </w:r>
+      <w:r>
+        <w:t xml:space="preserve"> given the choice of assets and their </w:t>
+      </w:r>
+      <w:r>
+        <w:t>volatile</w:t>
+      </w:r>
+      <w:r>
+        <w:t xml:space="preserve"> marke</w:t>
+      </w:r>
+      <w:r>
+        <w:t>t, as well as geopolitical tension</w:t>
+      </w:r>
+      <w:r>
+        <w:t xml:space="preserve">, it seems plausible. </w:t>
+      </w:r>
+      <w:r>
+        <w:t>Furthermore, upon observing the final portfolio asset weights, the tracking error justifies itself.</w:t>
+      </w:r>
+    </w:p>
+    <w:p>
+      <w:r>
+        <w:t>An information ratio of -0.10 means that the portfolio</w:t>
+      </w:r>
+      <w:r>
+        <w:t xml:space="preserve">’s benchmark return outperformed the portfolio’s actual return, </w:t>
+      </w:r>
+      <w:r>
+        <w:t xml:space="preserve">which seems reasonable given the </w:t>
+      </w:r>
+      <w:r>
+        <w:t xml:space="preserve">comparatively conservative </w:t>
+      </w:r>
+      <w:r>
+        <w:t xml:space="preserve">volatility of the portfolio, and the moderate correlation. </w:t>
+      </w:r>
+    </w:p>
+    <w:p>
+      <w:r>
+        <w:t xml:space="preserve">While the up-capture ratio isn’t high enough to justify beating the benchmark, the down-capture ratio </w:t>
+      </w:r>
+      <w:r>
+        <w:t xml:space="preserve">of -34.68% indicates that during </w:t>
+      </w:r>
+      <w:r>
+        <w:t>crashes, the portfolio doesn’t suffer as much as the benchmark.</w:t>
+      </w:r>
+    </w:p>
+    <w:p>
+      <w:pPr>
+        <w:pStyle w:val="Heading2"/>
+      </w:pPr>
+      <w:r>
+        <w:t>Scenario Analysis</w:t>
+      </w:r>
+    </w:p>
+    <w:p>
+      <w:r>
+        <w:t>The</w:t>
+      </w:r>
+      <w:r>
+        <w:t xml:space="preserve"> data exported to optimize this portfolio encompasses several significant events that have had a ma</w:t>
+      </w:r>
+      <w:r>
+        <w:t>jor impact on the stock market. In chronological order, I have explained their potential influence on my portfolio:</w:t>
+      </w:r>
+    </w:p>
+    <w:p>
+      <w:pPr>
+        <w:pStyle w:val="ListParagraph"/>
+        <w:numPr>
+          <w:ilvl w:val="0"/>
+          <w:numId w:val="1"/>
+        </w:numPr>
+      </w:pPr>
+      <w:r>
+        <w:t xml:space="preserve">COVID-19 pandemic: </w:t>
+      </w:r>
+      <w:r>
+        <w:t xml:space="preserve">While the pandemic did have devastating effects on the economy in 2020, resulting in a recession, </w:t>
+      </w:r>
+      <w:r>
+        <w:t xml:space="preserve">2021 waves did little damage to the economy, as the world was slowly getting used to what was called the ‘new normal’. </w:t>
+      </w:r>
+      <w:r>
+        <w:t>While cases and deaths were in the millions, the rollout (and eventual mandate) of vaccines, followed by a return to work helped recover the economy fro</w:t>
+      </w:r>
+      <w:r>
+        <w:t xml:space="preserve">m </w:t>
+      </w:r>
+      <w:r>
+        <w:t>the recession caused by the first wave of lockdowns</w:t>
+      </w:r>
+      <w:r>
+        <w:t xml:space="preserve"> [6]</w:t>
+      </w:r>
+      <w:r>
+        <w:t>.</w:t>
+      </w:r>
+      <w:r>
+        <w:t xml:space="preserve"> This can be reflected by the slow but gradual rise in the wealth curve (see Appendix).</w:t>
+      </w:r>
+    </w:p>
+    <w:p>
+      <w:pPr>
+        <w:pStyle w:val="ListParagraph"/>
+        <w:numPr>
+          <w:ilvl w:val="0"/>
+          <w:numId w:val="1"/>
+        </w:numPr>
+      </w:pPr>
+      <w:r>
+        <w:t xml:space="preserve">Supply Chain crisis: </w:t>
+      </w:r>
+      <w:r>
+        <w:t xml:space="preserve">While there was no one reason for this, several factors played a key role in the supply chain crisis, and their effect on the economy. Lasting two years, it initially arose </w:t>
+      </w:r>
+      <w:proofErr w:type="gramStart"/>
+      <w:r>
+        <w:t>as a result of</w:t>
+      </w:r>
+      <w:proofErr w:type="gramEnd"/>
+      <w:r>
+        <w:t xml:space="preserve"> easing restrictions, economic recovery, and hence, </w:t>
+      </w:r>
+      <w:r>
+        <w:t xml:space="preserve">rapidly increasing demand. This </w:t>
+      </w:r>
+      <w:r>
+        <w:t>puts</w:t>
+      </w:r>
+      <w:r>
+        <w:t xml:space="preserve"> </w:t>
+      </w:r>
+      <w:r>
+        <w:t>strain</w:t>
+      </w:r>
+      <w:r>
+        <w:t xml:space="preserve"> on the supply chain, with many items increasingly being out of stock and taking months to reach </w:t>
+      </w:r>
+      <w:r>
+        <w:t>their</w:t>
+      </w:r>
+      <w:r>
+        <w:t xml:space="preserve"> destination. Furthermore, the egregious Russian invasion of Ukraine</w:t>
+      </w:r>
+      <w:r>
+        <w:t xml:space="preserve"> disrupted supply of wheat and fertilizers, which Ukraine is known for (and hence considered the breadbasket of Europe)</w:t>
+      </w:r>
+      <w:r>
+        <w:t xml:space="preserve">. That, along with increasing oil prices due to sanctions on Russia, </w:t>
+      </w:r>
+      <w:r>
+        <w:t xml:space="preserve">caused a sharp decline in stock prices, and hence the portfolio’s wealth curve. </w:t>
+      </w:r>
+      <w:r>
+        <w:t>GDP growth was affected across the world</w:t>
+      </w:r>
+      <w:r>
+        <w:t xml:space="preserve">, particularly in the United States, which saw growth below predicted levels </w:t>
+      </w:r>
+      <w:r>
+        <w:t>because of</w:t>
+      </w:r>
+      <w:r>
+        <w:t xml:space="preserve"> the war [7]. </w:t>
+      </w:r>
+      <w:r>
+        <w:t xml:space="preserve">Moreover, </w:t>
+      </w:r>
+      <w:r>
+        <w:t>China’s zero-COVID policy implemented from December 2022</w:t>
+      </w:r>
+      <w:r>
+        <w:t xml:space="preserve">, along with </w:t>
+      </w:r>
+      <w:r>
+        <w:t xml:space="preserve">the real estate crisis following Evergrande’s </w:t>
+      </w:r>
+      <w:r>
+        <w:t>collapse in 2021</w:t>
+      </w:r>
+      <w:r>
+        <w:t xml:space="preserve"> complicated this already significant issue.</w:t>
+      </w:r>
+    </w:p>
+    <w:p>
+      <w:pPr>
+        <w:pStyle w:val="ListParagraph"/>
+        <w:numPr>
+          <w:ilvl w:val="0"/>
+          <w:numId w:val="1"/>
+        </w:numPr>
+      </w:pPr>
+      <w:r>
+        <w:t xml:space="preserve">Rise in inflation and interest rates </w:t>
+      </w:r>
+      <w:r>
+        <w:t>–</w:t>
+      </w:r>
+      <w:r>
+        <w:t xml:space="preserve"> </w:t>
+      </w:r>
+      <w:r>
+        <w:t>Following COVID-19, inflation rose in 2022</w:t>
+      </w:r>
+      <w:r>
+        <w:t xml:space="preserve"> </w:t>
+      </w:r>
+      <w:proofErr w:type="gramStart"/>
+      <w:r>
+        <w:t>as a result of</w:t>
+      </w:r>
+      <w:proofErr w:type="gramEnd"/>
+      <w:r>
+        <w:t xml:space="preserve"> supply chain issues and increasing demand, </w:t>
+      </w:r>
+      <w:r>
+        <w:t xml:space="preserve">in addition to the </w:t>
+      </w:r>
+      <w:r>
+        <w:t xml:space="preserve">sharp rise in energy prices following the war in Ukraine. </w:t>
+      </w:r>
+      <w:r>
+        <w:t xml:space="preserve">This shock in the stock market is reflected in the portfolio, wherein monthly drawdowns as high as </w:t>
+      </w:r>
+      <w:r>
+        <w:t xml:space="preserve">30% were reported. </w:t>
+      </w:r>
+      <w:r>
+        <w:t xml:space="preserve">Moreover, a significant decline in the wealth curve, particularly from </w:t>
+      </w:r>
+      <w:r>
+        <w:t>March</w:t>
+      </w:r>
+      <w:r>
+        <w:t xml:space="preserve"> </w:t>
+      </w:r>
+      <w:r>
+        <w:t>2022,</w:t>
+      </w:r>
+      <w:r>
+        <w:t xml:space="preserve"> </w:t>
+      </w:r>
+      <w:r>
+        <w:lastRenderedPageBreak/>
+        <w:t xml:space="preserve">was noted, with a dip of </w:t>
+      </w:r>
+      <w:r>
+        <w:t xml:space="preserve">31.6% in cumulative wealth between March and September. </w:t>
+      </w:r>
+      <w:r>
+        <w:t xml:space="preserve">Upon analyzing the rolling portfolio weights at the end of each month, it is interesting to note </w:t>
+      </w:r>
+      <w:r>
+        <w:t>that most of the portfolio’s weightage was scattered across two assets, NVIDIA (NVDA)</w:t>
+      </w:r>
+      <w:r>
+        <w:t xml:space="preserve">, and Lockheed Martin (LMT). </w:t>
+      </w:r>
+      <w:r>
+        <w:t xml:space="preserve">The rise in AI, </w:t>
+      </w:r>
+      <w:r>
+        <w:t>the demand for semiconductors, and the gigantic market cap could explain the former’s port</w:t>
+      </w:r>
+      <w:r>
+        <w:t>folio weight</w:t>
+      </w:r>
+      <w:r>
+        <w:t xml:space="preserve"> being among the highest. Likewise, the war in Ukraine, as well as military aid</w:t>
+      </w:r>
+      <w:r>
+        <w:t xml:space="preserve"> alongside increasing military expenditure (and projects) explains the high portfolio weight for the latter.</w:t>
+      </w:r>
+    </w:p>
+    <w:p>
+      <w:pPr>
+        <w:pStyle w:val="ListParagraph"/>
+        <w:numPr>
+          <w:ilvl w:val="0"/>
+          <w:numId w:val="1"/>
+        </w:numPr>
+      </w:pPr>
+      <w:r>
+        <w:t>Trump’s trade war:</w:t>
+      </w:r>
+      <w:r>
+        <w:t xml:space="preserve"> Trump’s “Liberation Day Tariffs”, coupled with the ongoing trade war with Canada (which has escalated further at the time of writing this report (9</w:t>
+      </w:r>
+      <w:r>
+        <w:rPr>
+          <w:vertAlign w:val="superscript"/>
+        </w:rPr>
+        <w:t>th</w:t>
+      </w:r>
+      <w:r>
+        <w:t xml:space="preserve"> </w:t>
+      </w:r>
+      <w:r>
+        <w:t>September</w:t>
+      </w:r>
+      <w:r>
+        <w:t xml:space="preserve"> 2026)</w:t>
+      </w:r>
+      <w:r>
+        <w:t>) and Mexico have resulted in several crashes, most notably in April</w:t>
+      </w:r>
+      <w:r>
+        <w:t xml:space="preserve"> 2025</w:t>
+      </w:r>
+      <w:r>
+        <w:t xml:space="preserve">, where stocks fell by more than 10%. </w:t>
+      </w:r>
+      <w:r>
+        <w:t>However, upon viewing the wealth curve chart, there was no significant dr</w:t>
+      </w:r>
+      <w:r>
+        <w:t>op in cumulative wealth</w:t>
+      </w:r>
+      <w:r>
+        <w:t>; instead, the wealth curve chart depicted a constant rise until July 2025.</w:t>
+      </w:r>
+    </w:p>
+    <w:p>
+      <w:pPr>
+        <w:pStyle w:val="ListParagraph"/>
+        <w:numPr>
+          <w:ilvl w:val="0"/>
+          <w:numId w:val="1"/>
+        </w:numPr>
+      </w:pPr>
+      <w:r>
+        <w:t xml:space="preserve">AI bubble: </w:t>
+      </w:r>
+      <w:r>
+        <w:t>Since the rise of AI</w:t>
+      </w:r>
+      <w:r>
+        <w:t xml:space="preserve"> (particularly agents like ChatGPT), </w:t>
+      </w:r>
+      <w:r>
+        <w:t>there has always been talk about the AI bubble eventually bursting.</w:t>
+      </w:r>
+      <w:r>
+        <w:t xml:space="preserve"> This fear is reasonable, as most investors have experienced the dotcom bubble burst in 2000, w</w:t>
+      </w:r>
+      <w:r>
+        <w:t xml:space="preserve">hich shattered </w:t>
+      </w:r>
+      <w:r>
+        <w:t>Nasdaq</w:t>
+      </w:r>
+      <w:r>
+        <w:t xml:space="preserve">. </w:t>
+      </w:r>
+      <w:r>
+        <w:t xml:space="preserve">Excess investments in AI from almost every </w:t>
+      </w:r>
+      <w:r>
+        <w:t>big firm has raised these fears</w:t>
+      </w:r>
+      <w:r>
+        <w:t xml:space="preserve">, resulting in some investors pulling out their money. This is noticeable towards the end of 2025, with the wealth curve showing a small decline between October and November. </w:t>
+      </w:r>
+    </w:p>
+    <w:p>
+      <w:pPr>
+        <w:pStyle w:val="ListParagraph"/>
+        <w:numPr>
+          <w:ilvl w:val="0"/>
+          <w:numId w:val="1"/>
+        </w:numPr>
+      </w:pPr>
+      <w:r>
+        <w:t xml:space="preserve">2026 Iran War: The invasion of Iran by Israel with the help of United States resulted in a war </w:t>
+      </w:r>
+      <w:r>
+        <w:t xml:space="preserve">where neighboring countries </w:t>
+      </w:r>
+      <w:r>
+        <w:t xml:space="preserve">in the Middle East were caught in the crossfire. Moreover, the Strait of Hormuz and </w:t>
+      </w:r>
+      <w:r>
+        <w:t xml:space="preserve">Bab El-Mandeb have been subjected to blockades and attacks by both the United States and Iran’s coalition (IRGC and Houthis). </w:t>
+      </w:r>
+      <w:r>
+        <w:t xml:space="preserve">This spiked Oil and Brent prices, leading to a decline in stock prices, as well as a rise in cost of living among almost all countries worldwide. </w:t>
+      </w:r>
+      <w:r>
+        <w:t>This can be visualized in the wealth curve chart, as cumulative wealth took an initial hit between February and March, before recovering and rising further. At the time of writing this report, there have been on-and-off attacks between the two warring parties</w:t>
+      </w:r>
+      <w:r>
+        <w:t>.</w:t>
+      </w:r>
+    </w:p>
+    <w:p/>
+    <w:p/>
+    <w:p/>
     <w:p>
       <w:pPr>
         <w:rPr>
@@ -5794,6 +7660,7 @@
           <w:rFonts w:ascii="Calibri" w:eastAsiaTheme="minorEastAsia" w:hAnsi="Calibri" w:cs="Calibri"/>
         </w:rPr>
       </w:pPr>
+      <w:bookmarkStart w:id="12" w:name="_Toc239141841"/>
       <w:r>
         <w:rPr>
           <w:rFonts w:ascii="Calibri" w:eastAsiaTheme="minorEastAsia" w:hAnsi="Calibri" w:cs="Calibri"/>
@@ -5801,6 +7668,7 @@
         <w:lastRenderedPageBreak/>
         <w:t>References</w:t>
       </w:r>
+      <w:bookmarkEnd w:id="12"/>
     </w:p>
     <w:p>
       <w:r>
@@ -5822,7 +7690,7 @@
       <w:r>
         <w:t xml:space="preserve">, Jun. 29, 2026. [Online]. Available: </w:t>
       </w:r>
-      <w:hyperlink r:id="rId5" w:history="1">
+      <w:hyperlink r:id="rId6" w:history="1">
         <w:r>
           <w:rPr>
             <w:rStyle w:val="Hyperlink"/>
@@ -5848,7 +7716,7 @@
       <w:r>
         <w:t xml:space="preserve">. [Online]. Available: </w:t>
       </w:r>
-      <w:hyperlink r:id="rId6" w:history="1">
+      <w:hyperlink r:id="rId7" w:history="1">
         <w:r>
           <w:rPr>
             <w:rStyle w:val="Hyperlink"/>
@@ -5864,7 +7732,7 @@
       <w:r>
         <w:t xml:space="preserve">[3] T. M. Idzorek, “A step-by-step guide to the Black-Litterman model: Incorporating user-specified confidence levels,” Zephyr Associates, Inc., Jul. 20, 2004. [Online]. Available: </w:t>
       </w:r>
-      <w:hyperlink r:id="rId7" w:history="1">
+      <w:hyperlink r:id="rId8" w:history="1">
         <w:r>
           <w:rPr>
             <w:rStyle w:val="Hyperlink"/>
@@ -5890,7 +7758,7 @@
       <w:r>
         <w:t xml:space="preserve">. [Online]. Available: </w:t>
       </w:r>
-      <w:hyperlink r:id="rId8" w:history="1">
+      <w:hyperlink r:id="rId9" w:history="1">
         <w:r>
           <w:rPr>
             <w:rStyle w:val="Hyperlink"/>
@@ -5916,7 +7784,7 @@
       <w:r>
         <w:t xml:space="preserve">, Jul. 6, 2026. [Online]. Available: </w:t>
       </w:r>
-      <w:hyperlink r:id="rId9" w:history="1">
+      <w:hyperlink r:id="rId10" w:history="1">
         <w:r>
           <w:rPr>
             <w:rStyle w:val="Hyperlink"/>
@@ -5928,10 +7796,82 @@
         <w:t>. [Accessed: Aug. 27, 2026].</w:t>
       </w:r>
     </w:p>
+    <w:p>
+      <w:r>
+        <w:t xml:space="preserve">[6] R. </w:t>
+      </w:r>
+      <w:proofErr w:type="spellStart"/>
+      <w:r>
+        <w:t>Sunge</w:t>
+      </w:r>
+      <w:proofErr w:type="spellEnd"/>
+      <w:r>
+        <w:t xml:space="preserve">, C. </w:t>
+      </w:r>
+      <w:proofErr w:type="spellStart"/>
+      <w:r>
+        <w:t>Mudzingiri</w:t>
+      </w:r>
+      <w:proofErr w:type="spellEnd"/>
+      <w:r>
+        <w:t xml:space="preserve">, and N. Mkhize, “The COVID-19 pandemic and economic recovery: The mediating role of governance, a global perspective,” </w:t>
+      </w:r>
+      <w:proofErr w:type="spellStart"/>
+      <w:r>
+        <w:rPr>
+          <w:i/>
+          <w:iCs/>
+        </w:rPr>
+        <w:t>Heliyon</w:t>
+      </w:r>
+      <w:proofErr w:type="spellEnd"/>
+      <w:r>
+        <w:t xml:space="preserve">, vol. 10, no. 22, Art. no. e39869, Nov. 2024, </w:t>
+      </w:r>
+      <w:proofErr w:type="gramStart"/>
+      <w:r>
+        <w:t>doi:10.1016/j.heliyon</w:t>
+      </w:r>
+      <w:proofErr w:type="gramEnd"/>
+      <w:r>
+        <w:t>.2024.e3986</w:t>
+      </w:r>
+      <w:r>
+        <w:t>9.</w:t>
+      </w:r>
+    </w:p>
+    <w:p>
+      <w:r>
+        <w:t xml:space="preserve">[7] P. Tan, “War fallout: U.S. economy to slow, Europe risks recession and Russia to suffer double-digit decline,” </w:t>
+      </w:r>
+      <w:r>
+        <w:rPr>
+          <w:i/>
+          <w:iCs/>
+        </w:rPr>
+        <w:t>CNBC</w:t>
+      </w:r>
+      <w:r>
+        <w:t xml:space="preserve">, Mar. 6, 2022. [Online]. Available: </w:t>
+      </w:r>
+      <w:hyperlink r:id="rId11" w:history="1">
+        <w:r>
+          <w:rPr>
+            <w:rStyle w:val="Hyperlink"/>
+          </w:rPr>
+          <w:t>https://www.cnbc.com/2022/03/06/war-fallout-us-economy-to-slow-europe-risks-recession-and-russia-to-suffer-double-digit-decline.html</w:t>
+        </w:r>
+      </w:hyperlink>
+      <w:r>
+        <w:t>. [Accessed: Sep. 1, 2026].</w:t>
+      </w:r>
+    </w:p>
     <w:p/>
     <w:p/>
     <w:p/>
     <w:p/>
+    <w:p/>
+    <w:p/>
     <w:p>
       <w:r>
         <w:br w:type="page"/>
@@ -5944,6 +7884,7 @@
           <w:rFonts w:ascii="Calibri" w:hAnsi="Calibri" w:cs="Calibri"/>
         </w:rPr>
       </w:pPr>
+      <w:bookmarkStart w:id="13" w:name="_Toc239141842"/>
       <w:r>
         <w:rPr>
           <w:rFonts w:ascii="Calibri" w:hAnsi="Calibri" w:cs="Calibri"/>
@@ -5951,6 +7892,7 @@
         <w:lastRenderedPageBreak/>
         <w:t>Appendix</w:t>
       </w:r>
+      <w:bookmarkEnd w:id="13"/>
     </w:p>
     <w:p/>
     <w:p>
@@ -6714,6 +8656,7 @@
   <w:style w:type="character" w:default="1" w:styleId="DefaultParagraphFont">
     <w:name w:val="Default Paragraph Font"/>
     <w:uiPriority w:val="1"/>
+    <w:semiHidden/>
     <w:unhideWhenUsed/>
   </w:style>
   <w:style w:type="table" w:default="1" w:styleId="TableNormal">
@@ -7090,6 +9033,63 @@
       </w:tblBorders>
     </w:tblPr>
   </w:style>
+  <w:style w:type="paragraph" w:styleId="TOCHeading">
+    <w:name w:val="TOC Heading"/>
+    <w:basedOn w:val="Heading1"/>
+    <w:next w:val="Normal"/>
+    <w:uiPriority w:val="39"/>
+    <w:unhideWhenUsed/>
+    <w:qFormat/>
+    <w:rsid w:val="00011F12"/>
+    <w:pPr>
+      <w:spacing w:before="240" w:after="0" w:line="259" w:lineRule="auto"/>
+      <w:outlineLvl w:val="9"/>
+    </w:pPr>
+    <w:rPr>
+      <w:kern w:val="0"/>
+      <w:sz w:val="32"/>
+      <w:szCs w:val="32"/>
+      <w14:ligatures w14:val="none"/>
+    </w:rPr>
+  </w:style>
+  <w:style w:type="paragraph" w:styleId="TOC1">
+    <w:name w:val="toc 1"/>
+    <w:basedOn w:val="Normal"/>
+    <w:next w:val="Normal"/>
+    <w:autoRedefine/>
+    <w:uiPriority w:val="39"/>
+    <w:unhideWhenUsed/>
+    <w:rsid w:val="00011F12"/>
+    <w:pPr>
+      <w:spacing w:after="100"/>
+    </w:pPr>
+  </w:style>
+  <w:style w:type="paragraph" w:styleId="TOC2">
+    <w:name w:val="toc 2"/>
+    <w:basedOn w:val="Normal"/>
+    <w:next w:val="Normal"/>
+    <w:autoRedefine/>
+    <w:uiPriority w:val="39"/>
+    <w:unhideWhenUsed/>
+    <w:rsid w:val="00011F12"/>
+    <w:pPr>
+      <w:spacing w:after="100"/>
+      <w:ind w:left="240"/>
+    </w:pPr>
+  </w:style>
+  <w:style w:type="paragraph" w:styleId="TOC3">
+    <w:name w:val="toc 3"/>
+    <w:basedOn w:val="Normal"/>
+    <w:next w:val="Normal"/>
+    <w:autoRedefine/>
+    <w:uiPriority w:val="39"/>
+    <w:unhideWhenUsed/>
+    <w:rsid w:val="00011F12"/>
+    <w:pPr>
+      <w:spacing w:after="100"/>
+      <w:ind w:left="480"/>
+    </w:pPr>
+  </w:style>
 </w:styles>
 </file>
 
@@ -7406,4 +9406,16 @@
     </a:ext>
   </a:extLst>
 </a:theme>
+</file>
+
+<file path=customXml/item1.xml><?xml version="1.0" encoding="utf-8"?>
+<b:Sources xmlns:b="http://schemas.openxmlformats.org/officeDocument/2006/bibliography" xmlns="http://schemas.openxmlformats.org/officeDocument/2006/bibliography" SelectedStyle="\APASixthEditionOfficeOnline.xsl" StyleName="APA" Version="6"/>
+</file>
+
+<file path=customXml/itemProps1.xml><?xml version="1.0" encoding="utf-8"?>
+<ds:datastoreItem xmlns:ds="http://schemas.openxmlformats.org/officeDocument/2006/customXml" ds:itemID="{70D9F0EB-2881-42BA-9899-3FA9FF9DA128}">
+  <ds:schemaRefs>
+    <ds:schemaRef ds:uri="http://schemas.openxmlformats.org/officeDocument/2006/bibliography"/>
+  </ds:schemaRefs>
+</ds:datastoreItem>
 </file>
</xml_diff>